<commit_message>
latest comments from uwe/heike
</commit_message>
<xml_diff>
--- a/public/granergize-handbuch.docx
+++ b/public/granergize-handbuch.docx
@@ -4196,7 +4196,35 @@
         <w:t xml:space="preserve"> </w:t>
       </w:r>
       <w:r>
-        <w:t xml:space="preserve">das Jahresformular:</w:t>
+        <w:t xml:space="preserve">den Dialog. Oben listet die Tabelle</w:t>
+      </w:r>
+      <w:r>
+        <w:t xml:space="preserve"> </w:t>
+      </w:r>
+      <w:r>
+        <w:rPr>
+          <w:b/>
+          <w:bCs/>
+        </w:rPr>
+        <w:t xml:space="preserve">„Stored years”</w:t>
+      </w:r>
+      <w:r>
+        <w:t xml:space="preserve"> </w:t>
+      </w:r>
+      <w:r>
+        <w:t xml:space="preserve">alle bereits</w:t>
+      </w:r>
+      <w:r>
+        <w:t xml:space="preserve"> </w:t>
+      </w:r>
+      <w:r>
+        <w:t xml:space="preserve">erfassten Jahre mit ihren Werten auf – so sehen Sie auf einen Blick, was</w:t>
+      </w:r>
+      <w:r>
+        <w:t xml:space="preserve"> </w:t>
+      </w:r>
+      <w:r>
+        <w:t xml:space="preserve">gespeichert ist; darunter steht das Eingabeformular.</w:t>
       </w:r>
     </w:p>
     <w:p>
@@ -4212,37 +4240,103 @@
           <w:b/>
           <w:bCs/>
         </w:rPr>
-        <w:t xml:space="preserve">Jahr erfassen oder aktualisieren:</w:t>
-      </w:r>
-      <w:r>
-        <w:t xml:space="preserve"> </w:t>
-      </w:r>
-      <w:r>
-        <w:t xml:space="preserve">Wählen Sie ein Jahr und tragen Sie die</w:t>
-      </w:r>
-      <w:r>
-        <w:t xml:space="preserve"> </w:t>
-      </w:r>
-      <w:r>
-        <w:t xml:space="preserve">Verbrauchswerte ein. Bereits erfasste Jahre lassen sich jederzeit nachträglich</w:t>
-      </w:r>
-      <w:r>
-        <w:t xml:space="preserve"> </w:t>
-      </w:r>
-      <w:r>
-        <w:t xml:space="preserve">ändern oder ergänzen – so halten Sie die Verbrauchsdaten über die Jahre</w:t>
-      </w:r>
-      <w:r>
-        <w:t xml:space="preserve"> </w:t>
-      </w:r>
-      <w:r>
-        <w:t xml:space="preserve">aktuell. (Damit ist insbesondere das Hinzufügen neuer Jahresscheiben und das</w:t>
-      </w:r>
-      <w:r>
-        <w:t xml:space="preserve"> </w:t>
-      </w:r>
-      <w:r>
-        <w:t xml:space="preserve">spätere Aktualisieren von Verbrauchsdaten möglich.)</w:t>
+        <w:t xml:space="preserve">Jahr erfassen:</w:t>
+      </w:r>
+      <w:r>
+        <w:t xml:space="preserve"> </w:t>
+      </w:r>
+      <w:r>
+        <w:t xml:space="preserve">Wählen Sie ein Jahr und tragen Sie die Verbrauchswerte ein.</w:t>
+      </w:r>
+      <w:r>
+        <w:t xml:space="preserve"> </w:t>
+      </w:r>
+      <w:r>
+        <w:t xml:space="preserve">Nach dem Speichern bleibt der Dialog geöffnet, und das neue Jahr erscheint</w:t>
+      </w:r>
+      <w:r>
+        <w:t xml:space="preserve"> </w:t>
+      </w:r>
+      <w:r>
+        <w:t xml:space="preserve">sofort in der Tabelle.</w:t>
+      </w:r>
+    </w:p>
+    <w:p>
+      <w:pPr>
+        <w:pStyle w:val="Compact"/>
+        <w:numPr>
+          <w:ilvl w:val="0"/>
+          <w:numId w:val="1008"/>
+        </w:numPr>
+      </w:pPr>
+      <w:r>
+        <w:rPr>
+          <w:b/>
+          <w:bCs/>
+        </w:rPr>
+        <w:t xml:space="preserve">Jahr aktualisieren oder löschen:</w:t>
+      </w:r>
+      <w:r>
+        <w:t xml:space="preserve"> </w:t>
+      </w:r>
+      <w:r>
+        <w:t xml:space="preserve">Über die Schaltflächen je Tabellenzeile</w:t>
+      </w:r>
+      <w:r>
+        <w:t xml:space="preserve"> </w:t>
+      </w:r>
+      <w:r>
+        <w:t xml:space="preserve">laden Sie ein gespeichertes Jahr zum</w:t>
+      </w:r>
+      <w:r>
+        <w:t xml:space="preserve"> </w:t>
+      </w:r>
+      <w:r>
+        <w:rPr>
+          <w:b/>
+          <w:bCs/>
+        </w:rPr>
+        <w:t xml:space="preserve">Bearbeiten</w:t>
+      </w:r>
+      <w:r>
+        <w:t xml:space="preserve"> </w:t>
+      </w:r>
+      <w:r>
+        <w:t xml:space="preserve">zurück ins Formular – die</w:t>
+      </w:r>
+      <w:r>
+        <w:t xml:space="preserve"> </w:t>
+      </w:r>
+      <w:r>
+        <w:t xml:space="preserve">vorhandenen Werte werden vorbefüllt, sodass das Ergänzen einzelner Kennzahlen</w:t>
+      </w:r>
+      <w:r>
+        <w:t xml:space="preserve"> </w:t>
+      </w:r>
+      <w:r>
+        <w:t xml:space="preserve">die übrigen nicht überschreibt – oder</w:t>
+      </w:r>
+      <w:r>
+        <w:t xml:space="preserve"> </w:t>
+      </w:r>
+      <w:r>
+        <w:rPr>
+          <w:b/>
+          <w:bCs/>
+        </w:rPr>
+        <w:t xml:space="preserve">löschen</w:t>
+      </w:r>
+      <w:r>
+        <w:t xml:space="preserve"> </w:t>
+      </w:r>
+      <w:r>
+        <w:t xml:space="preserve">es. So halten Sie die</w:t>
+      </w:r>
+      <w:r>
+        <w:t xml:space="preserve"> </w:t>
+      </w:r>
+      <w:r>
+        <w:t xml:space="preserve">Verbrauchsdaten über die Jahre aktuell.</w:t>
       </w:r>
     </w:p>
     <w:p>
@@ -4533,13 +4627,29 @@
         <w:t xml:space="preserve"> </w:t>
       </w:r>
       <w:r>
-        <w:t xml:space="preserve">der Energieverbrauch je Jahr als Diagramm. Haben Sie zu einem</w:t>
-      </w:r>
-      <w:r>
-        <w:t xml:space="preserve"> </w:t>
-      </w:r>
-      <w:r>
-        <w:t xml:space="preserve">Jahr sowohl geplante (Soll-) als auch tatsächliche (Ist-)Werte erfasst, werden</w:t>
+        <w:t xml:space="preserve">der Energieverbrauch je Jahr – zunächst als</w:t>
+      </w:r>
+      <w:r>
+        <w:t xml:space="preserve"> </w:t>
+      </w:r>
+      <w:r>
+        <w:rPr>
+          <w:b/>
+          <w:bCs/>
+        </w:rPr>
+        <w:t xml:space="preserve">Übersichtstabelle</w:t>
+      </w:r>
+      <w:r>
+        <w:t xml:space="preserve"> </w:t>
+      </w:r>
+      <w:r>
+        <w:t xml:space="preserve">mit den Jahreswerten, darunter als Diagramm. Haben Sie zu</w:t>
+      </w:r>
+      <w:r>
+        <w:t xml:space="preserve"> </w:t>
+      </w:r>
+      <w:r>
+        <w:t xml:space="preserve">einem Jahr sowohl geplante (Soll-) als auch tatsächliche (Ist-)Werte erfasst, werden</w:t>
       </w:r>
       <w:r>
         <w:t xml:space="preserve"> </w:t>

</xml_diff>

<commit_message>
before the final check
</commit_message>
<xml_diff>
--- a/public/granergize-handbuch.docx
+++ b/public/granergize-handbuch.docx
@@ -1377,7 +1377,7 @@
     </w:p>
     <w:bookmarkEnd w:id="33"/>
     <w:bookmarkEnd w:id="34"/>
-    <w:bookmarkStart w:id="69" w:name="granergize-in-der-praxis-nutzen"/>
+    <w:bookmarkStart w:id="73" w:name="granergize-in-der-praxis-nutzen"/>
     <w:p>
       <w:pPr>
         <w:pStyle w:val="Heading1"/>
@@ -2165,13 +2165,13 @@
       </w:r>
     </w:p>
     <w:bookmarkEnd w:id="41"/>
-    <w:bookmarkStart w:id="42" w:name="X296196fc5c046e15197584232cd032099635da4"/>
+    <w:bookmarkStart w:id="42" w:name="ihre-organisation-festlegen"/>
     <w:p>
       <w:pPr>
         <w:pStyle w:val="Heading2"/>
       </w:pPr>
       <w:r>
-        <w:t xml:space="preserve">Ihre Organisation und Ihre Datenproduzenten-Rolle festlegen</w:t>
+        <w:t xml:space="preserve">Ihre Organisation festlegen</w:t>
       </w:r>
     </w:p>
     <w:p>
@@ -2201,19 +2201,19 @@
         <w:t xml:space="preserve"> </w:t>
       </w:r>
       <w:r>
-        <w:t xml:space="preserve">Unternehmen samt Datenproduzenten-Rolle und Logo. Diese Angaben gelten danach für</w:t>
-      </w:r>
-      <w:r>
-        <w:t xml:space="preserve"> </w:t>
-      </w:r>
-      <w:r>
-        <w:t xml:space="preserve">alle Gebäude, die Sie erfassen; Sie müssen sie nicht bei jeder Dateneingabe</w:t>
-      </w:r>
-      <w:r>
-        <w:t xml:space="preserve"> </w:t>
-      </w:r>
-      <w:r>
-        <w:t xml:space="preserve">wiederholen. Öffnen Sie über das Avatar-Symbol (oben rechts) den Dialog</w:t>
+        <w:t xml:space="preserve">Unternehmen samt Logo. Diese Angaben gelten danach für alle Gebäude, die Sie</w:t>
+      </w:r>
+      <w:r>
+        <w:t xml:space="preserve"> </w:t>
+      </w:r>
+      <w:r>
+        <w:t xml:space="preserve">erfassen; Sie müssen sie nicht bei jeder Dateneingabe wiederholen. Öffnen Sie über</w:t>
+      </w:r>
+      <w:r>
+        <w:t xml:space="preserve"> </w:t>
+      </w:r>
+      <w:r>
+        <w:t xml:space="preserve">das Avatar-Symbol (oben rechts) den Dialog</w:t>
       </w:r>
       <w:r>
         <w:t xml:space="preserve"> </w:t>
@@ -2229,7 +2229,13 @@
         <w:t xml:space="preserve"> </w:t>
       </w:r>
       <w:r>
-        <w:t xml:space="preserve">und füllen Sie die Felder aus:</w:t>
+        <w:t xml:space="preserve">und füllen Sie die</w:t>
+      </w:r>
+      <w:r>
+        <w:t xml:space="preserve"> </w:t>
+      </w:r>
+      <w:r>
+        <w:t xml:space="preserve">Felder aus:</w:t>
       </w:r>
     </w:p>
     <w:p>
@@ -2273,150 +2279,19 @@
           <w:b/>
           <w:bCs/>
         </w:rPr>
-        <w:t xml:space="preserve">Art des Unternehmens</w:t>
-      </w:r>
-      <w:r>
-        <w:t xml:space="preserve"> </w:t>
-      </w:r>
-      <w:r>
-        <w:t xml:space="preserve">(„Kind of company”): Ihre Datenproduzenten-Rolle im</w:t>
-      </w:r>
-      <w:r>
-        <w:t xml:space="preserve"> </w:t>
-      </w:r>
-      <w:r>
-        <w:t xml:space="preserve">Immobilienökosystem. Zur Auswahl stehen</w:t>
-      </w:r>
-      <w:r>
-        <w:t xml:space="preserve"> </w:t>
-      </w:r>
-      <w:r>
-        <w:rPr>
-          <w:b/>
-          <w:bCs/>
-        </w:rPr>
-        <w:t xml:space="preserve">Investor</w:t>
-      </w:r>
-      <w:r>
-        <w:t xml:space="preserve">,</w:t>
-      </w:r>
-      <w:r>
-        <w:t xml:space="preserve"> </w:t>
-      </w:r>
-      <w:r>
-        <w:rPr>
-          <w:b/>
-          <w:bCs/>
-        </w:rPr>
-        <w:t xml:space="preserve">Nutzer</w:t>
-      </w:r>
-      <w:r>
-        <w:t xml:space="preserve"> </w:t>
-      </w:r>
-      <w:r>
-        <w:t xml:space="preserve">(Auswahl</w:t>
-      </w:r>
-      <w:r>
-        <w:t xml:space="preserve"> </w:t>
-      </w:r>
-      <w:r>
-        <w:t xml:space="preserve">„User”),</w:t>
-      </w:r>
-      <w:r>
-        <w:t xml:space="preserve"> </w:t>
-      </w:r>
-      <w:r>
-        <w:rPr>
-          <w:b/>
-          <w:bCs/>
-        </w:rPr>
-        <w:t xml:space="preserve">Benchmark Service Provider</w:t>
-      </w:r>
-      <w:r>
-        <w:t xml:space="preserve">,</w:t>
-      </w:r>
-      <w:r>
-        <w:t xml:space="preserve"> </w:t>
-      </w:r>
-      <w:r>
-        <w:rPr>
-          <w:b/>
-          <w:bCs/>
-        </w:rPr>
-        <w:t xml:space="preserve">Facility Manager</w:t>
-      </w:r>
-      <w:r>
-        <w:t xml:space="preserve">,</w:t>
-      </w:r>
-      <w:r>
-        <w:t xml:space="preserve"> </w:t>
-      </w:r>
-      <w:r>
-        <w:rPr>
-          <w:b/>
-          <w:bCs/>
-        </w:rPr>
-        <w:t xml:space="preserve">Entwickler</w:t>
-      </w:r>
-      <w:r>
-        <w:t xml:space="preserve"> </w:t>
-      </w:r>
-      <w:r>
-        <w:t xml:space="preserve">(Auswahl „Developer”),</w:t>
-      </w:r>
-      <w:r>
-        <w:t xml:space="preserve"> </w:t>
-      </w:r>
-      <w:r>
-        <w:rPr>
-          <w:b/>
-          <w:bCs/>
-        </w:rPr>
-        <w:t xml:space="preserve">Berater/Makler</w:t>
-      </w:r>
-      <w:r>
-        <w:t xml:space="preserve"> </w:t>
-      </w:r>
-      <w:r>
-        <w:t xml:space="preserve">(Auswahl „Consultant / Broker”),</w:t>
-      </w:r>
-      <w:r>
-        <w:t xml:space="preserve"> </w:t>
-      </w:r>
-      <w:r>
-        <w:rPr>
-          <w:b/>
-          <w:bCs/>
-        </w:rPr>
-        <w:t xml:space="preserve">Softwaredienstleister</w:t>
-      </w:r>
-      <w:r>
-        <w:t xml:space="preserve"> </w:t>
-      </w:r>
-      <w:r>
-        <w:t xml:space="preserve">(Auswahl „Software Provider”) und</w:t>
-      </w:r>
-      <w:r>
-        <w:t xml:space="preserve"> </w:t>
-      </w:r>
-      <w:r>
-        <w:rPr>
-          <w:b/>
-          <w:bCs/>
-        </w:rPr>
-        <w:t xml:space="preserve">Energiedienstleister</w:t>
-      </w:r>
-      <w:r>
-        <w:t xml:space="preserve"> </w:t>
-      </w:r>
-      <w:r>
-        <w:t xml:space="preserve">(Auswahl „Energy Provider”). Diese Rolle wird</w:t>
-      </w:r>
-      <w:r>
-        <w:t xml:space="preserve"> </w:t>
-      </w:r>
-      <w:r>
-        <w:t xml:space="preserve">automatisch als Herkunft (Provenienz) jedes Gebäudes vermerkt, das Sie anlegen.</w:t>
+        <w:t xml:space="preserve">Firmenlogo</w:t>
+      </w:r>
+      <w:r>
+        <w:t xml:space="preserve"> </w:t>
+      </w:r>
+      <w:r>
+        <w:t xml:space="preserve">(„Choose logo…“): wählen Sie eine Bilddatei (PNG, JPG, SVG, WEBP</w:t>
+      </w:r>
+      <w:r>
+        <w:t xml:space="preserve"> </w:t>
+      </w:r>
+      <w:r>
+        <w:t xml:space="preserve">oder GIF); die Vorschau zeigt das Bild sofort.</w:t>
       </w:r>
     </w:p>
     <w:p>
@@ -2432,19 +2307,13 @@
           <w:b/>
           <w:bCs/>
         </w:rPr>
-        <w:t xml:space="preserve">Firmenlogo</w:t>
-      </w:r>
-      <w:r>
-        <w:t xml:space="preserve"> </w:t>
-      </w:r>
-      <w:r>
-        <w:t xml:space="preserve">(„Choose logo…“): wählen Sie eine Bilddatei (PNG, JPG, SVG, WEBP</w:t>
-      </w:r>
-      <w:r>
-        <w:t xml:space="preserve"> </w:t>
-      </w:r>
-      <w:r>
-        <w:t xml:space="preserve">oder GIF); die Vorschau zeigt das Bild sofort.</w:t>
+        <w:t xml:space="preserve">Homepage</w:t>
+      </w:r>
+      <w:r>
+        <w:t xml:space="preserve"> </w:t>
+      </w:r>
+      <w:r>
+        <w:t xml:space="preserve">(„Homepage URI”, optional): die Website Ihres Unternehmens.</w:t>
       </w:r>
     </w:p>
     <w:p>
@@ -2460,13 +2329,19 @@
           <w:b/>
           <w:bCs/>
         </w:rPr>
-        <w:t xml:space="preserve">Homepage</w:t>
-      </w:r>
-      <w:r>
-        <w:t xml:space="preserve"> </w:t>
-      </w:r>
-      <w:r>
-        <w:t xml:space="preserve">(„Homepage URI”, optional): die Website Ihres Unternehmens.</w:t>
+        <w:t xml:space="preserve">Organisations-WebID</w:t>
+      </w:r>
+      <w:r>
+        <w:t xml:space="preserve"> </w:t>
+      </w:r>
+      <w:r>
+        <w:t xml:space="preserve">(„Organisation WebID”, optional): besitzt Ihr</w:t>
+      </w:r>
+      <w:r>
+        <w:t xml:space="preserve"> </w:t>
+      </w:r>
+      <w:r>
+        <w:t xml:space="preserve">Unternehmen eine eigene WebID, verknüpfen Sie sie hier.</w:t>
       </w:r>
     </w:p>
     <w:p>
@@ -2482,34 +2357,6 @@
           <w:b/>
           <w:bCs/>
         </w:rPr>
-        <w:t xml:space="preserve">Organisations-WebID</w:t>
-      </w:r>
-      <w:r>
-        <w:t xml:space="preserve"> </w:t>
-      </w:r>
-      <w:r>
-        <w:t xml:space="preserve">(„Organisation WebID”, optional): besitzt Ihr</w:t>
-      </w:r>
-      <w:r>
-        <w:t xml:space="preserve"> </w:t>
-      </w:r>
-      <w:r>
-        <w:t xml:space="preserve">Unternehmen eine eigene WebID, verknüpfen Sie sie hier.</w:t>
-      </w:r>
-    </w:p>
-    <w:p>
-      <w:pPr>
-        <w:pStyle w:val="Compact"/>
-        <w:numPr>
-          <w:ilvl w:val="0"/>
-          <w:numId w:val="1004"/>
-        </w:numPr>
-      </w:pPr>
-      <w:r>
-        <w:rPr>
-          <w:b/>
-          <w:bCs/>
-        </w:rPr>
         <w:t xml:space="preserve">Speichern:</w:t>
       </w:r>
       <w:r>
@@ -2524,29 +2371,63 @@
         <w:pStyle w:val="FirstParagraph"/>
       </w:pPr>
       <w:r>
-        <w:t xml:space="preserve">Die Rolle bei der Dateneingabe ist damit entkoppelt: Im „Add Building”-Dialog</w:t>
-      </w:r>
-      <w:r>
-        <w:t xml:space="preserve"> </w:t>
-      </w:r>
-      <w:r>
-        <w:t xml:space="preserve">wählen Sie nur noch die</w:t>
-      </w:r>
-      <w:r>
-        <w:t xml:space="preserve"> </w:t>
-      </w:r>
-      <w:r>
-        <w:rPr>
-          <w:b/>
-          <w:bCs/>
-        </w:rPr>
-        <w:t xml:space="preserve">Vorlage</w:t>
-      </w:r>
-      <w:r>
-        <w:t xml:space="preserve"> </w:t>
-      </w:r>
-      <w:r>
-        <w:t xml:space="preserve">(das Tabellenformat), nicht mehr die Rolle.</w:t>
+        <w:t xml:space="preserve">Sie müssen</w:t>
+      </w:r>
+      <w:r>
+        <w:t xml:space="preserve"> </w:t>
+      </w:r>
+      <w:r>
+        <w:rPr>
+          <w:b/>
+          <w:bCs/>
+        </w:rPr>
+        <w:t xml:space="preserve">keine Rolle</w:t>
+      </w:r>
+      <w:r>
+        <w:t xml:space="preserve"> </w:t>
+      </w:r>
+      <w:r>
+        <w:t xml:space="preserve">festlegen, um Gebäude anzulegen: Jedes Gebäude und seine</w:t>
+      </w:r>
+      <w:r>
+        <w:t xml:space="preserve"> </w:t>
+      </w:r>
+      <w:r>
+        <w:t xml:space="preserve">Energiedaten werden ohne Rollenzuordnung erfasst, lediglich mit Ihrer WebID als</w:t>
+      </w:r>
+      <w:r>
+        <w:t xml:space="preserve"> </w:t>
+      </w:r>
+      <w:r>
+        <w:t xml:space="preserve">Datenproduzent vermerkt. Rollen kommen ausschließlich in</w:t>
+      </w:r>
+      <w:r>
+        <w:t xml:space="preserve"> </w:t>
+      </w:r>
+      <w:r>
+        <w:rPr>
+          <w:b/>
+          <w:bCs/>
+        </w:rPr>
+        <w:t xml:space="preserve">Datenräumen</w:t>
+      </w:r>
+      <w:r>
+        <w:t xml:space="preserve"> </w:t>
+      </w:r>
+      <w:r>
+        <w:t xml:space="preserve">zum Einsatz</w:t>
+      </w:r>
+      <w:r>
+        <w:t xml:space="preserve"> </w:t>
+      </w:r>
+      <w:r>
+        <w:t xml:space="preserve">(siehe „Rollenbasierte Freigaben”). Der „Add Building”-Dialog zeigt für alle Gebäude</w:t>
+      </w:r>
+      <w:r>
+        <w:t xml:space="preserve"> </w:t>
+      </w:r>
+      <w:r>
+        <w:t xml:space="preserve">dieselbe, einheitliche Eingabemaske.</w:t>
       </w:r>
     </w:p>
     <w:p>
@@ -3639,13 +3520,19 @@
         <w:t xml:space="preserve"> </w:t>
       </w:r>
       <w:r>
-        <w:t xml:space="preserve">Koordinaten, Fläche usw.). Über „Get coordinates” können die Koordinaten aus</w:t>
-      </w:r>
-      <w:r>
-        <w:t xml:space="preserve"> </w:t>
-      </w:r>
-      <w:r>
-        <w:t xml:space="preserve">der Adresse automatisch ermittelt werden.</w:t>
+        <w:t xml:space="preserve">Koordinaten, Fläche usw.). Für alle Gebäude erscheint dieselbe, einheitliche</w:t>
+      </w:r>
+      <w:r>
+        <w:t xml:space="preserve"> </w:t>
+      </w:r>
+      <w:r>
+        <w:t xml:space="preserve">Eingabemaske – es gibt keine Rollen- oder Vorlagenauswahl mehr. Über „Get</w:t>
+      </w:r>
+      <w:r>
+        <w:t xml:space="preserve"> </w:t>
+      </w:r>
+      <w:r>
+        <w:t xml:space="preserve">coordinates” können die Koordinaten aus der Adresse automatisch ermittelt werden.</w:t>
       </w:r>
     </w:p>
     <w:p>
@@ -3661,25 +3548,53 @@
           <w:b/>
           <w:bCs/>
         </w:rPr>
-        <w:t xml:space="preserve">Import from file:</w:t>
-      </w:r>
-      <w:r>
-        <w:t xml:space="preserve"> </w:t>
-      </w:r>
-      <w:r>
-        <w:t xml:space="preserve">Mehrere Gebäude auf einmal aus einer Excel-Vorlage</w:t>
-      </w:r>
-      <w:r>
-        <w:t xml:space="preserve"> </w:t>
-      </w:r>
-      <w:r>
-        <w:t xml:space="preserve">importieren. Die eingelesenen Gebäude können Sie vor dem Speichern prüfen und</w:t>
-      </w:r>
-      <w:r>
-        <w:t xml:space="preserve"> </w:t>
-      </w:r>
-      <w:r>
-        <w:t xml:space="preserve">anpassen; fehlende Koordinaten werden beim Import automatisch ergänzt.</w:t>
+        <w:t xml:space="preserve">Autofill from file:</w:t>
+      </w:r>
+      <w:r>
+        <w:t xml:space="preserve"> </w:t>
+      </w:r>
+      <w:r>
+        <w:t xml:space="preserve">Mehrere Gebäude auf einmal aus einer Excel-Datei</w:t>
+      </w:r>
+      <w:r>
+        <w:t xml:space="preserve"> </w:t>
+      </w:r>
+      <w:r>
+        <w:t xml:space="preserve">einlesen. Das Tabellenformat wird beim Hochladen</w:t>
+      </w:r>
+      <w:r>
+        <w:t xml:space="preserve"> </w:t>
+      </w:r>
+      <w:r>
+        <w:rPr>
+          <w:b/>
+          <w:bCs/>
+        </w:rPr>
+        <w:t xml:space="preserve">automatisch erkannt</w:t>
+      </w:r>
+      <w:r>
+        <w:t xml:space="preserve"> </w:t>
+      </w:r>
+      <w:r>
+        <w:t xml:space="preserve">(bei</w:t>
+      </w:r>
+      <w:r>
+        <w:t xml:space="preserve"> </w:t>
+      </w:r>
+      <w:r>
+        <w:t xml:space="preserve">Bedarf über „File format” manuell überschreibbar); enthält die Datei auch</w:t>
+      </w:r>
+      <w:r>
+        <w:t xml:space="preserve"> </w:t>
+      </w:r>
+      <w:r>
+        <w:t xml:space="preserve">Energiedaten, werden diese mit übernommen. Die eingelesenen Gebäude können Sie vor</w:t>
+      </w:r>
+      <w:r>
+        <w:t xml:space="preserve"> </w:t>
+      </w:r>
+      <w:r>
+        <w:t xml:space="preserve">dem Speichern prüfen und anpassen; fehlende Koordinaten werden automatisch ergänzt.</w:t>
       </w:r>
     </w:p>
     <w:p>
@@ -3687,35 +3602,13 @@
         <w:pStyle w:val="FirstParagraph"/>
       </w:pPr>
       <w:r>
-        <w:t xml:space="preserve">Im Dialog wählen Sie zunächst die</w:t>
-      </w:r>
-      <w:r>
-        <w:t xml:space="preserve"> </w:t>
-      </w:r>
-      <w:r>
-        <w:rPr>
-          <w:b/>
-          <w:bCs/>
-        </w:rPr>
-        <w:t xml:space="preserve">Vorlage</w:t>
-      </w:r>
-      <w:r>
-        <w:t xml:space="preserve"> </w:t>
-      </w:r>
-      <w:r>
-        <w:t xml:space="preserve">(das Tabellenformat). Nachdem Sie</w:t>
-      </w:r>
-      <w:r>
-        <w:t xml:space="preserve"> </w:t>
-      </w:r>
-      <w:r>
-        <w:t xml:space="preserve">die Felder ausgefüllt bzw. die Datei eingelesen haben, klicken Sie auf „Add</w:t>
-      </w:r>
-      <w:r>
-        <w:t xml:space="preserve"> </w:t>
-      </w:r>
-      <w:r>
-        <w:t xml:space="preserve">Building”. Die eingegebenen Daten werden automatisch in das richtige Format</w:t>
+        <w:t xml:space="preserve">Nachdem Sie die Felder ausgefüllt bzw. die Datei eingelesen haben, klicken Sie auf</w:t>
+      </w:r>
+      <w:r>
+        <w:t xml:space="preserve"> </w:t>
+      </w:r>
+      <w:r>
+        <w:t xml:space="preserve">„Add Building”. Die eingegebenen Daten werden automatisch in das richtige Format</w:t>
       </w:r>
       <w:r>
         <w:t xml:space="preserve"> </w:t>
@@ -3993,7 +3886,13 @@
         <w:t xml:space="preserve"> </w:t>
       </w:r>
       <w:r>
-        <w:t xml:space="preserve">herunterladen.</w:t>
+        <w:t xml:space="preserve">herunterladen; dabei wählen Sie das gewünschte Tabellenformat (Zeilen-Layout,</w:t>
+      </w:r>
+      <w:r>
+        <w:t xml:space="preserve"> </w:t>
+      </w:r>
+      <w:r>
+        <w:t xml:space="preserve">Tabelle oder generisch).</w:t>
       </w:r>
     </w:p>
     <w:p>
@@ -4677,19 +4576,29 @@
         <w:t xml:space="preserve"> </w:t>
       </w:r>
       <w:r>
-        <w:t xml:space="preserve">der reale Verbrauch am Plan liegt (Soll-Ist-Vergleich). Liegen Verbrauchswerte</w:t>
-      </w:r>
-      <w:r>
-        <w:t xml:space="preserve"> </w:t>
-      </w:r>
-      <w:r>
-        <w:t xml:space="preserve">vergleichbarer Gebäude desselben Betreibers vor, wird Ihr Verbrauch zusätzlich</w:t>
-      </w:r>
-      <w:r>
-        <w:t xml:space="preserve"> </w:t>
-      </w:r>
-      <w:r>
-        <w:t xml:space="preserve">gegen diesen</w:t>
+        <w:t xml:space="preserve">der reale Verbrauch am Plan liegt (Soll-Ist-Vergleich). Sind weitere Gebäude</w:t>
+      </w:r>
+      <w:r>
+        <w:t xml:space="preserve"> </w:t>
+      </w:r>
+      <w:r>
+        <w:rPr>
+          <w:b/>
+          <w:bCs/>
+        </w:rPr>
+        <w:t xml:space="preserve">mit demselben Betreiber</w:t>
+      </w:r>
+      <w:r>
+        <w:t xml:space="preserve"> </w:t>
+      </w:r>
+      <w:r>
+        <w:t xml:space="preserve">(Feld „Operated By”) und Verbrauchsdaten für</w:t>
+      </w:r>
+      <w:r>
+        <w:t xml:space="preserve"> </w:t>
+      </w:r>
+      <w:r>
+        <w:t xml:space="preserve">dasselbe Jahr vorhanden, wird Ihr Verbrauch zusätzlich gegen diesen</w:t>
       </w:r>
       <w:r>
         <w:t xml:space="preserve"> </w:t>
@@ -4705,7 +4614,19 @@
         <w:t xml:space="preserve"> </w:t>
       </w:r>
       <w:r>
-        <w:t xml:space="preserve">als Benchmark eingeordnet.</w:t>
+        <w:t xml:space="preserve">als Benchmark eingeordnet. Maßgeblich ist also der</w:t>
+      </w:r>
+      <w:r>
+        <w:t xml:space="preserve"> </w:t>
+      </w:r>
+      <w:r>
+        <w:t xml:space="preserve">eingetragene Betreiber, nicht etwa gleiche Fläche oder gleiches Baujahr – ohne</w:t>
+      </w:r>
+      <w:r>
+        <w:t xml:space="preserve"> </w:t>
+      </w:r>
+      <w:r>
+        <w:t xml:space="preserve">einen zweiten Betreiber-Gleichen mit Daten erscheint kein Benchmark.</w:t>
       </w:r>
     </w:p>
     <w:p>
@@ -4792,23 +4713,13 @@
       </w:r>
     </w:p>
     <w:bookmarkEnd w:id="68"/>
-    <w:bookmarkEnd w:id="69"/>
-    <w:bookmarkStart w:id="99" w:name="X7d72782c915f60697958dd391a69efa388f028d"/>
-    <w:p>
-      <w:pPr>
-        <w:pStyle w:val="Heading1"/>
-      </w:pPr>
-      <w:r>
-        <w:t xml:space="preserve">Daten gemeinsam nutzen und Mehrwerte schaffen</w:t>
-      </w:r>
-    </w:p>
-    <w:bookmarkStart w:id="76" w:name="X8c80b48020b91775ad7986854220f6556bf0b32"/>
+    <w:bookmarkStart w:id="72" w:name="X3c2472b6ac3894956d87fda076b194db0e74caf"/>
     <w:p>
       <w:pPr>
         <w:pStyle w:val="Heading2"/>
       </w:pPr>
       <w:r>
-        <w:t xml:space="preserve">Möglichkeiten der verschiedenen Datenfreigaben</w:t>
+        <w:t xml:space="preserve">Gebäude nach Energieverbrauch einordnen (Energie-Linse)</w:t>
       </w:r>
     </w:p>
     <w:p>
@@ -4816,31 +4727,306 @@
         <w:pStyle w:val="FirstParagraph"/>
       </w:pPr>
       <w:r>
-        <w:t xml:space="preserve">Das System bietet Ihnen drei verschiedene Wege, Informationen mit Partnern zu</w:t>
-      </w:r>
-      <w:r>
-        <w:t xml:space="preserve"> </w:t>
-      </w:r>
-      <w:r>
-        <w:t xml:space="preserve">teilen – jeder mit unterschiedlichem Transparenzgrad. Sie können individuelle</w:t>
-      </w:r>
-      <w:r>
-        <w:t xml:space="preserve"> </w:t>
-      </w:r>
-      <w:r>
-        <w:t xml:space="preserve">Gebäudedaten, aggregierte Ansichten oder rollenbasierte Freigaben nutzen. Die</w:t>
-      </w:r>
-      <w:r>
-        <w:t xml:space="preserve"> </w:t>
-      </w:r>
-      <w:r>
-        <w:t xml:space="preserve">Wahl der richtigen Freigabe-Option hängt davon ab, mit wem Sie teilen und wie</w:t>
-      </w:r>
-      <w:r>
-        <w:t xml:space="preserve"> </w:t>
-      </w:r>
-      <w:r>
-        <w:t xml:space="preserve">viel Vertrauen Sie dieser Person entgegenbringen.</w:t>
+        <w:t xml:space="preserve">Die Karte im Tab</w:t>
+      </w:r>
+      <w:r>
+        <w:t xml:space="preserve"> </w:t>
+      </w:r>
+      <w:r>
+        <w:rPr>
+          <w:b/>
+          <w:bCs/>
+        </w:rPr>
+        <w:t xml:space="preserve">Explore</w:t>
+      </w:r>
+      <w:r>
+        <w:t xml:space="preserve"> </w:t>
+      </w:r>
+      <w:r>
+        <w:t xml:space="preserve">kann die Gebäude-Marker auf zwei Arten einfärben.</w:t>
+      </w:r>
+      <w:r>
+        <w:t xml:space="preserve"> </w:t>
+      </w:r>
+      <w:r>
+        <w:t xml:space="preserve">Über den Umschalter unten an der Karte wählen Sie die</w:t>
+      </w:r>
+      <w:r>
+        <w:t xml:space="preserve"> </w:t>
+      </w:r>
+      <w:r>
+        <w:rPr>
+          <w:b/>
+          <w:bCs/>
+        </w:rPr>
+        <w:t xml:space="preserve">Linse</w:t>
+      </w:r>
+      <w:r>
+        <w:t xml:space="preserve">:</w:t>
+      </w:r>
+    </w:p>
+    <w:p>
+      <w:pPr>
+        <w:pStyle w:val="Compact"/>
+        <w:numPr>
+          <w:ilvl w:val="0"/>
+          <w:numId w:val="1010"/>
+        </w:numPr>
+      </w:pPr>
+      <w:r>
+        <w:rPr>
+          <w:b/>
+          <w:bCs/>
+        </w:rPr>
+        <w:t xml:space="preserve">Ownership</w:t>
+      </w:r>
+      <w:r>
+        <w:t xml:space="preserve"> </w:t>
+      </w:r>
+      <w:r>
+        <w:t xml:space="preserve">(Voreinstellung): unterscheidet farblich nur Ihre</w:t>
+      </w:r>
+      <w:r>
+        <w:t xml:space="preserve"> </w:t>
+      </w:r>
+      <w:r>
+        <w:rPr>
+          <w:b/>
+          <w:bCs/>
+        </w:rPr>
+        <w:t xml:space="preserve">eigenen</w:t>
+      </w:r>
+      <w:r>
+        <w:t xml:space="preserve"> </w:t>
+      </w:r>
+      <w:r>
+        <w:t xml:space="preserve">Gebäude von solchen, die</w:t>
+      </w:r>
+      <w:r>
+        <w:t xml:space="preserve"> </w:t>
+      </w:r>
+      <w:r>
+        <w:rPr>
+          <w:b/>
+          <w:bCs/>
+        </w:rPr>
+        <w:t xml:space="preserve">andere mit Ihnen geteilt</w:t>
+      </w:r>
+      <w:r>
+        <w:t xml:space="preserve"> </w:t>
+      </w:r>
+      <w:r>
+        <w:t xml:space="preserve">haben.</w:t>
+      </w:r>
+    </w:p>
+    <w:p>
+      <w:pPr>
+        <w:pStyle w:val="Compact"/>
+        <w:numPr>
+          <w:ilvl w:val="0"/>
+          <w:numId w:val="1010"/>
+        </w:numPr>
+      </w:pPr>
+      <w:r>
+        <w:rPr>
+          <w:b/>
+          <w:bCs/>
+        </w:rPr>
+        <w:t xml:space="preserve">Energy:</w:t>
+      </w:r>
+      <w:r>
+        <w:t xml:space="preserve"> </w:t>
+      </w:r>
+      <w:r>
+        <w:t xml:space="preserve">färbt jeden Marker nach dem</w:t>
+      </w:r>
+      <w:r>
+        <w:t xml:space="preserve"> </w:t>
+      </w:r>
+      <w:r>
+        <w:rPr>
+          <w:b/>
+          <w:bCs/>
+        </w:rPr>
+        <w:t xml:space="preserve">Energieverbrauch</w:t>
+      </w:r>
+      <w:r>
+        <w:t xml:space="preserve"> </w:t>
+      </w:r>
+      <w:r>
+        <w:t xml:space="preserve">ein – von „More</w:t>
+      </w:r>
+      <w:r>
+        <w:t xml:space="preserve"> </w:t>
+      </w:r>
+      <w:r>
+        <w:t xml:space="preserve">efficient” über „Typical” bis „Less efficient”; Gebäude ohne auswertbare</w:t>
+      </w:r>
+      <w:r>
+        <w:t xml:space="preserve"> </w:t>
+      </w:r>
+      <w:r>
+        <w:t xml:space="preserve">Energiedaten bleiben neutral („No energy data”). Damit setzt die Karte den</w:t>
+      </w:r>
+      <w:r>
+        <w:t xml:space="preserve"> </w:t>
+      </w:r>
+      <w:r>
+        <w:t xml:space="preserve">Anwendungsfall „Vertriebsoptimierung” um: Ein Objekt ist auf einen Blick als</w:t>
+      </w:r>
+      <w:r>
+        <w:t xml:space="preserve"> </w:t>
+      </w:r>
+      <w:r>
+        <w:t xml:space="preserve">energieeffizienter oder -ineffizienter als seine Nachbarn erkennbar.</w:t>
+      </w:r>
+    </w:p>
+    <w:p>
+      <w:pPr>
+        <w:pStyle w:val="FirstParagraph"/>
+      </w:pPr>
+      <w:r>
+        <w:t xml:space="preserve">Die Einordnung erfolgt nach der</w:t>
+      </w:r>
+      <w:r>
+        <w:t xml:space="preserve"> </w:t>
+      </w:r>
+      <w:r>
+        <w:rPr>
+          <w:b/>
+          <w:bCs/>
+        </w:rPr>
+        <w:t xml:space="preserve">Energieintensität</w:t>
+      </w:r>
+      <w:r>
+        <w:t xml:space="preserve"> </w:t>
+      </w:r>
+      <w:r>
+        <w:t xml:space="preserve">(Verbrauch je m² Fläche,</w:t>
+      </w:r>
+      <w:r>
+        <w:t xml:space="preserve"> </w:t>
+      </w:r>
+      <w:r>
+        <w:t xml:space="preserve">kWh/m²/a), nicht nach dem absoluten Verbrauch – so wird eine große, effiziente</w:t>
+      </w:r>
+      <w:r>
+        <w:t xml:space="preserve"> </w:t>
+      </w:r>
+      <w:r>
+        <w:t xml:space="preserve">Halle nicht schlechter bewertet als ein kleiner, ineffizienter Bau. Maßgeblich</w:t>
+      </w:r>
+      <w:r>
+        <w:t xml:space="preserve"> </w:t>
+      </w:r>
+      <w:r>
+        <w:t xml:space="preserve">ist der</w:t>
+      </w:r>
+      <w:r>
+        <w:t xml:space="preserve"> </w:t>
+      </w:r>
+      <w:r>
+        <w:rPr>
+          <w:b/>
+          <w:bCs/>
+        </w:rPr>
+        <w:t xml:space="preserve">aktuellste</w:t>
+      </w:r>
+      <w:r>
+        <w:t xml:space="preserve"> </w:t>
+      </w:r>
+      <w:r>
+        <w:t xml:space="preserve">erfasste Jahreswert; die Fläche entnimmt die Anwendung den</w:t>
+      </w:r>
+      <w:r>
+        <w:t xml:space="preserve"> </w:t>
+      </w:r>
+      <w:r>
+        <w:t xml:space="preserve">Stammdaten (Hallenfläche, ersatzweise Gebäude- oder Bürofläche). Fehlt einem</w:t>
+      </w:r>
+      <w:r>
+        <w:t xml:space="preserve"> </w:t>
+      </w:r>
+      <w:r>
+        <w:t xml:space="preserve">Gebäude die Fläche oder ein Jahresverbrauch, lässt sich keine Intensität</w:t>
+      </w:r>
+      <w:r>
+        <w:t xml:space="preserve"> </w:t>
+      </w:r>
+      <w:r>
+        <w:t xml:space="preserve">berechnen, und der Marker bleibt neutral.</w:t>
+      </w:r>
+    </w:p>
+    <w:p>
+      <w:pPr>
+        <w:pStyle w:val="BodyText"/>
+      </w:pPr>
+      <w:r>
+        <w:t xml:space="preserve">Verglichen wird stets gegen die Gebäude, die</w:t>
+      </w:r>
+      <w:r>
+        <w:t xml:space="preserve"> </w:t>
+      </w:r>
+      <w:r>
+        <w:rPr>
+          <w:b/>
+          <w:bCs/>
+        </w:rPr>
+        <w:t xml:space="preserve">gerade im Kartenausschnitt</w:t>
+      </w:r>
+      <w:r>
+        <w:rPr>
+          <w:b/>
+          <w:bCs/>
+        </w:rPr>
+        <w:t xml:space="preserve"> </w:t>
+      </w:r>
+      <w:r>
+        <w:rPr>
+          <w:b/>
+          <w:bCs/>
+        </w:rPr>
+        <w:t xml:space="preserve">sichtbar</w:t>
+      </w:r>
+      <w:r>
+        <w:t xml:space="preserve"> </w:t>
+      </w:r>
+      <w:r>
+        <w:t xml:space="preserve">sind – beim Verschieben oder Zoomen verschiebt sich also auch der</w:t>
+      </w:r>
+      <w:r>
+        <w:t xml:space="preserve"> </w:t>
+      </w:r>
+      <w:r>
+        <w:t xml:space="preserve">Vergleichsmaßstab. Wichtig für die gemeinsame Nutzung: In diese Einordnung gehen</w:t>
+      </w:r>
+      <w:r>
+        <w:t xml:space="preserve"> </w:t>
+      </w:r>
+      <w:r>
+        <w:rPr>
+          <w:b/>
+          <w:bCs/>
+        </w:rPr>
+        <w:t xml:space="preserve">auch die mit Ihnen geteilten Gebäude</w:t>
+      </w:r>
+      <w:r>
+        <w:t xml:space="preserve"> </w:t>
+      </w:r>
+      <w:r>
+        <w:t xml:space="preserve">ein, sofern zu ihnen Energiedaten und</w:t>
+      </w:r>
+      <w:r>
+        <w:t xml:space="preserve"> </w:t>
+      </w:r>
+      <w:r>
+        <w:t xml:space="preserve">eine Fläche vorliegen. Sie vergleichen damit eigene und fremde Objekte im selben</w:t>
+      </w:r>
+      <w:r>
+        <w:t xml:space="preserve"> </w:t>
+      </w:r>
+      <w:r>
+        <w:t xml:space="preserve">Wettbewerbsumfeld.</w:t>
       </w:r>
     </w:p>
     <w:p>
@@ -4850,20 +5036,127 @@
       <w:r>
         <w:drawing>
           <wp:inline>
-            <wp:extent cx="4800600" cy="3039089"/>
+            <wp:extent cx="5334000" cy="4000499"/>
             <wp:effectExtent b="0" l="0" r="0" t="0"/>
-            <wp:docPr descr="Vergleich der drei Freigabemechanismen in Granergize" title="" id="71" name="Picture"/>
+            <wp:docPr descr="Tab „Explore”: die Karte mit aktiver Energie-Linse – die Marker sind nach Energieintensität eingefärbt, die Legende zeigt die Kategorien" title="" id="70" name="Picture"/>
             <a:graphic>
               <a:graphicData uri="http://schemas.openxmlformats.org/drawingml/2006/picture">
                 <pic:pic>
                   <pic:nvPicPr>
-                    <pic:cNvPr descr="figures/sharing-vergleich.png" id="72" name="Picture"/>
+                    <pic:cNvPr descr="figures/energy-lens.png" id="71" name="Picture"/>
                     <pic:cNvPicPr>
                       <a:picLocks noChangeArrowheads="1" noChangeAspect="1"/>
                     </pic:cNvPicPr>
                   </pic:nvPicPr>
                   <pic:blipFill>
-                    <a:blip r:embed="rId70"/>
+                    <a:blip r:embed="rId69"/>
+                    <a:stretch>
+                      <a:fillRect/>
+                    </a:stretch>
+                  </pic:blipFill>
+                  <pic:spPr bwMode="auto">
+                    <a:xfrm>
+                      <a:off x="0" y="0"/>
+                      <a:ext cx="5334000" cy="4000499"/>
+                    </a:xfrm>
+                    <a:prstGeom prst="rect">
+                      <a:avLst/>
+                    </a:prstGeom>
+                    <a:noFill/>
+                    <a:ln w="9525">
+                      <a:noFill/>
+                      <a:headEnd/>
+                      <a:tailEnd/>
+                    </a:ln>
+                  </pic:spPr>
+                </pic:pic>
+              </a:graphicData>
+            </a:graphic>
+          </wp:inline>
+        </w:drawing>
+      </w:r>
+    </w:p>
+    <w:p>
+      <w:pPr>
+        <w:pStyle w:val="ImageCaption"/>
+      </w:pPr>
+      <w:r>
+        <w:t xml:space="preserve">Tab „Explore”: die Karte mit aktiver Energie-Linse – die Marker sind nach Energieintensität eingefärbt, die Legende zeigt die Kategorien</w:t>
+      </w:r>
+    </w:p>
+    <w:bookmarkEnd w:id="72"/>
+    <w:bookmarkEnd w:id="73"/>
+    <w:bookmarkStart w:id="103" w:name="X7d72782c915f60697958dd391a69efa388f028d"/>
+    <w:p>
+      <w:pPr>
+        <w:pStyle w:val="Heading1"/>
+      </w:pPr>
+      <w:r>
+        <w:t xml:space="preserve">Daten gemeinsam nutzen und Mehrwerte schaffen</w:t>
+      </w:r>
+    </w:p>
+    <w:bookmarkStart w:id="80" w:name="X8c80b48020b91775ad7986854220f6556bf0b32"/>
+    <w:p>
+      <w:pPr>
+        <w:pStyle w:val="Heading2"/>
+      </w:pPr>
+      <w:r>
+        <w:t xml:space="preserve">Möglichkeiten der verschiedenen Datenfreigaben</w:t>
+      </w:r>
+    </w:p>
+    <w:p>
+      <w:pPr>
+        <w:pStyle w:val="FirstParagraph"/>
+      </w:pPr>
+      <w:r>
+        <w:t xml:space="preserve">Das System bietet Ihnen drei verschiedene Wege, Informationen mit Partnern zu</w:t>
+      </w:r>
+      <w:r>
+        <w:t xml:space="preserve"> </w:t>
+      </w:r>
+      <w:r>
+        <w:t xml:space="preserve">teilen – jeder mit unterschiedlichem Transparenzgrad. Sie können individuelle</w:t>
+      </w:r>
+      <w:r>
+        <w:t xml:space="preserve"> </w:t>
+      </w:r>
+      <w:r>
+        <w:t xml:space="preserve">Gebäudedaten, aggregierte Ansichten oder rollenbasierte Freigaben nutzen. Die</w:t>
+      </w:r>
+      <w:r>
+        <w:t xml:space="preserve"> </w:t>
+      </w:r>
+      <w:r>
+        <w:t xml:space="preserve">Wahl der richtigen Freigabe-Option hängt davon ab, mit wem Sie teilen und wie</w:t>
+      </w:r>
+      <w:r>
+        <w:t xml:space="preserve"> </w:t>
+      </w:r>
+      <w:r>
+        <w:t xml:space="preserve">viel Vertrauen Sie dieser Person entgegenbringen.</w:t>
+      </w:r>
+    </w:p>
+    <w:p>
+      <w:pPr>
+        <w:pStyle w:val="CaptionedFigure"/>
+      </w:pPr>
+      <w:r>
+        <w:drawing>
+          <wp:inline>
+            <wp:extent cx="4800600" cy="3039089"/>
+            <wp:effectExtent b="0" l="0" r="0" t="0"/>
+            <wp:docPr descr="Vergleich der drei Freigabemechanismen in Granergize" title="" id="75" name="Picture"/>
+            <a:graphic>
+              <a:graphicData uri="http://schemas.openxmlformats.org/drawingml/2006/picture">
+                <pic:pic>
+                  <pic:nvPicPr>
+                    <pic:cNvPr descr="figures/sharing-vergleich.png" id="76" name="Picture"/>
+                    <pic:cNvPicPr>
+                      <a:picLocks noChangeArrowheads="1" noChangeAspect="1"/>
+                    </pic:cNvPicPr>
+                  </pic:nvPicPr>
+                  <pic:blipFill>
+                    <a:blip r:embed="rId74"/>
                     <a:stretch>
                       <a:fillRect/>
                     </a:stretch>
@@ -4898,7 +5191,7 @@
         <w:t xml:space="preserve">Vergleich der drei Freigabemechanismen in Granergize</w:t>
       </w:r>
     </w:p>
-    <w:bookmarkStart w:id="73" w:name="individuelle-gebäudedaten-teilen"/>
+    <w:bookmarkStart w:id="77" w:name="individuelle-gebäudedaten-teilen"/>
     <w:p>
       <w:pPr>
         <w:pStyle w:val="Heading3"/>
@@ -4919,196 +5212,6 @@
       </w:r>
       <w:r>
         <w:t xml:space="preserve">Umfang Sie freigeben:</w:t>
-      </w:r>
-    </w:p>
-    <w:p>
-      <w:pPr>
-        <w:pStyle w:val="Compact"/>
-        <w:numPr>
-          <w:ilvl w:val="0"/>
-          <w:numId w:val="1010"/>
-        </w:numPr>
-      </w:pPr>
-      <w:r>
-        <w:rPr>
-          <w:b/>
-          <w:bCs/>
-        </w:rPr>
-        <w:t xml:space="preserve">Static building data only</w:t>
-      </w:r>
-      <w:r>
-        <w:t xml:space="preserve"> </w:t>
-      </w:r>
-      <w:r>
-        <w:t xml:space="preserve">– nur die Stammdaten des Gebäudes (Adresse,</w:t>
-      </w:r>
-      <w:r>
-        <w:t xml:space="preserve"> </w:t>
-      </w:r>
-      <w:r>
-        <w:t xml:space="preserve">Fläche, Baujahr, Nutzungsart, Information über vorhandene Photovoltaik-Anlagen),</w:t>
-      </w:r>
-      <w:r>
-        <w:t xml:space="preserve"> </w:t>
-      </w:r>
-      <w:r>
-        <w:t xml:space="preserve">ohne Verbrauchswerte. Nützlich, wenn Sie jemandem zunächst zeigen möchten,</w:t>
-      </w:r>
-      <w:r>
-        <w:t xml:space="preserve"> </w:t>
-      </w:r>
-      <w:r>
-        <w:t xml:space="preserve">welche Gebäude Sie verwalten, ohne sofort sensible Verbrauchsdaten preiszugeben.</w:t>
-      </w:r>
-    </w:p>
-    <w:p>
-      <w:pPr>
-        <w:pStyle w:val="Compact"/>
-        <w:numPr>
-          <w:ilvl w:val="0"/>
-          <w:numId w:val="1010"/>
-        </w:numPr>
-      </w:pPr>
-      <w:r>
-        <w:rPr>
-          <w:b/>
-          <w:bCs/>
-        </w:rPr>
-        <w:t xml:space="preserve">Static building data and all energy readings</w:t>
-      </w:r>
-      <w:r>
-        <w:t xml:space="preserve"> </w:t>
-      </w:r>
-      <w:r>
-        <w:t xml:space="preserve">– zusätzlich die</w:t>
-      </w:r>
-      <w:r>
-        <w:t xml:space="preserve"> </w:t>
-      </w:r>
-      <w:r>
-        <w:t xml:space="preserve">Verbrauchswerte (Strom, Gas, Fernwärme, Wasser)</w:t>
-      </w:r>
-      <w:r>
-        <w:t xml:space="preserve"> </w:t>
-      </w:r>
-      <w:r>
-        <w:rPr>
-          <w:b/>
-          <w:bCs/>
-        </w:rPr>
-        <w:t xml:space="preserve">aller</w:t>
-      </w:r>
-      <w:r>
-        <w:t xml:space="preserve"> </w:t>
-      </w:r>
-      <w:r>
-        <w:t xml:space="preserve">Jahre.</w:t>
-      </w:r>
-    </w:p>
-    <w:p>
-      <w:pPr>
-        <w:pStyle w:val="Compact"/>
-        <w:numPr>
-          <w:ilvl w:val="0"/>
-          <w:numId w:val="1010"/>
-        </w:numPr>
-      </w:pPr>
-      <w:r>
-        <w:rPr>
-          <w:b/>
-          <w:bCs/>
-        </w:rPr>
-        <w:t xml:space="preserve">Static building data and energy for specific year(s)</w:t>
-      </w:r>
-      <w:r>
-        <w:t xml:space="preserve"> </w:t>
-      </w:r>
-      <w:r>
-        <w:t xml:space="preserve">– nur die</w:t>
-      </w:r>
-      <w:r>
-        <w:t xml:space="preserve"> </w:t>
-      </w:r>
-      <w:r>
-        <w:t xml:space="preserve">Verbrauchsdaten der von Ihnen angekreuzten Jahre. Da jedes Jahr als eigene</w:t>
-      </w:r>
-      <w:r>
-        <w:t xml:space="preserve"> </w:t>
-      </w:r>
-      <w:r>
-        <w:t xml:space="preserve">Ressource gespeichert ist, können Sie gezielt etwa nur den aktuellsten</w:t>
-      </w:r>
-      <w:r>
-        <w:t xml:space="preserve"> </w:t>
-      </w:r>
-      <w:r>
-        <w:t xml:space="preserve">Jahrgang freigeben und ältere zurückhalten.</w:t>
-      </w:r>
-    </w:p>
-    <w:bookmarkEnd w:id="73"/>
-    <w:bookmarkStart w:id="74" w:name="aggregierte-ansichten-teilen"/>
-    <w:p>
-      <w:pPr>
-        <w:pStyle w:val="Heading3"/>
-      </w:pPr>
-      <w:r>
-        <w:t xml:space="preserve">Aggregierte Ansichten teilen</w:t>
-      </w:r>
-    </w:p>
-    <w:p>
-      <w:pPr>
-        <w:pStyle w:val="FirstParagraph"/>
-      </w:pPr>
-      <w:r>
-        <w:t xml:space="preserve">Manchmal möchten Sie Informationen teilen, ohne dass der Empfänger Details über</w:t>
-      </w:r>
-      <w:r>
-        <w:t xml:space="preserve"> </w:t>
-      </w:r>
-      <w:r>
-        <w:t xml:space="preserve">einzelne Gebäude sieht. Zum Beispiel möchte ein Investor wissen, wie effizient</w:t>
-      </w:r>
-      <w:r>
-        <w:t xml:space="preserve"> </w:t>
-      </w:r>
-      <w:r>
-        <w:t xml:space="preserve">ein Gesamt-Portfolio ist, muss aber nicht wissen, welches spezifische Gebäude wie</w:t>
-      </w:r>
-      <w:r>
-        <w:t xml:space="preserve"> </w:t>
-      </w:r>
-      <w:r>
-        <w:t xml:space="preserve">viel verbraucht. Für solche Fälle bietet Granergize</w:t>
-      </w:r>
-      <w:r>
-        <w:t xml:space="preserve"> </w:t>
-      </w:r>
-      <w:r>
-        <w:rPr>
-          <w:b/>
-          <w:bCs/>
-        </w:rPr>
-        <w:t xml:space="preserve">aggregierte Ansichten</w:t>
-      </w:r>
-      <w:r>
-        <w:t xml:space="preserve"> </w:t>
-      </w:r>
-      <w:r>
-        <w:t xml:space="preserve">(„Views”) an: eine Zusammenfassung mehrerer Gebäude. Was der Empfänger erhält,</w:t>
-      </w:r>
-      <w:r>
-        <w:t xml:space="preserve"> </w:t>
-      </w:r>
-      <w:r>
-        <w:t xml:space="preserve">ist nur diese Zusammenfassung – er sieht nicht, welche Gebäude dahinterstecken.</w:t>
-      </w:r>
-    </w:p>
-    <w:p>
-      <w:pPr>
-        <w:pStyle w:val="BodyText"/>
-      </w:pPr>
-      <w:r>
-        <w:t xml:space="preserve">Granergize bietet vier Aggregationsfunktionen:</w:t>
       </w:r>
     </w:p>
     <w:p>
@@ -5124,13 +5227,31 @@
           <w:b/>
           <w:bCs/>
         </w:rPr>
-        <w:t xml:space="preserve">Durchschnitt (average):</w:t>
-      </w:r>
-      <w:r>
-        <w:t xml:space="preserve"> </w:t>
-      </w:r>
-      <w:r>
-        <w:t xml:space="preserve">Mittelwert über alle ausgewählten Gebäude.</w:t>
+        <w:t xml:space="preserve">Static building data only</w:t>
+      </w:r>
+      <w:r>
+        <w:t xml:space="preserve"> </w:t>
+      </w:r>
+      <w:r>
+        <w:t xml:space="preserve">– nur die Stammdaten des Gebäudes (Adresse,</w:t>
+      </w:r>
+      <w:r>
+        <w:t xml:space="preserve"> </w:t>
+      </w:r>
+      <w:r>
+        <w:t xml:space="preserve">Fläche, Baujahr, Nutzungsart, Information über vorhandene Photovoltaik-Anlagen),</w:t>
+      </w:r>
+      <w:r>
+        <w:t xml:space="preserve"> </w:t>
+      </w:r>
+      <w:r>
+        <w:t xml:space="preserve">ohne Verbrauchswerte. Nützlich, wenn Sie jemandem zunächst zeigen möchten,</w:t>
+      </w:r>
+      <w:r>
+        <w:t xml:space="preserve"> </w:t>
+      </w:r>
+      <w:r>
+        <w:t xml:space="preserve">welche Gebäude Sie verwalten, ohne sofort sensible Verbrauchsdaten preiszugeben.</w:t>
       </w:r>
     </w:p>
     <w:p>
@@ -5146,13 +5267,35 @@
           <w:b/>
           <w:bCs/>
         </w:rPr>
-        <w:t xml:space="preserve">Summe (sum):</w:t>
-      </w:r>
-      <w:r>
-        <w:t xml:space="preserve"> </w:t>
-      </w:r>
-      <w:r>
-        <w:t xml:space="preserve">addiert alle Werte.</w:t>
+        <w:t xml:space="preserve">Static building data and all energy readings</w:t>
+      </w:r>
+      <w:r>
+        <w:t xml:space="preserve"> </w:t>
+      </w:r>
+      <w:r>
+        <w:t xml:space="preserve">– zusätzlich die</w:t>
+      </w:r>
+      <w:r>
+        <w:t xml:space="preserve"> </w:t>
+      </w:r>
+      <w:r>
+        <w:t xml:space="preserve">Verbrauchswerte (Strom, Gas, Fernwärme, Wasser)</w:t>
+      </w:r>
+      <w:r>
+        <w:t xml:space="preserve"> </w:t>
+      </w:r>
+      <w:r>
+        <w:rPr>
+          <w:b/>
+          <w:bCs/>
+        </w:rPr>
+        <w:t xml:space="preserve">aller</w:t>
+      </w:r>
+      <w:r>
+        <w:t xml:space="preserve"> </w:t>
+      </w:r>
+      <w:r>
+        <w:t xml:space="preserve">Jahre.</w:t>
       </w:r>
     </w:p>
     <w:p>
@@ -5168,45 +5311,41 @@
           <w:b/>
           <w:bCs/>
         </w:rPr>
-        <w:t xml:space="preserve">Minimum (minimum):</w:t>
-      </w:r>
-      <w:r>
-        <w:t xml:space="preserve"> </w:t>
-      </w:r>
-      <w:r>
-        <w:t xml:space="preserve">zeigt den niedrigsten Wert.</w:t>
-      </w:r>
-    </w:p>
-    <w:p>
-      <w:pPr>
-        <w:pStyle w:val="Compact"/>
-        <w:numPr>
-          <w:ilvl w:val="0"/>
-          <w:numId w:val="1011"/>
-        </w:numPr>
-      </w:pPr>
-      <w:r>
-        <w:rPr>
-          <w:b/>
-          <w:bCs/>
-        </w:rPr>
-        <w:t xml:space="preserve">Maximum (maximum):</w:t>
-      </w:r>
-      <w:r>
-        <w:t xml:space="preserve"> </w:t>
-      </w:r>
-      <w:r>
-        <w:t xml:space="preserve">zeigt den höchsten Wert.</w:t>
-      </w:r>
-    </w:p>
-    <w:bookmarkEnd w:id="74"/>
-    <w:bookmarkStart w:id="75" w:name="rollenbasierte-freigaben"/>
+        <w:t xml:space="preserve">Static building data and energy for specific year(s)</w:t>
+      </w:r>
+      <w:r>
+        <w:t xml:space="preserve"> </w:t>
+      </w:r>
+      <w:r>
+        <w:t xml:space="preserve">– nur die</w:t>
+      </w:r>
+      <w:r>
+        <w:t xml:space="preserve"> </w:t>
+      </w:r>
+      <w:r>
+        <w:t xml:space="preserve">Verbrauchsdaten der von Ihnen angekreuzten Jahre. Da jedes Jahr als eigene</w:t>
+      </w:r>
+      <w:r>
+        <w:t xml:space="preserve"> </w:t>
+      </w:r>
+      <w:r>
+        <w:t xml:space="preserve">Ressource gespeichert ist, können Sie gezielt etwa nur den aktuellsten</w:t>
+      </w:r>
+      <w:r>
+        <w:t xml:space="preserve"> </w:t>
+      </w:r>
+      <w:r>
+        <w:t xml:space="preserve">Jahrgang freigeben und ältere zurückhalten.</w:t>
+      </w:r>
+    </w:p>
+    <w:bookmarkEnd w:id="77"/>
+    <w:bookmarkStart w:id="78" w:name="aggregierte-ansichten-teilen"/>
     <w:p>
       <w:pPr>
         <w:pStyle w:val="Heading3"/>
       </w:pPr>
       <w:r>
-        <w:t xml:space="preserve">Rollenbasierte Freigaben</w:t>
+        <w:t xml:space="preserve">Aggregierte Ansichten teilen</w:t>
       </w:r>
     </w:p>
     <w:p>
@@ -5214,94 +5353,55 @@
         <w:pStyle w:val="FirstParagraph"/>
       </w:pPr>
       <w:r>
-        <w:t xml:space="preserve">In der Praxis haben unterschiedliche Partner unterschiedliche Bedürfnisse: Ein</w:t>
-      </w:r>
-      <w:r>
-        <w:t xml:space="preserve"> </w:t>
-      </w:r>
-      <w:r>
-        <w:t xml:space="preserve">Investor benötigt grobe Jahreszahlen, ein Energiemanager hingegen hochauflösende</w:t>
-      </w:r>
-      <w:r>
-        <w:t xml:space="preserve"> </w:t>
-      </w:r>
-      <w:r>
-        <w:t xml:space="preserve">15-Minuten-Intervalle. Mit der rollenbasierten Freigabe teilen Sie mit allen</w:t>
-      </w:r>
-      <w:r>
-        <w:t xml:space="preserve"> </w:t>
-      </w:r>
-      <w:r>
-        <w:t xml:space="preserve">Mitgliedern eines Datenraums, die eine bestimmte Rolle innehaben – die Auswahl</w:t>
-      </w:r>
-      <w:r>
-        <w:t xml:space="preserve"> </w:t>
-      </w:r>
-      <w:r>
-        <w:t xml:space="preserve">der Empfänger ergibt sich aus der Rolle.</w:t>
-      </w:r>
-    </w:p>
-    <w:bookmarkEnd w:id="75"/>
-    <w:bookmarkEnd w:id="76"/>
-    <w:bookmarkStart w:id="98" w:name="vorgehensweise-beim-datenteilen"/>
-    <w:p>
-      <w:pPr>
-        <w:pStyle w:val="Heading2"/>
-      </w:pPr>
-      <w:r>
-        <w:t xml:space="preserve">Vorgehensweise beim Datenteilen</w:t>
-      </w:r>
-    </w:p>
-    <w:bookmarkStart w:id="80" w:name="X02cc8b8c675205394a9898fb5cbb8306158c66e"/>
-    <w:p>
-      <w:pPr>
-        <w:pStyle w:val="Heading3"/>
-      </w:pPr>
-      <w:r>
-        <w:t xml:space="preserve">Einem Datenraum beitreten oder einen Raum erstellen</w:t>
-      </w:r>
-    </w:p>
-    <w:p>
-      <w:pPr>
-        <w:pStyle w:val="FirstParagraph"/>
-      </w:pPr>
-      <w:r>
-        <w:t xml:space="preserve">Ein</w:t>
-      </w:r>
-      <w:r>
-        <w:t xml:space="preserve"> </w:t>
-      </w:r>
-      <w:r>
-        <w:rPr>
-          <w:b/>
-          <w:bCs/>
-        </w:rPr>
-        <w:t xml:space="preserve">Datenraum</w:t>
-      </w:r>
-      <w:r>
-        <w:t xml:space="preserve"> </w:t>
-      </w:r>
-      <w:r>
-        <w:t xml:space="preserve">bündelt die Akteure, die untereinander Daten teilen, und ist</w:t>
-      </w:r>
-      <w:r>
-        <w:t xml:space="preserve"> </w:t>
-      </w:r>
-      <w:r>
-        <w:t xml:space="preserve">die Grundlage für die rollenbasierte Freigabe. Im Tab</w:t>
-      </w:r>
-      <w:r>
-        <w:t xml:space="preserve"> </w:t>
-      </w:r>
-      <w:r>
-        <w:rPr>
-          <w:b/>
-          <w:bCs/>
-        </w:rPr>
-        <w:t xml:space="preserve">Connect</w:t>
-      </w:r>
-      <w:r>
-        <w:t xml:space="preserve">:</w:t>
+        <w:t xml:space="preserve">Manchmal möchten Sie Informationen teilen, ohne dass der Empfänger Details über</w:t>
+      </w:r>
+      <w:r>
+        <w:t xml:space="preserve"> </w:t>
+      </w:r>
+      <w:r>
+        <w:t xml:space="preserve">einzelne Gebäude sieht. Zum Beispiel möchte ein Investor wissen, wie effizient</w:t>
+      </w:r>
+      <w:r>
+        <w:t xml:space="preserve"> </w:t>
+      </w:r>
+      <w:r>
+        <w:t xml:space="preserve">ein Gesamt-Portfolio ist, muss aber nicht wissen, welches spezifische Gebäude wie</w:t>
+      </w:r>
+      <w:r>
+        <w:t xml:space="preserve"> </w:t>
+      </w:r>
+      <w:r>
+        <w:t xml:space="preserve">viel verbraucht. Für solche Fälle bietet Granergize</w:t>
+      </w:r>
+      <w:r>
+        <w:t xml:space="preserve"> </w:t>
+      </w:r>
+      <w:r>
+        <w:rPr>
+          <w:b/>
+          <w:bCs/>
+        </w:rPr>
+        <w:t xml:space="preserve">aggregierte Ansichten</w:t>
+      </w:r>
+      <w:r>
+        <w:t xml:space="preserve"> </w:t>
+      </w:r>
+      <w:r>
+        <w:t xml:space="preserve">(„Views”) an: eine Zusammenfassung mehrerer Gebäude. Was der Empfänger erhält,</w:t>
+      </w:r>
+      <w:r>
+        <w:t xml:space="preserve"> </w:t>
+      </w:r>
+      <w:r>
+        <w:t xml:space="preserve">ist nur diese Zusammenfassung – er sieht nicht, welche Gebäude dahinterstecken.</w:t>
+      </w:r>
+    </w:p>
+    <w:p>
+      <w:pPr>
+        <w:pStyle w:val="BodyText"/>
+      </w:pPr>
+      <w:r>
+        <w:t xml:space="preserve">Granergize bietet vier Aggregationsfunktionen:</w:t>
       </w:r>
     </w:p>
     <w:p>
@@ -5317,19 +5417,13 @@
           <w:b/>
           <w:bCs/>
         </w:rPr>
-        <w:t xml:space="preserve">Raum erstellen:</w:t>
-      </w:r>
-      <w:r>
-        <w:t xml:space="preserve"> </w:t>
-      </w:r>
-      <w:r>
-        <w:t xml:space="preserve">„Host a data room” legt einen Raum auf Ihrem Pod an. Teilen</w:t>
-      </w:r>
-      <w:r>
-        <w:t xml:space="preserve"> </w:t>
-      </w:r>
-      <w:r>
-        <w:t xml:space="preserve">Sie dessen Link oder QR-Code, damit andere beitreten können.</w:t>
+        <w:t xml:space="preserve">Durchschnitt (average):</w:t>
+      </w:r>
+      <w:r>
+        <w:t xml:space="preserve"> </w:t>
+      </w:r>
+      <w:r>
+        <w:t xml:space="preserve">Mittelwert über alle ausgewählten Gebäude.</w:t>
       </w:r>
     </w:p>
     <w:p>
@@ -5345,19 +5439,13 @@
           <w:b/>
           <w:bCs/>
         </w:rPr>
-        <w:t xml:space="preserve">Beitreten:</w:t>
-      </w:r>
-      <w:r>
-        <w:t xml:space="preserve"> </w:t>
-      </w:r>
-      <w:r>
-        <w:t xml:space="preserve">Fügen Sie eine Raum-URI in das Feld ein und klicken Sie auf</w:t>
-      </w:r>
-      <w:r>
-        <w:t xml:space="preserve"> </w:t>
-      </w:r>
-      <w:r>
-        <w:t xml:space="preserve">„Add”, oder nutzen Sie „Scan QR code”.</w:t>
+        <w:t xml:space="preserve">Summe (sum):</w:t>
+      </w:r>
+      <w:r>
+        <w:t xml:space="preserve"> </w:t>
+      </w:r>
+      <w:r>
+        <w:t xml:space="preserve">addiert alle Werte.</w:t>
       </w:r>
     </w:p>
     <w:p>
@@ -5373,6 +5461,437 @@
           <w:b/>
           <w:bCs/>
         </w:rPr>
+        <w:t xml:space="preserve">Minimum (minimum):</w:t>
+      </w:r>
+      <w:r>
+        <w:t xml:space="preserve"> </w:t>
+      </w:r>
+      <w:r>
+        <w:t xml:space="preserve">zeigt den niedrigsten Wert.</w:t>
+      </w:r>
+    </w:p>
+    <w:p>
+      <w:pPr>
+        <w:pStyle w:val="Compact"/>
+        <w:numPr>
+          <w:ilvl w:val="0"/>
+          <w:numId w:val="1012"/>
+        </w:numPr>
+      </w:pPr>
+      <w:r>
+        <w:rPr>
+          <w:b/>
+          <w:bCs/>
+        </w:rPr>
+        <w:t xml:space="preserve">Maximum (maximum):</w:t>
+      </w:r>
+      <w:r>
+        <w:t xml:space="preserve"> </w:t>
+      </w:r>
+      <w:r>
+        <w:t xml:space="preserve">zeigt den höchsten Wert.</w:t>
+      </w:r>
+    </w:p>
+    <w:bookmarkEnd w:id="78"/>
+    <w:bookmarkStart w:id="79" w:name="rollenbasierte-freigaben"/>
+    <w:p>
+      <w:pPr>
+        <w:pStyle w:val="Heading3"/>
+      </w:pPr>
+      <w:r>
+        <w:t xml:space="preserve">Rollenbasierte Freigaben</w:t>
+      </w:r>
+    </w:p>
+    <w:p>
+      <w:pPr>
+        <w:pStyle w:val="FirstParagraph"/>
+      </w:pPr>
+      <w:r>
+        <w:t xml:space="preserve">In der Praxis haben unterschiedliche Partner unterschiedliche Bedürfnisse: Ein</w:t>
+      </w:r>
+      <w:r>
+        <w:t xml:space="preserve"> </w:t>
+      </w:r>
+      <w:r>
+        <w:t xml:space="preserve">Investor benötigt grobe Jahreszahlen, ein Energiemanager hingegen hochauflösende</w:t>
+      </w:r>
+      <w:r>
+        <w:t xml:space="preserve"> </w:t>
+      </w:r>
+      <w:r>
+        <w:t xml:space="preserve">15-Minuten-Intervalle. Mit der rollenbasierten Freigabe teilen Sie mit allen</w:t>
+      </w:r>
+      <w:r>
+        <w:t xml:space="preserve"> </w:t>
+      </w:r>
+      <w:r>
+        <w:t xml:space="preserve">Mitgliedern eines Datenraums, die eine bestimmte Rolle innehaben – die Auswahl</w:t>
+      </w:r>
+      <w:r>
+        <w:t xml:space="preserve"> </w:t>
+      </w:r>
+      <w:r>
+        <w:t xml:space="preserve">der Empfänger ergibt sich aus der Rolle.</w:t>
+      </w:r>
+    </w:p>
+    <w:p>
+      <w:pPr>
+        <w:pStyle w:val="BodyText"/>
+      </w:pPr>
+      <w:r>
+        <w:t xml:space="preserve">Granergize kennt acht Rollen, die Sie sich im Datenraum zuweisen können (die</w:t>
+      </w:r>
+      <w:r>
+        <w:t xml:space="preserve"> </w:t>
+      </w:r>
+      <w:r>
+        <w:t xml:space="preserve">Auswahl „My role(s)” zeigt sie mit ihren englischen Bezeichnungen):</w:t>
+      </w:r>
+    </w:p>
+    <w:p>
+      <w:pPr>
+        <w:pStyle w:val="Compact"/>
+        <w:numPr>
+          <w:ilvl w:val="0"/>
+          <w:numId w:val="1013"/>
+        </w:numPr>
+      </w:pPr>
+      <w:r>
+        <w:rPr>
+          <w:b/>
+          <w:bCs/>
+        </w:rPr>
+        <w:t xml:space="preserve">Investor</w:t>
+      </w:r>
+      <w:r>
+        <w:t xml:space="preserve"> </w:t>
+      </w:r>
+      <w:r>
+        <w:t xml:space="preserve">– Investoren und Bestandshalter</w:t>
+      </w:r>
+    </w:p>
+    <w:p>
+      <w:pPr>
+        <w:pStyle w:val="Compact"/>
+        <w:numPr>
+          <w:ilvl w:val="0"/>
+          <w:numId w:val="1013"/>
+        </w:numPr>
+      </w:pPr>
+      <w:r>
+        <w:rPr>
+          <w:b/>
+          <w:bCs/>
+        </w:rPr>
+        <w:t xml:space="preserve">User</w:t>
+      </w:r>
+      <w:r>
+        <w:t xml:space="preserve"> </w:t>
+      </w:r>
+      <w:r>
+        <w:t xml:space="preserve">– Nutzer der Immobilie</w:t>
+      </w:r>
+    </w:p>
+    <w:p>
+      <w:pPr>
+        <w:pStyle w:val="Compact"/>
+        <w:numPr>
+          <w:ilvl w:val="0"/>
+          <w:numId w:val="1013"/>
+        </w:numPr>
+      </w:pPr>
+      <w:r>
+        <w:rPr>
+          <w:b/>
+          <w:bCs/>
+        </w:rPr>
+        <w:t xml:space="preserve">Benchmark Service Provider</w:t>
+      </w:r>
+      <w:r>
+        <w:t xml:space="preserve"> </w:t>
+      </w:r>
+      <w:r>
+        <w:t xml:space="preserve">– Benchmark-Dienstleister</w:t>
+      </w:r>
+    </w:p>
+    <w:p>
+      <w:pPr>
+        <w:pStyle w:val="Compact"/>
+        <w:numPr>
+          <w:ilvl w:val="0"/>
+          <w:numId w:val="1013"/>
+        </w:numPr>
+      </w:pPr>
+      <w:r>
+        <w:rPr>
+          <w:b/>
+          <w:bCs/>
+        </w:rPr>
+        <w:t xml:space="preserve">Facility Manager</w:t>
+      </w:r>
+      <w:r>
+        <w:t xml:space="preserve"> </w:t>
+      </w:r>
+      <w:r>
+        <w:t xml:space="preserve">– Gebäude- und Betriebsverantwortliche</w:t>
+      </w:r>
+    </w:p>
+    <w:p>
+      <w:pPr>
+        <w:pStyle w:val="Compact"/>
+        <w:numPr>
+          <w:ilvl w:val="0"/>
+          <w:numId w:val="1013"/>
+        </w:numPr>
+      </w:pPr>
+      <w:r>
+        <w:rPr>
+          <w:b/>
+          <w:bCs/>
+        </w:rPr>
+        <w:t xml:space="preserve">Developer</w:t>
+      </w:r>
+      <w:r>
+        <w:t xml:space="preserve"> </w:t>
+      </w:r>
+      <w:r>
+        <w:t xml:space="preserve">– Projektentwickler</w:t>
+      </w:r>
+    </w:p>
+    <w:p>
+      <w:pPr>
+        <w:pStyle w:val="Compact"/>
+        <w:numPr>
+          <w:ilvl w:val="0"/>
+          <w:numId w:val="1013"/>
+        </w:numPr>
+      </w:pPr>
+      <w:r>
+        <w:rPr>
+          <w:b/>
+          <w:bCs/>
+        </w:rPr>
+        <w:t xml:space="preserve">Consultant / Broker</w:t>
+      </w:r>
+      <w:r>
+        <w:t xml:space="preserve"> </w:t>
+      </w:r>
+      <w:r>
+        <w:t xml:space="preserve">– Berater und Makler</w:t>
+      </w:r>
+    </w:p>
+    <w:p>
+      <w:pPr>
+        <w:pStyle w:val="Compact"/>
+        <w:numPr>
+          <w:ilvl w:val="0"/>
+          <w:numId w:val="1013"/>
+        </w:numPr>
+      </w:pPr>
+      <w:r>
+        <w:rPr>
+          <w:b/>
+          <w:bCs/>
+        </w:rPr>
+        <w:t xml:space="preserve">Software Provider</w:t>
+      </w:r>
+      <w:r>
+        <w:t xml:space="preserve"> </w:t>
+      </w:r>
+      <w:r>
+        <w:t xml:space="preserve">– Softwaredienstleister</w:t>
+      </w:r>
+    </w:p>
+    <w:p>
+      <w:pPr>
+        <w:pStyle w:val="Compact"/>
+        <w:numPr>
+          <w:ilvl w:val="0"/>
+          <w:numId w:val="1013"/>
+        </w:numPr>
+      </w:pPr>
+      <w:r>
+        <w:rPr>
+          <w:b/>
+          <w:bCs/>
+        </w:rPr>
+        <w:t xml:space="preserve">Energy Provider</w:t>
+      </w:r>
+      <w:r>
+        <w:t xml:space="preserve"> </w:t>
+      </w:r>
+      <w:r>
+        <w:t xml:space="preserve">– Energiedienstleister</w:t>
+      </w:r>
+    </w:p>
+    <w:p>
+      <w:pPr>
+        <w:pStyle w:val="FirstParagraph"/>
+      </w:pPr>
+      <w:r>
+        <w:t xml:space="preserve">Diese Rollen sind bewusst nicht exklusiv: Sie können sich</w:t>
+      </w:r>
+      <w:r>
+        <w:t xml:space="preserve"> </w:t>
+      </w:r>
+      <w:r>
+        <w:rPr>
+          <w:b/>
+          <w:bCs/>
+        </w:rPr>
+        <w:t xml:space="preserve">mehrere oder alle</w:t>
+      </w:r>
+      <w:r>
+        <w:t xml:space="preserve"> </w:t>
+      </w:r>
+      <w:r>
+        <w:t xml:space="preserve">zuweisen (siehe „Rolle wählen”). Eine Rolle hängt ausschließlich an der</w:t>
+      </w:r>
+      <w:r>
+        <w:t xml:space="preserve"> </w:t>
+      </w:r>
+      <w:r>
+        <w:t xml:space="preserve">Datenraum-Mitgliedschaft – nicht an einem Gebäude, seinen Energiedaten oder Ihrem</w:t>
+      </w:r>
+      <w:r>
+        <w:t xml:space="preserve"> </w:t>
+      </w:r>
+      <w:r>
+        <w:t xml:space="preserve">Profil.</w:t>
+      </w:r>
+    </w:p>
+    <w:bookmarkEnd w:id="79"/>
+    <w:bookmarkEnd w:id="80"/>
+    <w:bookmarkStart w:id="102" w:name="vorgehensweise-beim-datenteilen"/>
+    <w:p>
+      <w:pPr>
+        <w:pStyle w:val="Heading2"/>
+      </w:pPr>
+      <w:r>
+        <w:t xml:space="preserve">Vorgehensweise beim Datenteilen</w:t>
+      </w:r>
+    </w:p>
+    <w:bookmarkStart w:id="84" w:name="X02cc8b8c675205394a9898fb5cbb8306158c66e"/>
+    <w:p>
+      <w:pPr>
+        <w:pStyle w:val="Heading3"/>
+      </w:pPr>
+      <w:r>
+        <w:t xml:space="preserve">Einem Datenraum beitreten oder einen Raum erstellen</w:t>
+      </w:r>
+    </w:p>
+    <w:p>
+      <w:pPr>
+        <w:pStyle w:val="FirstParagraph"/>
+      </w:pPr>
+      <w:r>
+        <w:t xml:space="preserve">Ein</w:t>
+      </w:r>
+      <w:r>
+        <w:t xml:space="preserve"> </w:t>
+      </w:r>
+      <w:r>
+        <w:rPr>
+          <w:b/>
+          <w:bCs/>
+        </w:rPr>
+        <w:t xml:space="preserve">Datenraum</w:t>
+      </w:r>
+      <w:r>
+        <w:t xml:space="preserve"> </w:t>
+      </w:r>
+      <w:r>
+        <w:t xml:space="preserve">bündelt die Akteure, die untereinander Daten teilen, und ist</w:t>
+      </w:r>
+      <w:r>
+        <w:t xml:space="preserve"> </w:t>
+      </w:r>
+      <w:r>
+        <w:t xml:space="preserve">die Grundlage für die rollenbasierte Freigabe. Im Tab</w:t>
+      </w:r>
+      <w:r>
+        <w:t xml:space="preserve"> </w:t>
+      </w:r>
+      <w:r>
+        <w:rPr>
+          <w:b/>
+          <w:bCs/>
+        </w:rPr>
+        <w:t xml:space="preserve">Connect</w:t>
+      </w:r>
+      <w:r>
+        <w:t xml:space="preserve">:</w:t>
+      </w:r>
+    </w:p>
+    <w:p>
+      <w:pPr>
+        <w:pStyle w:val="Compact"/>
+        <w:numPr>
+          <w:ilvl w:val="0"/>
+          <w:numId w:val="1014"/>
+        </w:numPr>
+      </w:pPr>
+      <w:r>
+        <w:rPr>
+          <w:b/>
+          <w:bCs/>
+        </w:rPr>
+        <w:t xml:space="preserve">Raum erstellen:</w:t>
+      </w:r>
+      <w:r>
+        <w:t xml:space="preserve"> </w:t>
+      </w:r>
+      <w:r>
+        <w:t xml:space="preserve">„Host a data room” legt einen Raum auf Ihrem Pod an. Teilen</w:t>
+      </w:r>
+      <w:r>
+        <w:t xml:space="preserve"> </w:t>
+      </w:r>
+      <w:r>
+        <w:t xml:space="preserve">Sie dessen Link oder QR-Code, damit andere beitreten können.</w:t>
+      </w:r>
+    </w:p>
+    <w:p>
+      <w:pPr>
+        <w:pStyle w:val="Compact"/>
+        <w:numPr>
+          <w:ilvl w:val="0"/>
+          <w:numId w:val="1014"/>
+        </w:numPr>
+      </w:pPr>
+      <w:r>
+        <w:rPr>
+          <w:b/>
+          <w:bCs/>
+        </w:rPr>
+        <w:t xml:space="preserve">Beitreten:</w:t>
+      </w:r>
+      <w:r>
+        <w:t xml:space="preserve"> </w:t>
+      </w:r>
+      <w:r>
+        <w:t xml:space="preserve">Fügen Sie eine Raum-URI in das Feld ein und klicken Sie auf</w:t>
+      </w:r>
+      <w:r>
+        <w:t xml:space="preserve"> </w:t>
+      </w:r>
+      <w:r>
+        <w:t xml:space="preserve">„Add”, oder nutzen Sie „Scan QR code”.</w:t>
+      </w:r>
+    </w:p>
+    <w:p>
+      <w:pPr>
+        <w:pStyle w:val="Compact"/>
+        <w:numPr>
+          <w:ilvl w:val="0"/>
+          <w:numId w:val="1014"/>
+        </w:numPr>
+      </w:pPr>
+      <w:r>
+        <w:rPr>
+          <w:b/>
+          <w:bCs/>
+        </w:rPr>
         <w:t xml:space="preserve">Rolle wählen:</w:t>
       </w:r>
       <w:r>
@@ -5407,13 +5926,13 @@
         <w:t xml:space="preserve"> </w:t>
       </w:r>
       <w:r>
-        <w:t xml:space="preserve">role” mit Ihnen teilen. (Diese Raum-Rolle ist unabhängig von der</w:t>
-      </w:r>
-      <w:r>
-        <w:t xml:space="preserve"> </w:t>
-      </w:r>
-      <w:r>
-        <w:t xml:space="preserve">Datenproduzenten-Rolle aus Ihrem Profil.)</w:t>
+        <w:t xml:space="preserve">role” mit Ihnen teilen. Rollen gibt es ausschließlich hier, im Datenraum – sie</w:t>
+      </w:r>
+      <w:r>
+        <w:t xml:space="preserve"> </w:t>
+      </w:r>
+      <w:r>
+        <w:t xml:space="preserve">hängen nicht an Ihren Gebäuden oder Ihrem Profil.</w:t>
       </w:r>
     </w:p>
     <w:p>
@@ -5425,143 +5944,12 @@
           <wp:inline>
             <wp:extent cx="5334000" cy="4000499"/>
             <wp:effectExtent b="0" l="0" r="0" t="0"/>
-            <wp:docPr descr="Tab „Connect”: Raum erstellen oder beitreten und Rolle wählen" title="" id="78" name="Picture"/>
+            <wp:docPr descr="Tab „Connect”: Raum erstellen oder beitreten und Rolle wählen" title="" id="82" name="Picture"/>
             <a:graphic>
               <a:graphicData uri="http://schemas.openxmlformats.org/drawingml/2006/picture">
                 <pic:pic>
                   <pic:nvPicPr>
-                    <pic:cNvPr descr="figures/room.png" id="79" name="Picture"/>
-                    <pic:cNvPicPr>
-                      <a:picLocks noChangeArrowheads="1" noChangeAspect="1"/>
-                    </pic:cNvPicPr>
-                  </pic:nvPicPr>
-                  <pic:blipFill>
-                    <a:blip r:embed="rId77"/>
-                    <a:stretch>
-                      <a:fillRect/>
-                    </a:stretch>
-                  </pic:blipFill>
-                  <pic:spPr bwMode="auto">
-                    <a:xfrm>
-                      <a:off x="0" y="0"/>
-                      <a:ext cx="5334000" cy="4000499"/>
-                    </a:xfrm>
-                    <a:prstGeom prst="rect">
-                      <a:avLst/>
-                    </a:prstGeom>
-                    <a:noFill/>
-                    <a:ln w="9525">
-                      <a:noFill/>
-                      <a:headEnd/>
-                      <a:tailEnd/>
-                    </a:ln>
-                  </pic:spPr>
-                </pic:pic>
-              </a:graphicData>
-            </a:graphic>
-          </wp:inline>
-        </w:drawing>
-      </w:r>
-    </w:p>
-    <w:p>
-      <w:pPr>
-        <w:pStyle w:val="ImageCaption"/>
-      </w:pPr>
-      <w:r>
-        <w:t xml:space="preserve">Tab „Connect”: Raum erstellen oder beitreten und Rolle wählen</w:t>
-      </w:r>
-    </w:p>
-    <w:bookmarkEnd w:id="80"/>
-    <w:bookmarkStart w:id="84" w:name="kontakte-verwalten"/>
-    <w:p>
-      <w:pPr>
-        <w:pStyle w:val="Heading3"/>
-      </w:pPr>
-      <w:r>
-        <w:t xml:space="preserve">Kontakte verwalten</w:t>
-      </w:r>
-    </w:p>
-    <w:p>
-      <w:pPr>
-        <w:pStyle w:val="FirstParagraph"/>
-      </w:pPr>
-      <w:r>
-        <w:t xml:space="preserve">Ebenfalls im Tab</w:t>
-      </w:r>
-      <w:r>
-        <w:t xml:space="preserve"> </w:t>
-      </w:r>
-      <w:r>
-        <w:rPr>
-          <w:b/>
-          <w:bCs/>
-        </w:rPr>
-        <w:t xml:space="preserve">Connect</w:t>
-      </w:r>
-      <w:r>
-        <w:t xml:space="preserve"> </w:t>
-      </w:r>
-      <w:r>
-        <w:t xml:space="preserve">führen Sie unter „Contacts” ein persönliches</w:t>
-      </w:r>
-      <w:r>
-        <w:t xml:space="preserve"> </w:t>
-      </w:r>
-      <w:r>
-        <w:t xml:space="preserve">Adressbuch Ihrer Geschäftspartner – jeder Eintrag ist eine WebID, zu der</w:t>
-      </w:r>
-      <w:r>
-        <w:t xml:space="preserve"> </w:t>
-      </w:r>
-      <w:r>
-        <w:t xml:space="preserve">Granergize automatisch den hinterlegten Namen und das Profilbild auflöst.</w:t>
-      </w:r>
-      <w:r>
-        <w:t xml:space="preserve"> </w:t>
-      </w:r>
-      <w:r>
-        <w:t xml:space="preserve">Geschäftspartner, mit denen Sie Daten teilen, werden hier automatisch gemerkt;</w:t>
-      </w:r>
-      <w:r>
-        <w:t xml:space="preserve"> </w:t>
-      </w:r>
-      <w:r>
-        <w:t xml:space="preserve">zusätzlich können Sie eine WebID von Hand eintragen und mit „Add” hinzufügen oder</w:t>
-      </w:r>
-      <w:r>
-        <w:t xml:space="preserve"> </w:t>
-      </w:r>
-      <w:r>
-        <w:t xml:space="preserve">einen Eintrag über das Lösch-Symbol wieder entfernen. Ihre Kontakte erscheinen</w:t>
-      </w:r>
-      <w:r>
-        <w:t xml:space="preserve"> </w:t>
-      </w:r>
-      <w:r>
-        <w:t xml:space="preserve">anschließend als Vorschläge, wann immer Sie Empfänger für eine Freigabe auswählen</w:t>
-      </w:r>
-      <w:r>
-        <w:t xml:space="preserve"> </w:t>
-      </w:r>
-      <w:r>
-        <w:t xml:space="preserve">– so müssen Sie eine WebID nicht jedes Mal neu eingeben.</w:t>
-      </w:r>
-    </w:p>
-    <w:p>
-      <w:pPr>
-        <w:pStyle w:val="CaptionedFigure"/>
-      </w:pPr>
-      <w:r>
-        <w:drawing>
-          <wp:inline>
-            <wp:extent cx="5334000" cy="4000499"/>
-            <wp:effectExtent b="0" l="0" r="0" t="0"/>
-            <wp:docPr descr="Tab „Connect”: persönliches Adressbuch unter „Contacts”" title="" id="82" name="Picture"/>
-            <a:graphic>
-              <a:graphicData uri="http://schemas.openxmlformats.org/drawingml/2006/picture">
-                <pic:pic>
-                  <pic:nvPicPr>
-                    <pic:cNvPr descr="figures/contacts.png" id="83" name="Picture"/>
+                    <pic:cNvPr descr="figures/room.png" id="83" name="Picture"/>
                     <pic:cNvPicPr>
                       <a:picLocks noChangeArrowheads="1" noChangeAspect="1"/>
                     </pic:cNvPicPr>
@@ -5599,17 +5987,17 @@
         <w:pStyle w:val="ImageCaption"/>
       </w:pPr>
       <w:r>
-        <w:t xml:space="preserve">Tab „Connect”: persönliches Adressbuch unter „Contacts”</w:t>
+        <w:t xml:space="preserve">Tab „Connect”: Raum erstellen oder beitreten und Rolle wählen</w:t>
       </w:r>
     </w:p>
     <w:bookmarkEnd w:id="84"/>
-    <w:bookmarkStart w:id="88" w:name="ein-gebäude-teilen"/>
+    <w:bookmarkStart w:id="88" w:name="kontakte-verwalten"/>
     <w:p>
       <w:pPr>
         <w:pStyle w:val="Heading3"/>
       </w:pPr>
       <w:r>
-        <w:t xml:space="preserve">Ein Gebäude teilen</w:t>
+        <w:t xml:space="preserve">Kontakte verwalten</w:t>
       </w:r>
     </w:p>
     <w:p>
@@ -5617,146 +6005,65 @@
         <w:pStyle w:val="FirstParagraph"/>
       </w:pPr>
       <w:r>
-        <w:t xml:space="preserve">Im Tab</w:t>
-      </w:r>
-      <w:r>
-        <w:t xml:space="preserve"> </w:t>
-      </w:r>
-      <w:r>
-        <w:rPr>
-          <w:b/>
-          <w:bCs/>
-        </w:rPr>
-        <w:t xml:space="preserve">Manage</w:t>
-      </w:r>
-      <w:r>
-        <w:t xml:space="preserve"> </w:t>
-      </w:r>
-      <w:r>
-        <w:t xml:space="preserve">hat jedes Gebäude unter „Your buildings” eigene Symbole:</w:t>
-      </w:r>
-      <w:r>
-        <w:t xml:space="preserve"> </w:t>
-      </w:r>
-      <w:r>
-        <w:t xml:space="preserve">Bearbeiten, Dateien verwalten, Energie-Jahr erfassen, Teilen, Herunterladen und</w:t>
-      </w:r>
-      <w:r>
-        <w:t xml:space="preserve"> </w:t>
-      </w:r>
-      <w:r>
-        <w:t xml:space="preserve">Löschen (siehe Abschnitt „Gebäude bearbeiten, Dateien verwalten und löschen”).</w:t>
-      </w:r>
-    </w:p>
-    <w:p>
-      <w:pPr>
-        <w:pStyle w:val="Compact"/>
-        <w:numPr>
-          <w:ilvl w:val="0"/>
-          <w:numId w:val="1013"/>
-        </w:numPr>
-      </w:pPr>
-      <w:r>
-        <w:t xml:space="preserve">Klicken Sie beim gewünschten Gebäude auf das Teilen-Symbol. Der Dialog „Share</w:t>
-      </w:r>
-      <w:r>
-        <w:t xml:space="preserve"> </w:t>
-      </w:r>
-      <w:r>
-        <w:t xml:space="preserve">Building Data” öffnet sich.</w:t>
-      </w:r>
-    </w:p>
-    <w:p>
-      <w:pPr>
-        <w:pStyle w:val="Compact"/>
-        <w:numPr>
-          <w:ilvl w:val="0"/>
-          <w:numId w:val="1013"/>
-        </w:numPr>
-      </w:pPr>
-      <w:r>
-        <w:t xml:space="preserve">Wählen Sie, an wen geteilt wird:</w:t>
-      </w:r>
-      <w:r>
-        <w:t xml:space="preserve"> </w:t>
-      </w:r>
-      <w:r>
-        <w:rPr>
-          <w:b/>
-          <w:bCs/>
-        </w:rPr>
-        <w:t xml:space="preserve">By WebID</w:t>
-      </w:r>
-      <w:r>
-        <w:t xml:space="preserve"> </w:t>
-      </w:r>
-      <w:r>
-        <w:t xml:space="preserve">(eine oder mehrere WebIDs</w:t>
-      </w:r>
-      <w:r>
-        <w:t xml:space="preserve"> </w:t>
-      </w:r>
-      <w:r>
-        <w:t xml:space="preserve">eingeben) oder</w:t>
-      </w:r>
-      <w:r>
-        <w:t xml:space="preserve"> </w:t>
-      </w:r>
-      <w:r>
-        <w:rPr>
-          <w:b/>
-          <w:bCs/>
-        </w:rPr>
-        <w:t xml:space="preserve">By role</w:t>
-      </w:r>
-      <w:r>
-        <w:t xml:space="preserve"> </w:t>
-      </w:r>
-      <w:r>
-        <w:t xml:space="preserve">(eine Rolle wählen – geteilt wird mit allen</w:t>
-      </w:r>
-      <w:r>
-        <w:t xml:space="preserve"> </w:t>
-      </w:r>
-      <w:r>
-        <w:t xml:space="preserve">Raum-Mitgliedern, die diese Rolle haben).</w:t>
-      </w:r>
-    </w:p>
-    <w:p>
-      <w:pPr>
-        <w:pStyle w:val="Compact"/>
-        <w:numPr>
-          <w:ilvl w:val="0"/>
-          <w:numId w:val="1013"/>
-        </w:numPr>
-      </w:pPr>
-      <w:r>
-        <w:t xml:space="preserve">Wählen Sie unter „What to share” den Freigabeumfang – nur Stammdaten, Stammdaten</w:t>
-      </w:r>
-      <w:r>
-        <w:t xml:space="preserve"> </w:t>
-      </w:r>
-      <w:r>
-        <w:t xml:space="preserve">mit allen Energiejahren oder Stammdaten mit ausgewählten Jahren (siehe Abschnitt</w:t>
-      </w:r>
-      <w:r>
-        <w:t xml:space="preserve"> </w:t>
-      </w:r>
-      <w:r>
-        <w:t xml:space="preserve">„Individuelle Gebäudedaten teilen”) – und bestätigen Sie mit</w:t>
-      </w:r>
-      <w:r>
-        <w:t xml:space="preserve"> </w:t>
-      </w:r>
-      <w:r>
-        <w:rPr>
-          <w:b/>
-          <w:bCs/>
-        </w:rPr>
-        <w:t xml:space="preserve">Share</w:t>
-      </w:r>
-      <w:r>
-        <w:t xml:space="preserve">.</w:t>
+        <w:t xml:space="preserve">Ebenfalls im Tab</w:t>
+      </w:r>
+      <w:r>
+        <w:t xml:space="preserve"> </w:t>
+      </w:r>
+      <w:r>
+        <w:rPr>
+          <w:b/>
+          <w:bCs/>
+        </w:rPr>
+        <w:t xml:space="preserve">Connect</w:t>
+      </w:r>
+      <w:r>
+        <w:t xml:space="preserve"> </w:t>
+      </w:r>
+      <w:r>
+        <w:t xml:space="preserve">führen Sie unter „Contacts” ein persönliches</w:t>
+      </w:r>
+      <w:r>
+        <w:t xml:space="preserve"> </w:t>
+      </w:r>
+      <w:r>
+        <w:t xml:space="preserve">Adressbuch Ihrer Geschäftspartner – jeder Eintrag ist eine WebID, zu der</w:t>
+      </w:r>
+      <w:r>
+        <w:t xml:space="preserve"> </w:t>
+      </w:r>
+      <w:r>
+        <w:t xml:space="preserve">Granergize automatisch den hinterlegten Namen und das Profilbild auflöst.</w:t>
+      </w:r>
+      <w:r>
+        <w:t xml:space="preserve"> </w:t>
+      </w:r>
+      <w:r>
+        <w:t xml:space="preserve">Geschäftspartner, mit denen Sie Daten teilen, werden hier automatisch gemerkt;</w:t>
+      </w:r>
+      <w:r>
+        <w:t xml:space="preserve"> </w:t>
+      </w:r>
+      <w:r>
+        <w:t xml:space="preserve">zusätzlich können Sie eine WebID von Hand eintragen und mit „Add” hinzufügen oder</w:t>
+      </w:r>
+      <w:r>
+        <w:t xml:space="preserve"> </w:t>
+      </w:r>
+      <w:r>
+        <w:t xml:space="preserve">einen Eintrag über das Lösch-Symbol wieder entfernen. Ihre Kontakte erscheinen</w:t>
+      </w:r>
+      <w:r>
+        <w:t xml:space="preserve"> </w:t>
+      </w:r>
+      <w:r>
+        <w:t xml:space="preserve">anschließend als Vorschläge, wann immer Sie Empfänger für eine Freigabe auswählen</w:t>
+      </w:r>
+      <w:r>
+        <w:t xml:space="preserve"> </w:t>
+      </w:r>
+      <w:r>
+        <w:t xml:space="preserve">– so müssen Sie eine WebID nicht jedes Mal neu eingeben.</w:t>
       </w:r>
     </w:p>
     <w:p>
@@ -5768,12 +6075,12 @@
           <wp:inline>
             <wp:extent cx="5334000" cy="4000499"/>
             <wp:effectExtent b="0" l="0" r="0" t="0"/>
-            <wp:docPr descr="Tab „Manage”: ein Gebäude mit seinen Symbolen zum Teilen, Bearbeiten und Verwalten" title="" id="86" name="Picture"/>
+            <wp:docPr descr="Tab „Connect”: persönliches Adressbuch unter „Contacts”" title="" id="86" name="Picture"/>
             <a:graphic>
               <a:graphicData uri="http://schemas.openxmlformats.org/drawingml/2006/picture">
                 <pic:pic>
                   <pic:nvPicPr>
-                    <pic:cNvPr descr="figures/share-building.png" id="87" name="Picture"/>
+                    <pic:cNvPr descr="figures/contacts.png" id="87" name="Picture"/>
                     <pic:cNvPicPr>
                       <a:picLocks noChangeArrowheads="1" noChangeAspect="1"/>
                     </pic:cNvPicPr>
@@ -5811,70 +6118,53 @@
         <w:pStyle w:val="ImageCaption"/>
       </w:pPr>
       <w:r>
-        <w:t xml:space="preserve">Tab „Manage”: ein Gebäude mit seinen Symbolen zum Teilen, Bearbeiten und Verwalten</w:t>
-      </w:r>
-    </w:p>
-    <w:p>
-      <w:pPr>
-        <w:pStyle w:val="BlockText"/>
-      </w:pPr>
-      <w:r>
-        <w:rPr>
-          <w:b/>
-          <w:bCs/>
-        </w:rPr>
-        <w:t xml:space="preserve">Technische Details (für Administratoren)</w:t>
-      </w:r>
-    </w:p>
-    <w:p>
-      <w:pPr>
-        <w:pStyle w:val="BlockText"/>
-      </w:pPr>
-      <w:r>
-        <w:t xml:space="preserve">Im Hintergrund setzt Granergize die ACL-Berechtigung für die Gebäudedatei</w:t>
-      </w:r>
-      <w:r>
-        <w:t xml:space="preserve"> </w:t>
-      </w:r>
-      <w:r>
-        <w:t xml:space="preserve">(und, falls Energiedaten geteilt werden, für die betreffenden Energiedateien),</w:t>
-      </w:r>
-      <w:r>
-        <w:t xml:space="preserve"> </w:t>
-      </w:r>
-      <w:r>
-        <w:t xml:space="preserve">sendet eine Access-Grant-Benachrichtigung an den Posteingang (</w:t>
-      </w:r>
-      <w:r>
-        <w:rPr>
-          <w:rStyle w:val="VerbatimChar"/>
-        </w:rPr>
-        <w:t xml:space="preserve">inbox/</w:t>
-      </w:r>
-      <w:r>
-        <w:t xml:space="preserve">) des</w:t>
-      </w:r>
-      <w:r>
-        <w:t xml:space="preserve"> </w:t>
-      </w:r>
-      <w:r>
-        <w:t xml:space="preserve">Empfängers und vermerkt die Freigabe im eigenen Pod. Der Empfänger verarbeitet</w:t>
-      </w:r>
-      <w:r>
-        <w:t xml:space="preserve"> </w:t>
-      </w:r>
-      <w:r>
-        <w:t xml:space="preserve">die Benachrichtigung und sieht anschließend die geteilten Daten.</w:t>
+        <w:t xml:space="preserve">Tab „Connect”: persönliches Adressbuch unter „Contacts”</w:t>
       </w:r>
     </w:p>
     <w:bookmarkEnd w:id="88"/>
-    <w:bookmarkStart w:id="92" w:name="aggregierte-ansicht-erstellen-und-teilen"/>
+    <w:bookmarkStart w:id="92" w:name="ein-gebäude-teilen"/>
     <w:p>
       <w:pPr>
         <w:pStyle w:val="Heading3"/>
       </w:pPr>
       <w:r>
-        <w:t xml:space="preserve">Aggregierte Ansicht erstellen und teilen</w:t>
+        <w:t xml:space="preserve">Ein Gebäude teilen</w:t>
+      </w:r>
+    </w:p>
+    <w:p>
+      <w:pPr>
+        <w:pStyle w:val="FirstParagraph"/>
+      </w:pPr>
+      <w:r>
+        <w:t xml:space="preserve">Im Tab</w:t>
+      </w:r>
+      <w:r>
+        <w:t xml:space="preserve"> </w:t>
+      </w:r>
+      <w:r>
+        <w:rPr>
+          <w:b/>
+          <w:bCs/>
+        </w:rPr>
+        <w:t xml:space="preserve">Manage</w:t>
+      </w:r>
+      <w:r>
+        <w:t xml:space="preserve"> </w:t>
+      </w:r>
+      <w:r>
+        <w:t xml:space="preserve">hat jedes Gebäude unter „Your buildings” eigene Symbole:</w:t>
+      </w:r>
+      <w:r>
+        <w:t xml:space="preserve"> </w:t>
+      </w:r>
+      <w:r>
+        <w:t xml:space="preserve">Bearbeiten, Dateien verwalten, Energie-Jahr erfassen, Teilen, Herunterladen und</w:t>
+      </w:r>
+      <w:r>
+        <w:t xml:space="preserve"> </w:t>
+      </w:r>
+      <w:r>
+        <w:t xml:space="preserve">Löschen (siehe Abschnitt „Gebäude bearbeiten, Dateien verwalten und löschen”).</w:t>
       </w:r>
     </w:p>
     <w:p>
@@ -5882,33 +6172,17 @@
         <w:pStyle w:val="Compact"/>
         <w:numPr>
           <w:ilvl w:val="0"/>
-          <w:numId w:val="1014"/>
+          <w:numId w:val="1015"/>
         </w:numPr>
       </w:pPr>
       <w:r>
-        <w:t xml:space="preserve">Wechseln Sie im Tab</w:t>
-      </w:r>
-      <w:r>
-        <w:t xml:space="preserve"> </w:t>
-      </w:r>
-      <w:r>
-        <w:rPr>
-          <w:b/>
-          <w:bCs/>
-        </w:rPr>
-        <w:t xml:space="preserve">Manage</w:t>
-      </w:r>
-      <w:r>
-        <w:t xml:space="preserve"> </w:t>
-      </w:r>
-      <w:r>
-        <w:t xml:space="preserve">zum Abschnitt „Aggregated views” und klicken</w:t>
-      </w:r>
-      <w:r>
-        <w:t xml:space="preserve"> </w:t>
-      </w:r>
-      <w:r>
-        <w:t xml:space="preserve">Sie auf „Create View”.</w:t>
+        <w:t xml:space="preserve">Klicken Sie beim gewünschten Gebäude auf das Teilen-Symbol. Der Dialog „Share</w:t>
+      </w:r>
+      <w:r>
+        <w:t xml:space="preserve"> </w:t>
+      </w:r>
+      <w:r>
+        <w:t xml:space="preserve">Building Data” öffnet sich.</w:t>
       </w:r>
     </w:p>
     <w:p>
@@ -5916,17 +6190,55 @@
         <w:pStyle w:val="Compact"/>
         <w:numPr>
           <w:ilvl w:val="0"/>
-          <w:numId w:val="1014"/>
+          <w:numId w:val="1015"/>
         </w:numPr>
       </w:pPr>
       <w:r>
-        <w:t xml:space="preserve">Geben Sie einen Namen ein, wählen Sie die zu aggregierenden Gebäude und</w:t>
-      </w:r>
-      <w:r>
-        <w:t xml:space="preserve"> </w:t>
-      </w:r>
-      <w:r>
-        <w:t xml:space="preserve">Kennzahlen sowie die Aggregatsfunktion und erstellen Sie die Ansicht.</w:t>
+        <w:t xml:space="preserve">Wählen Sie, an wen geteilt wird:</w:t>
+      </w:r>
+      <w:r>
+        <w:t xml:space="preserve"> </w:t>
+      </w:r>
+      <w:r>
+        <w:rPr>
+          <w:b/>
+          <w:bCs/>
+        </w:rPr>
+        <w:t xml:space="preserve">By WebID</w:t>
+      </w:r>
+      <w:r>
+        <w:t xml:space="preserve"> </w:t>
+      </w:r>
+      <w:r>
+        <w:t xml:space="preserve">(eine oder mehrere WebIDs</w:t>
+      </w:r>
+      <w:r>
+        <w:t xml:space="preserve"> </w:t>
+      </w:r>
+      <w:r>
+        <w:t xml:space="preserve">eingeben) oder</w:t>
+      </w:r>
+      <w:r>
+        <w:t xml:space="preserve"> </w:t>
+      </w:r>
+      <w:r>
+        <w:rPr>
+          <w:b/>
+          <w:bCs/>
+        </w:rPr>
+        <w:t xml:space="preserve">By role</w:t>
+      </w:r>
+      <w:r>
+        <w:t xml:space="preserve"> </w:t>
+      </w:r>
+      <w:r>
+        <w:t xml:space="preserve">(eine Rolle wählen – geteilt wird mit allen</w:t>
+      </w:r>
+      <w:r>
+        <w:t xml:space="preserve"> </w:t>
+      </w:r>
+      <w:r>
+        <w:t xml:space="preserve">Raum-Mitgliedern, die diese Rolle haben).</w:t>
       </w:r>
     </w:p>
     <w:p>
@@ -5934,17 +6246,36 @@
         <w:pStyle w:val="Compact"/>
         <w:numPr>
           <w:ilvl w:val="0"/>
-          <w:numId w:val="1014"/>
+          <w:numId w:val="1015"/>
         </w:numPr>
       </w:pPr>
       <w:r>
-        <w:t xml:space="preserve">Teilen Sie die fertige Ansicht über das Teilen-Symbol mit der WebID des</w:t>
-      </w:r>
-      <w:r>
-        <w:t xml:space="preserve"> </w:t>
-      </w:r>
-      <w:r>
-        <w:t xml:space="preserve">Empfängers.</w:t>
+        <w:t xml:space="preserve">Wählen Sie unter „What to share” den Freigabeumfang – nur Stammdaten, Stammdaten</w:t>
+      </w:r>
+      <w:r>
+        <w:t xml:space="preserve"> </w:t>
+      </w:r>
+      <w:r>
+        <w:t xml:space="preserve">mit allen Energiejahren oder Stammdaten mit ausgewählten Jahren (siehe Abschnitt</w:t>
+      </w:r>
+      <w:r>
+        <w:t xml:space="preserve"> </w:t>
+      </w:r>
+      <w:r>
+        <w:t xml:space="preserve">„Individuelle Gebäudedaten teilen”) – und bestätigen Sie mit</w:t>
+      </w:r>
+      <w:r>
+        <w:t xml:space="preserve"> </w:t>
+      </w:r>
+      <w:r>
+        <w:rPr>
+          <w:b/>
+          <w:bCs/>
+        </w:rPr>
+        <w:t xml:space="preserve">Share</w:t>
+      </w:r>
+      <w:r>
+        <w:t xml:space="preserve">.</w:t>
       </w:r>
     </w:p>
     <w:p>
@@ -5954,20 +6285,208 @@
       <w:r>
         <w:drawing>
           <wp:inline>
-            <wp:extent cx="4267200" cy="3200400"/>
+            <wp:extent cx="5334000" cy="4000499"/>
             <wp:effectExtent b="0" l="0" r="0" t="0"/>
-            <wp:docPr descr="Dialog zur Erstellung aggregierter Ansichten" title="" id="90" name="Picture"/>
+            <wp:docPr descr="Tab „Manage”: ein Gebäude mit seinen Symbolen zum Teilen, Bearbeiten und Verwalten" title="" id="90" name="Picture"/>
             <a:graphic>
               <a:graphicData uri="http://schemas.openxmlformats.org/drawingml/2006/picture">
                 <pic:pic>
                   <pic:nvPicPr>
-                    <pic:cNvPr descr="figures/create-view.png" id="91" name="Picture"/>
+                    <pic:cNvPr descr="figures/share-building.png" id="91" name="Picture"/>
                     <pic:cNvPicPr>
                       <a:picLocks noChangeArrowheads="1" noChangeAspect="1"/>
                     </pic:cNvPicPr>
                   </pic:nvPicPr>
                   <pic:blipFill>
                     <a:blip r:embed="rId89"/>
+                    <a:stretch>
+                      <a:fillRect/>
+                    </a:stretch>
+                  </pic:blipFill>
+                  <pic:spPr bwMode="auto">
+                    <a:xfrm>
+                      <a:off x="0" y="0"/>
+                      <a:ext cx="5334000" cy="4000499"/>
+                    </a:xfrm>
+                    <a:prstGeom prst="rect">
+                      <a:avLst/>
+                    </a:prstGeom>
+                    <a:noFill/>
+                    <a:ln w="9525">
+                      <a:noFill/>
+                      <a:headEnd/>
+                      <a:tailEnd/>
+                    </a:ln>
+                  </pic:spPr>
+                </pic:pic>
+              </a:graphicData>
+            </a:graphic>
+          </wp:inline>
+        </w:drawing>
+      </w:r>
+    </w:p>
+    <w:p>
+      <w:pPr>
+        <w:pStyle w:val="ImageCaption"/>
+      </w:pPr>
+      <w:r>
+        <w:t xml:space="preserve">Tab „Manage”: ein Gebäude mit seinen Symbolen zum Teilen, Bearbeiten und Verwalten</w:t>
+      </w:r>
+    </w:p>
+    <w:p>
+      <w:pPr>
+        <w:pStyle w:val="BlockText"/>
+      </w:pPr>
+      <w:r>
+        <w:rPr>
+          <w:b/>
+          <w:bCs/>
+        </w:rPr>
+        <w:t xml:space="preserve">Technische Details (für Administratoren)</w:t>
+      </w:r>
+    </w:p>
+    <w:p>
+      <w:pPr>
+        <w:pStyle w:val="BlockText"/>
+      </w:pPr>
+      <w:r>
+        <w:t xml:space="preserve">Im Hintergrund setzt Granergize die ACL-Berechtigung für die Gebäudedatei</w:t>
+      </w:r>
+      <w:r>
+        <w:t xml:space="preserve"> </w:t>
+      </w:r>
+      <w:r>
+        <w:t xml:space="preserve">(und, falls Energiedaten geteilt werden, für die betreffenden Energiedateien),</w:t>
+      </w:r>
+      <w:r>
+        <w:t xml:space="preserve"> </w:t>
+      </w:r>
+      <w:r>
+        <w:t xml:space="preserve">sendet eine Access-Grant-Benachrichtigung an den Posteingang (</w:t>
+      </w:r>
+      <w:r>
+        <w:rPr>
+          <w:rStyle w:val="VerbatimChar"/>
+        </w:rPr>
+        <w:t xml:space="preserve">inbox/</w:t>
+      </w:r>
+      <w:r>
+        <w:t xml:space="preserve">) des</w:t>
+      </w:r>
+      <w:r>
+        <w:t xml:space="preserve"> </w:t>
+      </w:r>
+      <w:r>
+        <w:t xml:space="preserve">Empfängers und vermerkt die Freigabe im eigenen Pod. Der Empfänger verarbeitet</w:t>
+      </w:r>
+      <w:r>
+        <w:t xml:space="preserve"> </w:t>
+      </w:r>
+      <w:r>
+        <w:t xml:space="preserve">die Benachrichtigung und sieht anschließend die geteilten Daten.</w:t>
+      </w:r>
+    </w:p>
+    <w:bookmarkEnd w:id="92"/>
+    <w:bookmarkStart w:id="96" w:name="aggregierte-ansicht-erstellen-und-teilen"/>
+    <w:p>
+      <w:pPr>
+        <w:pStyle w:val="Heading3"/>
+      </w:pPr>
+      <w:r>
+        <w:t xml:space="preserve">Aggregierte Ansicht erstellen und teilen</w:t>
+      </w:r>
+    </w:p>
+    <w:p>
+      <w:pPr>
+        <w:pStyle w:val="Compact"/>
+        <w:numPr>
+          <w:ilvl w:val="0"/>
+          <w:numId w:val="1016"/>
+        </w:numPr>
+      </w:pPr>
+      <w:r>
+        <w:t xml:space="preserve">Wechseln Sie im Tab</w:t>
+      </w:r>
+      <w:r>
+        <w:t xml:space="preserve"> </w:t>
+      </w:r>
+      <w:r>
+        <w:rPr>
+          <w:b/>
+          <w:bCs/>
+        </w:rPr>
+        <w:t xml:space="preserve">Manage</w:t>
+      </w:r>
+      <w:r>
+        <w:t xml:space="preserve"> </w:t>
+      </w:r>
+      <w:r>
+        <w:t xml:space="preserve">zum Abschnitt „Aggregated views” und klicken</w:t>
+      </w:r>
+      <w:r>
+        <w:t xml:space="preserve"> </w:t>
+      </w:r>
+      <w:r>
+        <w:t xml:space="preserve">Sie auf „Create View”.</w:t>
+      </w:r>
+    </w:p>
+    <w:p>
+      <w:pPr>
+        <w:pStyle w:val="Compact"/>
+        <w:numPr>
+          <w:ilvl w:val="0"/>
+          <w:numId w:val="1016"/>
+        </w:numPr>
+      </w:pPr>
+      <w:r>
+        <w:t xml:space="preserve">Geben Sie einen Namen ein, wählen Sie die zu aggregierenden Gebäude und</w:t>
+      </w:r>
+      <w:r>
+        <w:t xml:space="preserve"> </w:t>
+      </w:r>
+      <w:r>
+        <w:t xml:space="preserve">Kennzahlen sowie die Aggregatsfunktion und erstellen Sie die Ansicht.</w:t>
+      </w:r>
+    </w:p>
+    <w:p>
+      <w:pPr>
+        <w:pStyle w:val="Compact"/>
+        <w:numPr>
+          <w:ilvl w:val="0"/>
+          <w:numId w:val="1016"/>
+        </w:numPr>
+      </w:pPr>
+      <w:r>
+        <w:t xml:space="preserve">Teilen Sie die fertige Ansicht über das Teilen-Symbol mit der WebID des</w:t>
+      </w:r>
+      <w:r>
+        <w:t xml:space="preserve"> </w:t>
+      </w:r>
+      <w:r>
+        <w:t xml:space="preserve">Empfängers.</w:t>
+      </w:r>
+    </w:p>
+    <w:p>
+      <w:pPr>
+        <w:pStyle w:val="CaptionedFigure"/>
+      </w:pPr>
+      <w:r>
+        <w:drawing>
+          <wp:inline>
+            <wp:extent cx="4267200" cy="3200400"/>
+            <wp:effectExtent b="0" l="0" r="0" t="0"/>
+            <wp:docPr descr="Dialog zur Erstellung aggregierter Ansichten" title="" id="94" name="Picture"/>
+            <a:graphic>
+              <a:graphicData uri="http://schemas.openxmlformats.org/drawingml/2006/picture">
+                <pic:pic>
+                  <pic:nvPicPr>
+                    <pic:cNvPr descr="figures/create-view.png" id="95" name="Picture"/>
+                    <pic:cNvPicPr>
+                      <a:picLocks noChangeArrowheads="1" noChangeAspect="1"/>
+                    </pic:cNvPicPr>
+                  </pic:nvPicPr>
+                  <pic:blipFill>
+                    <a:blip r:embed="rId93"/>
                     <a:stretch>
                       <a:fillRect/>
                     </a:stretch>
@@ -6040,8 +6559,8 @@
         <w:t xml:space="preserve">sodass die Einzelgebäude nicht offengelegt werden.</w:t>
       </w:r>
     </w:p>
-    <w:bookmarkEnd w:id="92"/>
-    <w:bookmarkStart w:id="96" w:name="mit-ihnen-geteilte-daten"/>
+    <w:bookmarkEnd w:id="96"/>
+    <w:bookmarkStart w:id="100" w:name="mit-ihnen-geteilte-daten"/>
     <w:p>
       <w:pPr>
         <w:pStyle w:val="Heading3"/>
@@ -6114,18 +6633,18 @@
           <wp:inline>
             <wp:extent cx="5334000" cy="4000499"/>
             <wp:effectExtent b="0" l="0" r="0" t="0"/>
-            <wp:docPr descr="Tab „Share”: mit Ihnen geteilte Gebäude unter „Buildings shared with you”" title="" id="94" name="Picture"/>
+            <wp:docPr descr="Tab „Share”: mit Ihnen geteilte Gebäude unter „Buildings shared with you”" title="" id="98" name="Picture"/>
             <a:graphic>
               <a:graphicData uri="http://schemas.openxmlformats.org/drawingml/2006/picture">
                 <pic:pic>
                   <pic:nvPicPr>
-                    <pic:cNvPr descr="figures/shared-with-you.png" id="95" name="Picture"/>
+                    <pic:cNvPr descr="figures/shared-with-you.png" id="99" name="Picture"/>
                     <pic:cNvPicPr>
                       <a:picLocks noChangeArrowheads="1" noChangeAspect="1"/>
                     </pic:cNvPicPr>
                   </pic:nvPicPr>
                   <pic:blipFill>
-                    <a:blip r:embed="rId93"/>
+                    <a:blip r:embed="rId97"/>
                     <a:stretch>
                       <a:fillRect/>
                     </a:stretch>
@@ -6186,8 +6705,8 @@
         <w:t xml:space="preserve">unberührt.</w:t>
       </w:r>
     </w:p>
-    <w:bookmarkEnd w:id="96"/>
-    <w:bookmarkStart w:id="97" w:name="zugriff-widerrufen"/>
+    <w:bookmarkEnd w:id="100"/>
+    <w:bookmarkStart w:id="101" w:name="zugriff-widerrufen"/>
     <w:p>
       <w:pPr>
         <w:pStyle w:val="Heading3"/>
@@ -6272,10 +6791,10 @@
         <w:t xml:space="preserve">Empfänger keine Benachrichtigung – dies ist nun behoben.)</w:t>
       </w:r>
     </w:p>
-    <w:bookmarkEnd w:id="97"/>
-    <w:bookmarkEnd w:id="98"/>
-    <w:bookmarkEnd w:id="99"/>
-    <w:bookmarkStart w:id="100" w:name="was-steckt-hinter-granergize"/>
+    <w:bookmarkEnd w:id="101"/>
+    <w:bookmarkEnd w:id="102"/>
+    <w:bookmarkEnd w:id="103"/>
+    <w:bookmarkStart w:id="104" w:name="was-steckt-hinter-granergize"/>
     <w:p>
       <w:pPr>
         <w:pStyle w:val="Heading1"/>
@@ -6423,8 +6942,8 @@
         <w:t xml:space="preserve">Logistikimmobilienökosystem.</w:t>
       </w:r>
     </w:p>
-    <w:bookmarkEnd w:id="100"/>
-    <w:bookmarkStart w:id="102" w:name="literaturverzeichnis"/>
+    <w:bookmarkEnd w:id="104"/>
+    <w:bookmarkStart w:id="106" w:name="literaturverzeichnis"/>
     <w:p>
       <w:pPr>
         <w:pStyle w:val="Heading1"/>
@@ -6555,7 +7074,7 @@
       <w:r>
         <w:t xml:space="preserve"> </w:t>
       </w:r>
-      <w:hyperlink r:id="rId101">
+      <w:hyperlink r:id="rId105">
         <w:r>
           <w:rPr>
             <w:rStyle w:val="Hyperlink"/>
@@ -6564,7 +7083,7 @@
         </w:r>
       </w:hyperlink>
     </w:p>
-    <w:bookmarkEnd w:id="102"/>
+    <w:bookmarkEnd w:id="106"/>
     <w:sectPr/>
   </w:body>
 </w:document>
@@ -6953,6 +7472,12 @@
     <w:abstractNumId w:val="991"/>
   </w:num>
   <w:num w:numId="1013">
+    <w:abstractNumId w:val="991"/>
+  </w:num>
+  <w:num w:numId="1014">
+    <w:abstractNumId w:val="991"/>
+  </w:num>
+  <w:num w:numId="1015">
     <w:abstractNumId w:val="99411"/>
     <w:lvlOverride w:ilvl="0">
       <w:startOverride w:val="1"/>
@@ -6982,7 +7507,7 @@
       <w:startOverride w:val="1"/>
     </w:lvlOverride>
   </w:num>
-  <w:num w:numId="1014">
+  <w:num w:numId="1016">
     <w:abstractNumId w:val="99411"/>
     <w:lvlOverride w:ilvl="0">
       <w:startOverride w:val="1"/>

</xml_diff>

<commit_message>
sharing scenarios in handbuch
</commit_message>
<xml_diff>
--- a/public/granergize-handbuch.docx
+++ b/public/granergize-handbuch.docx
@@ -199,7 +199,7 @@
         <w:pStyle w:val="Date"/>
       </w:pPr>
       <w:r>
-        <w:t xml:space="preserve">Juni 2026 · Version 0092eb6+</w:t>
+        <w:t xml:space="preserve">Juni 2026 · Version d46bdb1+</w:t>
       </w:r>
     </w:p>
     <w:sdt>
@@ -662,6 +662,32 @@
         <w:t xml:space="preserve">Praxisbeispiele: Use Cases für die Anwendung</w:t>
       </w:r>
     </w:p>
+    <w:p>
+      <w:pPr>
+        <w:pStyle w:val="FirstParagraph"/>
+      </w:pPr>
+      <w:r>
+        <w:t xml:space="preserve">Drei Anwendungsfälle haben die Entwicklung der Granergize-App geleitet. Jeder</w:t>
+      </w:r>
+      <w:r>
+        <w:t xml:space="preserve"> </w:t>
+      </w:r>
+      <w:r>
+        <w:t xml:space="preserve">wird hier zunächst fachlich beschrieben; wo die App ihn einlöst, nennt der</w:t>
+      </w:r>
+      <w:r>
+        <w:t xml:space="preserve"> </w:t>
+      </w:r>
+      <w:r>
+        <w:t xml:space="preserve">jeweilige Abschnitt – und die betreffenden Stellen im praktischen Teil dieses</w:t>
+      </w:r>
+      <w:r>
+        <w:t xml:space="preserve"> </w:t>
+      </w:r>
+      <w:r>
+        <w:t xml:space="preserve">Handbuchs greifen den Anwendungsfall namentlich wieder auf.</w:t>
+      </w:r>
+    </w:p>
     <w:bookmarkStart w:id="23" w:name="energieverbrauchsbenchmark"/>
     <w:p>
       <w:pPr>
@@ -743,6 +769,62 @@
       </w:r>
       <w:r>
         <w:t xml:space="preserve">Bestandshalter, Facility Manager und spezialisierte Benchmarking-Anbieter.</w:t>
+      </w:r>
+    </w:p>
+    <w:p>
+      <w:pPr>
+        <w:pStyle w:val="BodyText"/>
+      </w:pPr>
+      <w:r>
+        <w:t xml:space="preserve">Die Granergize-App löst diesen Anwendungsfall auf zwei Ebenen ein: Innerhalb</w:t>
+      </w:r>
+      <w:r>
+        <w:t xml:space="preserve"> </w:t>
+      </w:r>
+      <w:r>
+        <w:t xml:space="preserve">des eigenen Bestands stellt die Energie-Detailseite jeden Verbrauchswert dem</w:t>
+      </w:r>
+      <w:r>
+        <w:t xml:space="preserve"> </w:t>
+      </w:r>
+      <w:r>
+        <w:t xml:space="preserve">Portfolio- und dem Betreiber-Durchschnitt gegenüber (siehe Abschnitt</w:t>
+      </w:r>
+      <w:r>
+        <w:t xml:space="preserve"> </w:t>
+      </w:r>
+      <w:r>
+        <w:t xml:space="preserve">„Energie-Detailseite eines Gebäudes”). Über den eigenen Bestand hinaus kommt</w:t>
+      </w:r>
+      <w:r>
+        <w:t xml:space="preserve"> </w:t>
+      </w:r>
+      <w:r>
+        <w:t xml:space="preserve">der Vergleichswert von einem Benchmark-Dienstleister – in der App die Rolle</w:t>
+      </w:r>
+      <w:r>
+        <w:t xml:space="preserve"> </w:t>
+      </w:r>
+      <w:r>
+        <w:t xml:space="preserve">„Benchmark Service Provider” –, der über die Gebäude mehrerer Eigentümer</w:t>
+      </w:r>
+      <w:r>
+        <w:t xml:space="preserve"> </w:t>
+      </w:r>
+      <w:r>
+        <w:t xml:space="preserve">aggregiert; das vollständige Zusammenspiel beschreibt das Szenario</w:t>
+      </w:r>
+      <w:r>
+        <w:t xml:space="preserve"> </w:t>
+      </w:r>
+      <w:r>
+        <w:t xml:space="preserve">„Peer-Benchmarking” am Ende des Kapitels „Daten gemeinsam nutzen und Mehrwerte</w:t>
+      </w:r>
+      <w:r>
+        <w:t xml:space="preserve"> </w:t>
+      </w:r>
+      <w:r>
+        <w:t xml:space="preserve">schaffen”.</w:t>
       </w:r>
     </w:p>
     <w:bookmarkEnd w:id="23"/>
@@ -955,6 +1037,38 @@
       </w:r>
       <w:r>
         <w:t xml:space="preserve">aggregierte Verbrauchsdaten sowie allgemeine Objektdaten benötigt.</w:t>
+      </w:r>
+    </w:p>
+    <w:p>
+      <w:pPr>
+        <w:pStyle w:val="BodyText"/>
+      </w:pPr>
+      <w:r>
+        <w:t xml:space="preserve">In der Granergize-App übernimmt das die Energie-Linse der Karte: Sie färbt die</w:t>
+      </w:r>
+      <w:r>
+        <w:t xml:space="preserve"> </w:t>
+      </w:r>
+      <w:r>
+        <w:t xml:space="preserve">Gebäude-Marker nach Energieintensität ein und ordnet ein Objekt so auf einen</w:t>
+      </w:r>
+      <w:r>
+        <w:t xml:space="preserve"> </w:t>
+      </w:r>
+      <w:r>
+        <w:t xml:space="preserve">Blick in sein sichtbares Umfeld ein – einschließlich der Gebäude, die andere</w:t>
+      </w:r>
+      <w:r>
+        <w:t xml:space="preserve"> </w:t>
+      </w:r>
+      <w:r>
+        <w:t xml:space="preserve">mit Ihnen geteilt haben (siehe Abschnitt „Gebäude nach Energieverbrauch</w:t>
+      </w:r>
+      <w:r>
+        <w:t xml:space="preserve"> </w:t>
+      </w:r>
+      <w:r>
+        <w:t xml:space="preserve">einordnen”).</w:t>
       </w:r>
     </w:p>
     <w:bookmarkEnd w:id="25"/>
@@ -5170,7 +5284,7 @@
       <w:r>
         <w:drawing>
           <wp:inline>
-            <wp:extent cx="5334000" cy="153329"/>
+            <wp:extent cx="5334000" cy="408878"/>
             <wp:effectExtent b="0" l="0" r="0" t="0"/>
             <wp:docPr descr="Aktionen je Gebäude im Tab „Manage”: bearbeiten, Dateien, Energiejahr, teilen, herunterladen, löschen" title="" id="62" name="Picture"/>
             <a:graphic>
@@ -5191,7 +5305,7 @@
                   <pic:spPr bwMode="auto">
                     <a:xfrm>
                       <a:off x="0" y="0"/>
-                      <a:ext cx="5334000" cy="153329"/>
+                      <a:ext cx="5334000" cy="408878"/>
                     </a:xfrm>
                     <a:prstGeom prst="rect">
                       <a:avLst/>
@@ -5947,6 +6061,62 @@
       <w:r>
         <w:t xml:space="preserve">Zeitreihen-Diagramme: Tagessummen und ein durchschnittliches Tagesprofil.</w:t>
       </w:r>
+      <w:r>
+        <w:t xml:space="preserve"> </w:t>
+      </w:r>
+      <w:r>
+        <w:t xml:space="preserve">Trägt ein Gebäude</w:t>
+      </w:r>
+      <w:r>
+        <w:t xml:space="preserve"> </w:t>
+      </w:r>
+      <w:r>
+        <w:rPr>
+          <w:b/>
+          <w:bCs/>
+        </w:rPr>
+        <w:t xml:space="preserve">beides</w:t>
+      </w:r>
+      <w:r>
+        <w:t xml:space="preserve"> </w:t>
+      </w:r>
+      <w:r>
+        <w:t xml:space="preserve">– Jahreswerte und Messreihe –, schalten Sie über</w:t>
+      </w:r>
+      <w:r>
+        <w:t xml:space="preserve"> </w:t>
+      </w:r>
+      <w:r>
+        <w:t xml:space="preserve">den Umschalter</w:t>
+      </w:r>
+      <w:r>
+        <w:t xml:space="preserve"> </w:t>
+      </w:r>
+      <w:r>
+        <w:rPr>
+          <w:b/>
+          <w:bCs/>
+        </w:rPr>
+        <w:t xml:space="preserve">Annual | Time series</w:t>
+      </w:r>
+      <w:r>
+        <w:t xml:space="preserve"> </w:t>
+      </w:r>
+      <w:r>
+        <w:t xml:space="preserve">zwischen den Darstellungen um (so</w:t>
+      </w:r>
+    </w:p>
+    <w:p>
+      <w:pPr>
+        <w:pStyle w:val="Compact"/>
+        <w:numPr>
+          <w:ilvl w:val="1"/>
+          <w:numId w:val="1012"/>
+        </w:numPr>
+      </w:pPr>
+      <w:r>
+        <w:t xml:space="preserve">B. beim Beispielgebäude Lange Gasse 20).</w:t>
+      </w:r>
     </w:p>
     <w:p>
       <w:pPr>
@@ -6167,7 +6337,7 @@
         <w:pStyle w:val="Compact"/>
         <w:numPr>
           <w:ilvl w:val="0"/>
-          <w:numId w:val="1012"/>
+          <w:numId w:val="1013"/>
         </w:numPr>
       </w:pPr>
       <w:r>
@@ -6189,7 +6359,7 @@
         <w:pStyle w:val="Compact"/>
         <w:numPr>
           <w:ilvl w:val="0"/>
-          <w:numId w:val="1012"/>
+          <w:numId w:val="1013"/>
         </w:numPr>
       </w:pPr>
       <w:r>
@@ -6217,7 +6387,7 @@
         <w:pStyle w:val="Compact"/>
         <w:numPr>
           <w:ilvl w:val="0"/>
-          <w:numId w:val="1012"/>
+          <w:numId w:val="1013"/>
         </w:numPr>
       </w:pPr>
       <w:r>
@@ -6288,7 +6458,25 @@
         <w:t xml:space="preserve"> </w:t>
       </w:r>
       <w:r>
-        <w:t xml:space="preserve">Betreiber, externer Benchmark – in einer Ansicht.</w:t>
+        <w:t xml:space="preserve">Betreiber, externer Benchmark – in einer Ansicht: Hier löst die App den</w:t>
+      </w:r>
+      <w:r>
+        <w:t xml:space="preserve"> </w:t>
+      </w:r>
+      <w:r>
+        <w:t xml:space="preserve">eingangs beschriebenen Anwendungsfall „Energieverbrauchsbenchmark” für das</w:t>
+      </w:r>
+      <w:r>
+        <w:t xml:space="preserve"> </w:t>
+      </w:r>
+      <w:r>
+        <w:t xml:space="preserve">einzelne Gebäude ein. Woher der externe Benchmark kommt, zeigt das Szenario</w:t>
+      </w:r>
+      <w:r>
+        <w:t xml:space="preserve"> </w:t>
+      </w:r>
+      <w:r>
+        <w:t xml:space="preserve">„Peer-Benchmarking” im Kapitel „Daten gemeinsam nutzen und Mehrwerte schaffen”.</w:t>
       </w:r>
     </w:p>
     <w:p>
@@ -6405,7 +6593,7 @@
         <w:pStyle w:val="Compact"/>
         <w:numPr>
           <w:ilvl w:val="0"/>
-          <w:numId w:val="1013"/>
+          <w:numId w:val="1014"/>
         </w:numPr>
       </w:pPr>
       <w:r>
@@ -6459,7 +6647,7 @@
         <w:pStyle w:val="Compact"/>
         <w:numPr>
           <w:ilvl w:val="0"/>
-          <w:numId w:val="1013"/>
+          <w:numId w:val="1014"/>
         </w:numPr>
       </w:pPr>
       <w:r>
@@ -6721,7 +6909,7 @@
     </w:p>
     <w:bookmarkEnd w:id="83"/>
     <w:bookmarkEnd w:id="84"/>
-    <w:bookmarkStart w:id="117" w:name="X7d72782c915f60697958dd391a69efa388f028d"/>
+    <w:bookmarkStart w:id="129" w:name="X7d72782c915f60697958dd391a69efa388f028d"/>
     <w:p>
       <w:pPr>
         <w:pStyle w:val="Heading1"/>
@@ -6854,7 +7042,7 @@
         <w:pStyle w:val="Compact"/>
         <w:numPr>
           <w:ilvl w:val="0"/>
-          <w:numId w:val="1014"/>
+          <w:numId w:val="1015"/>
         </w:numPr>
       </w:pPr>
       <w:r>
@@ -6887,196 +7075,6 @@
       </w:r>
       <w:r>
         <w:t xml:space="preserve">welche Gebäude Sie verwalten, ohne sofort sensible Verbrauchsdaten preiszugeben.</w:t>
-      </w:r>
-    </w:p>
-    <w:p>
-      <w:pPr>
-        <w:pStyle w:val="Compact"/>
-        <w:numPr>
-          <w:ilvl w:val="0"/>
-          <w:numId w:val="1014"/>
-        </w:numPr>
-      </w:pPr>
-      <w:r>
-        <w:rPr>
-          <w:b/>
-          <w:bCs/>
-        </w:rPr>
-        <w:t xml:space="preserve">Static building data and all energy readings</w:t>
-      </w:r>
-      <w:r>
-        <w:t xml:space="preserve"> </w:t>
-      </w:r>
-      <w:r>
-        <w:t xml:space="preserve">– zusätzlich die</w:t>
-      </w:r>
-      <w:r>
-        <w:t xml:space="preserve"> </w:t>
-      </w:r>
-      <w:r>
-        <w:t xml:space="preserve">Verbrauchswerte (Strom, Gas, Fernwärme, Wasser)</w:t>
-      </w:r>
-      <w:r>
-        <w:t xml:space="preserve"> </w:t>
-      </w:r>
-      <w:r>
-        <w:rPr>
-          <w:b/>
-          <w:bCs/>
-        </w:rPr>
-        <w:t xml:space="preserve">aller</w:t>
-      </w:r>
-      <w:r>
-        <w:t xml:space="preserve"> </w:t>
-      </w:r>
-      <w:r>
-        <w:t xml:space="preserve">Jahre. Diese</w:t>
-      </w:r>
-      <w:r>
-        <w:t xml:space="preserve"> </w:t>
-      </w:r>
-      <w:r>
-        <w:t xml:space="preserve">Freigabe umfasst auch Jahre, die Sie erst</w:t>
-      </w:r>
-      <w:r>
-        <w:t xml:space="preserve"> </w:t>
-      </w:r>
-      <w:r>
-        <w:rPr>
-          <w:b/>
-          <w:bCs/>
-        </w:rPr>
-        <w:t xml:space="preserve">nach</w:t>
-      </w:r>
-      <w:r>
-        <w:t xml:space="preserve"> </w:t>
-      </w:r>
-      <w:r>
-        <w:t xml:space="preserve">dem Teilen erfassen: Ein</w:t>
-      </w:r>
-      <w:r>
-        <w:t xml:space="preserve"> </w:t>
-      </w:r>
-      <w:r>
-        <w:t xml:space="preserve">neu gespeichertes Energiejahr wird automatisch mit freigegeben, ohne dass</w:t>
-      </w:r>
-      <w:r>
-        <w:t xml:space="preserve"> </w:t>
-      </w:r>
-      <w:r>
-        <w:t xml:space="preserve">Sie das Gebäude erneut teilen müssen.</w:t>
-      </w:r>
-    </w:p>
-    <w:p>
-      <w:pPr>
-        <w:pStyle w:val="Compact"/>
-        <w:numPr>
-          <w:ilvl w:val="0"/>
-          <w:numId w:val="1014"/>
-        </w:numPr>
-      </w:pPr>
-      <w:r>
-        <w:rPr>
-          <w:b/>
-          <w:bCs/>
-        </w:rPr>
-        <w:t xml:space="preserve">Static building data and energy for specific year(s)</w:t>
-      </w:r>
-      <w:r>
-        <w:t xml:space="preserve"> </w:t>
-      </w:r>
-      <w:r>
-        <w:t xml:space="preserve">– nur die</w:t>
-      </w:r>
-      <w:r>
-        <w:t xml:space="preserve"> </w:t>
-      </w:r>
-      <w:r>
-        <w:t xml:space="preserve">Verbrauchsdaten der von Ihnen angekreuzten Jahre. Da jedes Jahr als eigene</w:t>
-      </w:r>
-      <w:r>
-        <w:t xml:space="preserve"> </w:t>
-      </w:r>
-      <w:r>
-        <w:t xml:space="preserve">Ressource gespeichert ist, können Sie gezielt etwa nur den aktuellsten</w:t>
-      </w:r>
-      <w:r>
-        <w:t xml:space="preserve"> </w:t>
-      </w:r>
-      <w:r>
-        <w:t xml:space="preserve">Jahrgang freigeben und ältere zurückhalten; später ergänzte Jahre bleiben</w:t>
-      </w:r>
-      <w:r>
-        <w:t xml:space="preserve"> </w:t>
-      </w:r>
-      <w:r>
-        <w:t xml:space="preserve">bei dieser Variante außen vor.</w:t>
-      </w:r>
-    </w:p>
-    <w:bookmarkEnd w:id="88"/>
-    <w:bookmarkStart w:id="89" w:name="aggregierte-ansichten-teilen"/>
-    <w:p>
-      <w:pPr>
-        <w:pStyle w:val="Heading3"/>
-      </w:pPr>
-      <w:r>
-        <w:t xml:space="preserve">Aggregierte Ansichten teilen</w:t>
-      </w:r>
-    </w:p>
-    <w:p>
-      <w:pPr>
-        <w:pStyle w:val="FirstParagraph"/>
-      </w:pPr>
-      <w:r>
-        <w:t xml:space="preserve">Manchmal möchten Sie Informationen teilen, ohne dass der Empfänger Details über</w:t>
-      </w:r>
-      <w:r>
-        <w:t xml:space="preserve"> </w:t>
-      </w:r>
-      <w:r>
-        <w:t xml:space="preserve">einzelne Gebäude sieht. Zum Beispiel möchte ein Investor wissen, wie effizient</w:t>
-      </w:r>
-      <w:r>
-        <w:t xml:space="preserve"> </w:t>
-      </w:r>
-      <w:r>
-        <w:t xml:space="preserve">ein Gesamt-Portfolio ist, muss aber nicht wissen, welches spezifische Gebäude wie</w:t>
-      </w:r>
-      <w:r>
-        <w:t xml:space="preserve"> </w:t>
-      </w:r>
-      <w:r>
-        <w:t xml:space="preserve">viel verbraucht. Für solche Fälle bietet die Granergize-App</w:t>
-      </w:r>
-      <w:r>
-        <w:t xml:space="preserve"> </w:t>
-      </w:r>
-      <w:r>
-        <w:rPr>
-          <w:b/>
-          <w:bCs/>
-        </w:rPr>
-        <w:t xml:space="preserve">aggregierte Ansichten</w:t>
-      </w:r>
-      <w:r>
-        <w:t xml:space="preserve"> </w:t>
-      </w:r>
-      <w:r>
-        <w:t xml:space="preserve">(„Views”) an: eine Zusammenfassung mehrerer Gebäude. Was der Empfänger erhält,</w:t>
-      </w:r>
-      <w:r>
-        <w:t xml:space="preserve"> </w:t>
-      </w:r>
-      <w:r>
-        <w:t xml:space="preserve">ist nur diese Zusammenfassung – er sieht nicht, welche Gebäude dahinterstecken.</w:t>
-      </w:r>
-    </w:p>
-    <w:p>
-      <w:pPr>
-        <w:pStyle w:val="BodyText"/>
-      </w:pPr>
-      <w:r>
-        <w:t xml:space="preserve">Die App bietet vier Aggregationsfunktionen:</w:t>
       </w:r>
     </w:p>
     <w:p>
@@ -7092,13 +7090,69 @@
           <w:b/>
           <w:bCs/>
         </w:rPr>
-        <w:t xml:space="preserve">Durchschnitt (average):</w:t>
-      </w:r>
-      <w:r>
-        <w:t xml:space="preserve"> </w:t>
-      </w:r>
-      <w:r>
-        <w:t xml:space="preserve">Mittelwert über alle ausgewählten Gebäude.</w:t>
+        <w:t xml:space="preserve">Static building data and all energy readings</w:t>
+      </w:r>
+      <w:r>
+        <w:t xml:space="preserve"> </w:t>
+      </w:r>
+      <w:r>
+        <w:t xml:space="preserve">– zusätzlich die</w:t>
+      </w:r>
+      <w:r>
+        <w:t xml:space="preserve"> </w:t>
+      </w:r>
+      <w:r>
+        <w:t xml:space="preserve">Verbrauchswerte (Strom, Gas, Fernwärme, Wasser)</w:t>
+      </w:r>
+      <w:r>
+        <w:t xml:space="preserve"> </w:t>
+      </w:r>
+      <w:r>
+        <w:rPr>
+          <w:b/>
+          <w:bCs/>
+        </w:rPr>
+        <w:t xml:space="preserve">aller</w:t>
+      </w:r>
+      <w:r>
+        <w:t xml:space="preserve"> </w:t>
+      </w:r>
+      <w:r>
+        <w:t xml:space="preserve">Jahre. Diese</w:t>
+      </w:r>
+      <w:r>
+        <w:t xml:space="preserve"> </w:t>
+      </w:r>
+      <w:r>
+        <w:t xml:space="preserve">Freigabe umfasst auch Jahre, die Sie erst</w:t>
+      </w:r>
+      <w:r>
+        <w:t xml:space="preserve"> </w:t>
+      </w:r>
+      <w:r>
+        <w:rPr>
+          <w:b/>
+          <w:bCs/>
+        </w:rPr>
+        <w:t xml:space="preserve">nach</w:t>
+      </w:r>
+      <w:r>
+        <w:t xml:space="preserve"> </w:t>
+      </w:r>
+      <w:r>
+        <w:t xml:space="preserve">dem Teilen erfassen: Ein</w:t>
+      </w:r>
+      <w:r>
+        <w:t xml:space="preserve"> </w:t>
+      </w:r>
+      <w:r>
+        <w:t xml:space="preserve">neu gespeichertes Energiejahr wird automatisch mit freigegeben, ohne dass</w:t>
+      </w:r>
+      <w:r>
+        <w:t xml:space="preserve"> </w:t>
+      </w:r>
+      <w:r>
+        <w:t xml:space="preserve">Sie das Gebäude erneut teilen müssen.</w:t>
       </w:r>
     </w:p>
     <w:p>
@@ -7114,67 +7168,47 @@
           <w:b/>
           <w:bCs/>
         </w:rPr>
-        <w:t xml:space="preserve">Summe (sum):</w:t>
-      </w:r>
-      <w:r>
-        <w:t xml:space="preserve"> </w:t>
-      </w:r>
-      <w:r>
-        <w:t xml:space="preserve">addiert alle Werte.</w:t>
-      </w:r>
-    </w:p>
-    <w:p>
-      <w:pPr>
-        <w:pStyle w:val="Compact"/>
-        <w:numPr>
-          <w:ilvl w:val="0"/>
-          <w:numId w:val="1015"/>
-        </w:numPr>
-      </w:pPr>
-      <w:r>
-        <w:rPr>
-          <w:b/>
-          <w:bCs/>
-        </w:rPr>
-        <w:t xml:space="preserve">Minimum (minimum):</w:t>
-      </w:r>
-      <w:r>
-        <w:t xml:space="preserve"> </w:t>
-      </w:r>
-      <w:r>
-        <w:t xml:space="preserve">zeigt den niedrigsten Wert.</w:t>
-      </w:r>
-    </w:p>
-    <w:p>
-      <w:pPr>
-        <w:pStyle w:val="Compact"/>
-        <w:numPr>
-          <w:ilvl w:val="0"/>
-          <w:numId w:val="1015"/>
-        </w:numPr>
-      </w:pPr>
-      <w:r>
-        <w:rPr>
-          <w:b/>
-          <w:bCs/>
-        </w:rPr>
-        <w:t xml:space="preserve">Maximum (maximum):</w:t>
-      </w:r>
-      <w:r>
-        <w:t xml:space="preserve"> </w:t>
-      </w:r>
-      <w:r>
-        <w:t xml:space="preserve">zeigt den höchsten Wert.</w:t>
-      </w:r>
-    </w:p>
-    <w:bookmarkEnd w:id="89"/>
-    <w:bookmarkStart w:id="90" w:name="rollenbasierte-freigaben"/>
+        <w:t xml:space="preserve">Static building data and energy for specific year(s)</w:t>
+      </w:r>
+      <w:r>
+        <w:t xml:space="preserve"> </w:t>
+      </w:r>
+      <w:r>
+        <w:t xml:space="preserve">– nur die</w:t>
+      </w:r>
+      <w:r>
+        <w:t xml:space="preserve"> </w:t>
+      </w:r>
+      <w:r>
+        <w:t xml:space="preserve">Verbrauchsdaten der von Ihnen angekreuzten Jahre. Da jedes Jahr als eigene</w:t>
+      </w:r>
+      <w:r>
+        <w:t xml:space="preserve"> </w:t>
+      </w:r>
+      <w:r>
+        <w:t xml:space="preserve">Ressource gespeichert ist, können Sie gezielt etwa nur den aktuellsten</w:t>
+      </w:r>
+      <w:r>
+        <w:t xml:space="preserve"> </w:t>
+      </w:r>
+      <w:r>
+        <w:t xml:space="preserve">Jahrgang freigeben und ältere zurückhalten; später ergänzte Jahre bleiben</w:t>
+      </w:r>
+      <w:r>
+        <w:t xml:space="preserve"> </w:t>
+      </w:r>
+      <w:r>
+        <w:t xml:space="preserve">bei dieser Variante außen vor.</w:t>
+      </w:r>
+    </w:p>
+    <w:bookmarkEnd w:id="88"/>
+    <w:bookmarkStart w:id="89" w:name="aggregierte-ansichten-teilen"/>
     <w:p>
       <w:pPr>
         <w:pStyle w:val="Heading3"/>
       </w:pPr>
       <w:r>
-        <w:t xml:space="preserve">Rollenbasierte Freigaben</w:t>
+        <w:t xml:space="preserve">Aggregierte Ansichten teilen</w:t>
       </w:r>
     </w:p>
     <w:p>
@@ -7182,31 +7216,47 @@
         <w:pStyle w:val="FirstParagraph"/>
       </w:pPr>
       <w:r>
-        <w:t xml:space="preserve">In der Praxis haben unterschiedliche Partner unterschiedliche Bedürfnisse: Ein</w:t>
-      </w:r>
-      <w:r>
-        <w:t xml:space="preserve"> </w:t>
-      </w:r>
-      <w:r>
-        <w:t xml:space="preserve">Investor benötigt grobe Jahreszahlen, ein Energiemanager hingegen hochauflösende</w:t>
-      </w:r>
-      <w:r>
-        <w:t xml:space="preserve"> </w:t>
-      </w:r>
-      <w:r>
-        <w:t xml:space="preserve">15-Minuten-Intervalle. Mit der rollenbasierten Freigabe teilen Sie mit allen</w:t>
-      </w:r>
-      <w:r>
-        <w:t xml:space="preserve"> </w:t>
-      </w:r>
-      <w:r>
-        <w:t xml:space="preserve">Mitgliedern eines Datenraums, die eine bestimmte Rolle innehaben – die Auswahl</w:t>
-      </w:r>
-      <w:r>
-        <w:t xml:space="preserve"> </w:t>
-      </w:r>
-      <w:r>
-        <w:t xml:space="preserve">der Empfänger ergibt sich aus der Rolle.</w:t>
+        <w:t xml:space="preserve">Manchmal möchten Sie Informationen teilen, ohne dass der Empfänger Details über</w:t>
+      </w:r>
+      <w:r>
+        <w:t xml:space="preserve"> </w:t>
+      </w:r>
+      <w:r>
+        <w:t xml:space="preserve">einzelne Gebäude sieht. Zum Beispiel möchte ein Investor wissen, wie effizient</w:t>
+      </w:r>
+      <w:r>
+        <w:t xml:space="preserve"> </w:t>
+      </w:r>
+      <w:r>
+        <w:t xml:space="preserve">ein Gesamt-Portfolio ist, muss aber nicht wissen, welches spezifische Gebäude wie</w:t>
+      </w:r>
+      <w:r>
+        <w:t xml:space="preserve"> </w:t>
+      </w:r>
+      <w:r>
+        <w:t xml:space="preserve">viel verbraucht. Für solche Fälle bietet die Granergize-App</w:t>
+      </w:r>
+      <w:r>
+        <w:t xml:space="preserve"> </w:t>
+      </w:r>
+      <w:r>
+        <w:rPr>
+          <w:b/>
+          <w:bCs/>
+        </w:rPr>
+        <w:t xml:space="preserve">aggregierte Ansichten</w:t>
+      </w:r>
+      <w:r>
+        <w:t xml:space="preserve"> </w:t>
+      </w:r>
+      <w:r>
+        <w:t xml:space="preserve">(„Views”) an: eine Zusammenfassung mehrerer Gebäude. Was der Empfänger erhält,</w:t>
+      </w:r>
+      <w:r>
+        <w:t xml:space="preserve"> </w:t>
+      </w:r>
+      <w:r>
+        <w:t xml:space="preserve">ist nur diese Zusammenfassung – er sieht nicht, welche Gebäude dahinterstecken.</w:t>
       </w:r>
     </w:p>
     <w:p>
@@ -7214,13 +7264,7 @@
         <w:pStyle w:val="BodyText"/>
       </w:pPr>
       <w:r>
-        <w:t xml:space="preserve">Die Granergize-App kennt acht Rollen, die Sie sich im Datenraum zuweisen können (die</w:t>
-      </w:r>
-      <w:r>
-        <w:t xml:space="preserve"> </w:t>
-      </w:r>
-      <w:r>
-        <w:t xml:space="preserve">Auswahl „My role(s)” zeigt sie mit ihren englischen Bezeichnungen):</w:t>
+        <w:t xml:space="preserve">Die App bietet vier Aggregationsfunktionen:</w:t>
       </w:r>
     </w:p>
     <w:p>
@@ -7236,13 +7280,13 @@
           <w:b/>
           <w:bCs/>
         </w:rPr>
-        <w:t xml:space="preserve">Investor</w:t>
-      </w:r>
-      <w:r>
-        <w:t xml:space="preserve"> </w:t>
-      </w:r>
-      <w:r>
-        <w:t xml:space="preserve">– Investoren und Bestandshalter</w:t>
+        <w:t xml:space="preserve">Durchschnitt (average):</w:t>
+      </w:r>
+      <w:r>
+        <w:t xml:space="preserve"> </w:t>
+      </w:r>
+      <w:r>
+        <w:t xml:space="preserve">Mittelwert über alle ausgewählten Gebäude.</w:t>
       </w:r>
     </w:p>
     <w:p>
@@ -7258,13 +7302,13 @@
           <w:b/>
           <w:bCs/>
         </w:rPr>
-        <w:t xml:space="preserve">User</w:t>
-      </w:r>
-      <w:r>
-        <w:t xml:space="preserve"> </w:t>
-      </w:r>
-      <w:r>
-        <w:t xml:space="preserve">– Nutzer der Immobilie</w:t>
+        <w:t xml:space="preserve">Summe (sum):</w:t>
+      </w:r>
+      <w:r>
+        <w:t xml:space="preserve"> </w:t>
+      </w:r>
+      <w:r>
+        <w:t xml:space="preserve">addiert alle Werte.</w:t>
       </w:r>
     </w:p>
     <w:p>
@@ -7280,13 +7324,13 @@
           <w:b/>
           <w:bCs/>
         </w:rPr>
-        <w:t xml:space="preserve">Benchmark Service Provider</w:t>
-      </w:r>
-      <w:r>
-        <w:t xml:space="preserve"> </w:t>
-      </w:r>
-      <w:r>
-        <w:t xml:space="preserve">– Benchmark-Dienstleister</w:t>
+        <w:t xml:space="preserve">Minimum (minimum):</w:t>
+      </w:r>
+      <w:r>
+        <w:t xml:space="preserve"> </w:t>
+      </w:r>
+      <w:r>
+        <w:t xml:space="preserve">zeigt den niedrigsten Wert.</w:t>
       </w:r>
     </w:p>
     <w:p>
@@ -7302,101 +7346,23 @@
           <w:b/>
           <w:bCs/>
         </w:rPr>
-        <w:t xml:space="preserve">Facility Manager</w:t>
-      </w:r>
-      <w:r>
-        <w:t xml:space="preserve"> </w:t>
-      </w:r>
-      <w:r>
-        <w:t xml:space="preserve">– Gebäude- und Betriebsverantwortliche</w:t>
-      </w:r>
-    </w:p>
-    <w:p>
-      <w:pPr>
-        <w:pStyle w:val="Compact"/>
-        <w:numPr>
-          <w:ilvl w:val="0"/>
-          <w:numId w:val="1016"/>
-        </w:numPr>
-      </w:pPr>
-      <w:r>
-        <w:rPr>
-          <w:b/>
-          <w:bCs/>
-        </w:rPr>
-        <w:t xml:space="preserve">Developer</w:t>
-      </w:r>
-      <w:r>
-        <w:t xml:space="preserve"> </w:t>
-      </w:r>
-      <w:r>
-        <w:t xml:space="preserve">– Projektentwickler</w:t>
-      </w:r>
-    </w:p>
-    <w:p>
-      <w:pPr>
-        <w:pStyle w:val="Compact"/>
-        <w:numPr>
-          <w:ilvl w:val="0"/>
-          <w:numId w:val="1016"/>
-        </w:numPr>
-      </w:pPr>
-      <w:r>
-        <w:rPr>
-          <w:b/>
-          <w:bCs/>
-        </w:rPr>
-        <w:t xml:space="preserve">Consultant / Broker</w:t>
-      </w:r>
-      <w:r>
-        <w:t xml:space="preserve"> </w:t>
-      </w:r>
-      <w:r>
-        <w:t xml:space="preserve">– Berater und Makler</w:t>
-      </w:r>
-    </w:p>
-    <w:p>
-      <w:pPr>
-        <w:pStyle w:val="Compact"/>
-        <w:numPr>
-          <w:ilvl w:val="0"/>
-          <w:numId w:val="1016"/>
-        </w:numPr>
-      </w:pPr>
-      <w:r>
-        <w:rPr>
-          <w:b/>
-          <w:bCs/>
-        </w:rPr>
-        <w:t xml:space="preserve">Software Provider</w:t>
-      </w:r>
-      <w:r>
-        <w:t xml:space="preserve"> </w:t>
-      </w:r>
-      <w:r>
-        <w:t xml:space="preserve">– Softwaredienstleister</w:t>
-      </w:r>
-    </w:p>
-    <w:p>
-      <w:pPr>
-        <w:pStyle w:val="Compact"/>
-        <w:numPr>
-          <w:ilvl w:val="0"/>
-          <w:numId w:val="1016"/>
-        </w:numPr>
-      </w:pPr>
-      <w:r>
-        <w:rPr>
-          <w:b/>
-          <w:bCs/>
-        </w:rPr>
-        <w:t xml:space="preserve">Energy Provider</w:t>
-      </w:r>
-      <w:r>
-        <w:t xml:space="preserve"> </w:t>
-      </w:r>
-      <w:r>
-        <w:t xml:space="preserve">– Energiedienstleister</w:t>
+        <w:t xml:space="preserve">Maximum (maximum):</w:t>
+      </w:r>
+      <w:r>
+        <w:t xml:space="preserve"> </w:t>
+      </w:r>
+      <w:r>
+        <w:t xml:space="preserve">zeigt den höchsten Wert.</w:t>
+      </w:r>
+    </w:p>
+    <w:bookmarkEnd w:id="89"/>
+    <w:bookmarkStart w:id="90" w:name="rollenbasierte-freigaben"/>
+    <w:p>
+      <w:pPr>
+        <w:pStyle w:val="Heading3"/>
+      </w:pPr>
+      <w:r>
+        <w:t xml:space="preserve">Rollenbasierte Freigaben</w:t>
       </w:r>
     </w:p>
     <w:p>
@@ -7404,113 +7370,45 @@
         <w:pStyle w:val="FirstParagraph"/>
       </w:pPr>
       <w:r>
-        <w:t xml:space="preserve">Diese Rollen sind bewusst nicht exklusiv: Sie können sich</w:t>
-      </w:r>
-      <w:r>
-        <w:t xml:space="preserve"> </w:t>
-      </w:r>
-      <w:r>
-        <w:rPr>
-          <w:b/>
-          <w:bCs/>
-        </w:rPr>
-        <w:t xml:space="preserve">mehrere oder alle</w:t>
-      </w:r>
-      <w:r>
-        <w:t xml:space="preserve"> </w:t>
-      </w:r>
-      <w:r>
-        <w:t xml:space="preserve">zuweisen (siehe „Rolle wählen”). Eine Rolle hängt ausschließlich an der</w:t>
-      </w:r>
-      <w:r>
-        <w:t xml:space="preserve"> </w:t>
-      </w:r>
-      <w:r>
-        <w:t xml:space="preserve">Datenraum-Mitgliedschaft – nicht an einem Gebäude, seinen Energiedaten oder Ihrem</w:t>
-      </w:r>
-      <w:r>
-        <w:t xml:space="preserve"> </w:t>
-      </w:r>
-      <w:r>
-        <w:t xml:space="preserve">Profil.</w:t>
-      </w:r>
-    </w:p>
-    <w:bookmarkEnd w:id="90"/>
-    <w:bookmarkEnd w:id="91"/>
-    <w:bookmarkStart w:id="116" w:name="vorgehensweise-beim-datenteilen"/>
-    <w:p>
-      <w:pPr>
-        <w:pStyle w:val="Heading2"/>
-      </w:pPr>
-      <w:r>
-        <w:t xml:space="preserve">Vorgehensweise beim Datenteilen</w:t>
-      </w:r>
-    </w:p>
-    <w:bookmarkStart w:id="95" w:name="X02cc8b8c675205394a9898fb5cbb8306158c66e"/>
-    <w:p>
-      <w:pPr>
-        <w:pStyle w:val="Heading3"/>
-      </w:pPr>
-      <w:r>
-        <w:t xml:space="preserve">Einem Datenraum beitreten oder einen Raum erstellen</w:t>
-      </w:r>
-    </w:p>
-    <w:p>
-      <w:pPr>
-        <w:pStyle w:val="FirstParagraph"/>
-      </w:pPr>
-      <w:r>
-        <w:t xml:space="preserve">Ein</w:t>
-      </w:r>
-      <w:r>
-        <w:t xml:space="preserve"> </w:t>
-      </w:r>
-      <w:r>
-        <w:rPr>
-          <w:b/>
-          <w:bCs/>
-        </w:rPr>
-        <w:t xml:space="preserve">Datenraum</w:t>
-      </w:r>
-      <w:r>
-        <w:t xml:space="preserve"> </w:t>
-      </w:r>
-      <w:r>
-        <w:t xml:space="preserve">bündelt die Akteure, die untereinander Daten teilen, und ist</w:t>
-      </w:r>
-      <w:r>
-        <w:t xml:space="preserve"> </w:t>
-      </w:r>
-      <w:r>
-        <w:t xml:space="preserve">die Grundlage für die rollenbasierte Freigabe. Im Tab</w:t>
-      </w:r>
-      <w:r>
-        <w:t xml:space="preserve"> </w:t>
-      </w:r>
-      <w:r>
-        <w:rPr>
-          <w:b/>
-          <w:bCs/>
-        </w:rPr>
-        <w:t xml:space="preserve">Connect</w:t>
-      </w:r>
-      <w:r>
-        <w:t xml:space="preserve"> </w:t>
-      </w:r>
-      <w:r>
-        <w:t xml:space="preserve">versammelt</w:t>
-      </w:r>
-      <w:r>
-        <w:t xml:space="preserve"> </w:t>
-      </w:r>
-      <w:r>
-        <w:t xml:space="preserve">der Abschnitt „Your data rooms” alle Datenraum-Aktionen in einer Leiste über</w:t>
-      </w:r>
-      <w:r>
-        <w:t xml:space="preserve"> </w:t>
-      </w:r>
-      <w:r>
-        <w:t xml:space="preserve">der Liste:</w:t>
+        <w:t xml:space="preserve">In der Praxis haben unterschiedliche Partner unterschiedliche Bedürfnisse: Ein</w:t>
+      </w:r>
+      <w:r>
+        <w:t xml:space="preserve"> </w:t>
+      </w:r>
+      <w:r>
+        <w:t xml:space="preserve">Investor benötigt grobe Jahreszahlen, ein Energiemanager hingegen hochauflösende</w:t>
+      </w:r>
+      <w:r>
+        <w:t xml:space="preserve"> </w:t>
+      </w:r>
+      <w:r>
+        <w:t xml:space="preserve">15-Minuten-Intervalle. Mit der rollenbasierten Freigabe teilen Sie mit allen</w:t>
+      </w:r>
+      <w:r>
+        <w:t xml:space="preserve"> </w:t>
+      </w:r>
+      <w:r>
+        <w:t xml:space="preserve">Mitgliedern eines Datenraums, die eine bestimmte Rolle innehaben – die Auswahl</w:t>
+      </w:r>
+      <w:r>
+        <w:t xml:space="preserve"> </w:t>
+      </w:r>
+      <w:r>
+        <w:t xml:space="preserve">der Empfänger ergibt sich aus der Rolle.</w:t>
+      </w:r>
+    </w:p>
+    <w:p>
+      <w:pPr>
+        <w:pStyle w:val="BodyText"/>
+      </w:pPr>
+      <w:r>
+        <w:t xml:space="preserve">Die Granergize-App kennt acht Rollen, die Sie sich im Datenraum zuweisen können (die</w:t>
+      </w:r>
+      <w:r>
+        <w:t xml:space="preserve"> </w:t>
+      </w:r>
+      <w:r>
+        <w:t xml:space="preserve">Auswahl „My role(s)” zeigt sie mit ihren englischen Bezeichnungen):</w:t>
       </w:r>
     </w:p>
     <w:p>
@@ -7526,19 +7424,13 @@
           <w:b/>
           <w:bCs/>
         </w:rPr>
-        <w:t xml:space="preserve">Raum erstellen:</w:t>
-      </w:r>
-      <w:r>
-        <w:t xml:space="preserve"> </w:t>
-      </w:r>
-      <w:r>
-        <w:t xml:space="preserve">„Host a data room” legt einen Raum auf Ihrem Pod an. Teilen</w:t>
-      </w:r>
-      <w:r>
-        <w:t xml:space="preserve"> </w:t>
-      </w:r>
-      <w:r>
-        <w:t xml:space="preserve">Sie dessen Link oder QR-Code, damit andere beitreten können.</w:t>
+        <w:t xml:space="preserve">Investor</w:t>
+      </w:r>
+      <w:r>
+        <w:t xml:space="preserve"> </w:t>
+      </w:r>
+      <w:r>
+        <w:t xml:space="preserve">– Investoren und Bestandshalter</w:t>
       </w:r>
     </w:p>
     <w:p>
@@ -7554,31 +7446,13 @@
           <w:b/>
           <w:bCs/>
         </w:rPr>
-        <w:t xml:space="preserve">Beitreten:</w:t>
-      </w:r>
-      <w:r>
-        <w:t xml:space="preserve"> </w:t>
-      </w:r>
-      <w:r>
-        <w:t xml:space="preserve">Fügen Sie eine Raum-URI in das Feld ein und klicken Sie auf</w:t>
-      </w:r>
-      <w:r>
-        <w:t xml:space="preserve"> </w:t>
-      </w:r>
-      <w:r>
-        <w:t xml:space="preserve">„Add”, oder nutzen Sie „Scan QR code”. Verweigert der Browser den</w:t>
-      </w:r>
-      <w:r>
-        <w:t xml:space="preserve"> </w:t>
-      </w:r>
-      <w:r>
-        <w:t xml:space="preserve">Kamerazugriff, erscheint ein verständlicher Hinweis; „Cancel” unter dem</w:t>
-      </w:r>
-      <w:r>
-        <w:t xml:space="preserve"> </w:t>
-      </w:r>
-      <w:r>
-        <w:t xml:space="preserve">Kamerabild beendet das Scannen.</w:t>
+        <w:t xml:space="preserve">User</w:t>
+      </w:r>
+      <w:r>
+        <w:t xml:space="preserve"> </w:t>
+      </w:r>
+      <w:r>
+        <w:t xml:space="preserve">– Nutzer der Immobilie</w:t>
       </w:r>
     </w:p>
     <w:p>
@@ -7587,6 +7461,320 @@
         <w:numPr>
           <w:ilvl w:val="0"/>
           <w:numId w:val="1017"/>
+        </w:numPr>
+      </w:pPr>
+      <w:r>
+        <w:rPr>
+          <w:b/>
+          <w:bCs/>
+        </w:rPr>
+        <w:t xml:space="preserve">Benchmark Service Provider</w:t>
+      </w:r>
+      <w:r>
+        <w:t xml:space="preserve"> </w:t>
+      </w:r>
+      <w:r>
+        <w:t xml:space="preserve">– Benchmark-Dienstleister</w:t>
+      </w:r>
+    </w:p>
+    <w:p>
+      <w:pPr>
+        <w:pStyle w:val="Compact"/>
+        <w:numPr>
+          <w:ilvl w:val="0"/>
+          <w:numId w:val="1017"/>
+        </w:numPr>
+      </w:pPr>
+      <w:r>
+        <w:rPr>
+          <w:b/>
+          <w:bCs/>
+        </w:rPr>
+        <w:t xml:space="preserve">Facility Manager</w:t>
+      </w:r>
+      <w:r>
+        <w:t xml:space="preserve"> </w:t>
+      </w:r>
+      <w:r>
+        <w:t xml:space="preserve">– Gebäude- und Betriebsverantwortliche</w:t>
+      </w:r>
+    </w:p>
+    <w:p>
+      <w:pPr>
+        <w:pStyle w:val="Compact"/>
+        <w:numPr>
+          <w:ilvl w:val="0"/>
+          <w:numId w:val="1017"/>
+        </w:numPr>
+      </w:pPr>
+      <w:r>
+        <w:rPr>
+          <w:b/>
+          <w:bCs/>
+        </w:rPr>
+        <w:t xml:space="preserve">Developer</w:t>
+      </w:r>
+      <w:r>
+        <w:t xml:space="preserve"> </w:t>
+      </w:r>
+      <w:r>
+        <w:t xml:space="preserve">– Projektentwickler</w:t>
+      </w:r>
+    </w:p>
+    <w:p>
+      <w:pPr>
+        <w:pStyle w:val="Compact"/>
+        <w:numPr>
+          <w:ilvl w:val="0"/>
+          <w:numId w:val="1017"/>
+        </w:numPr>
+      </w:pPr>
+      <w:r>
+        <w:rPr>
+          <w:b/>
+          <w:bCs/>
+        </w:rPr>
+        <w:t xml:space="preserve">Consultant / Broker</w:t>
+      </w:r>
+      <w:r>
+        <w:t xml:space="preserve"> </w:t>
+      </w:r>
+      <w:r>
+        <w:t xml:space="preserve">– Berater und Makler</w:t>
+      </w:r>
+    </w:p>
+    <w:p>
+      <w:pPr>
+        <w:pStyle w:val="Compact"/>
+        <w:numPr>
+          <w:ilvl w:val="0"/>
+          <w:numId w:val="1017"/>
+        </w:numPr>
+      </w:pPr>
+      <w:r>
+        <w:rPr>
+          <w:b/>
+          <w:bCs/>
+        </w:rPr>
+        <w:t xml:space="preserve">Software Provider</w:t>
+      </w:r>
+      <w:r>
+        <w:t xml:space="preserve"> </w:t>
+      </w:r>
+      <w:r>
+        <w:t xml:space="preserve">– Softwaredienstleister</w:t>
+      </w:r>
+    </w:p>
+    <w:p>
+      <w:pPr>
+        <w:pStyle w:val="Compact"/>
+        <w:numPr>
+          <w:ilvl w:val="0"/>
+          <w:numId w:val="1017"/>
+        </w:numPr>
+      </w:pPr>
+      <w:r>
+        <w:rPr>
+          <w:b/>
+          <w:bCs/>
+        </w:rPr>
+        <w:t xml:space="preserve">Energy Provider</w:t>
+      </w:r>
+      <w:r>
+        <w:t xml:space="preserve"> </w:t>
+      </w:r>
+      <w:r>
+        <w:t xml:space="preserve">– Energiedienstleister</w:t>
+      </w:r>
+    </w:p>
+    <w:p>
+      <w:pPr>
+        <w:pStyle w:val="FirstParagraph"/>
+      </w:pPr>
+      <w:r>
+        <w:t xml:space="preserve">Diese Rollen sind bewusst nicht exklusiv: Sie können sich</w:t>
+      </w:r>
+      <w:r>
+        <w:t xml:space="preserve"> </w:t>
+      </w:r>
+      <w:r>
+        <w:rPr>
+          <w:b/>
+          <w:bCs/>
+        </w:rPr>
+        <w:t xml:space="preserve">mehrere oder alle</w:t>
+      </w:r>
+      <w:r>
+        <w:t xml:space="preserve"> </w:t>
+      </w:r>
+      <w:r>
+        <w:t xml:space="preserve">zuweisen (siehe „Rolle wählen”). Eine Rolle hängt ausschließlich an der</w:t>
+      </w:r>
+      <w:r>
+        <w:t xml:space="preserve"> </w:t>
+      </w:r>
+      <w:r>
+        <w:t xml:space="preserve">Datenraum-Mitgliedschaft – nicht an einem Gebäude, seinen Energiedaten oder Ihrem</w:t>
+      </w:r>
+      <w:r>
+        <w:t xml:space="preserve"> </w:t>
+      </w:r>
+      <w:r>
+        <w:t xml:space="preserve">Profil.</w:t>
+      </w:r>
+    </w:p>
+    <w:bookmarkEnd w:id="90"/>
+    <w:bookmarkEnd w:id="91"/>
+    <w:bookmarkStart w:id="116" w:name="vorgehensweise-beim-datenteilen"/>
+    <w:p>
+      <w:pPr>
+        <w:pStyle w:val="Heading2"/>
+      </w:pPr>
+      <w:r>
+        <w:t xml:space="preserve">Vorgehensweise beim Datenteilen</w:t>
+      </w:r>
+    </w:p>
+    <w:bookmarkStart w:id="95" w:name="X02cc8b8c675205394a9898fb5cbb8306158c66e"/>
+    <w:p>
+      <w:pPr>
+        <w:pStyle w:val="Heading3"/>
+      </w:pPr>
+      <w:r>
+        <w:t xml:space="preserve">Einem Datenraum beitreten oder einen Raum erstellen</w:t>
+      </w:r>
+    </w:p>
+    <w:p>
+      <w:pPr>
+        <w:pStyle w:val="FirstParagraph"/>
+      </w:pPr>
+      <w:r>
+        <w:t xml:space="preserve">Ein</w:t>
+      </w:r>
+      <w:r>
+        <w:t xml:space="preserve"> </w:t>
+      </w:r>
+      <w:r>
+        <w:rPr>
+          <w:b/>
+          <w:bCs/>
+        </w:rPr>
+        <w:t xml:space="preserve">Datenraum</w:t>
+      </w:r>
+      <w:r>
+        <w:t xml:space="preserve"> </w:t>
+      </w:r>
+      <w:r>
+        <w:t xml:space="preserve">bündelt die Akteure, die untereinander Daten teilen, und ist</w:t>
+      </w:r>
+      <w:r>
+        <w:t xml:space="preserve"> </w:t>
+      </w:r>
+      <w:r>
+        <w:t xml:space="preserve">die Grundlage für die rollenbasierte Freigabe. Im Tab</w:t>
+      </w:r>
+      <w:r>
+        <w:t xml:space="preserve"> </w:t>
+      </w:r>
+      <w:r>
+        <w:rPr>
+          <w:b/>
+          <w:bCs/>
+        </w:rPr>
+        <w:t xml:space="preserve">Connect</w:t>
+      </w:r>
+      <w:r>
+        <w:t xml:space="preserve"> </w:t>
+      </w:r>
+      <w:r>
+        <w:t xml:space="preserve">versammelt</w:t>
+      </w:r>
+      <w:r>
+        <w:t xml:space="preserve"> </w:t>
+      </w:r>
+      <w:r>
+        <w:t xml:space="preserve">der Abschnitt „Your data rooms” alle Datenraum-Aktionen in einer Leiste über</w:t>
+      </w:r>
+      <w:r>
+        <w:t xml:space="preserve"> </w:t>
+      </w:r>
+      <w:r>
+        <w:t xml:space="preserve">der Liste:</w:t>
+      </w:r>
+    </w:p>
+    <w:p>
+      <w:pPr>
+        <w:pStyle w:val="Compact"/>
+        <w:numPr>
+          <w:ilvl w:val="0"/>
+          <w:numId w:val="1018"/>
+        </w:numPr>
+      </w:pPr>
+      <w:r>
+        <w:rPr>
+          <w:b/>
+          <w:bCs/>
+        </w:rPr>
+        <w:t xml:space="preserve">Raum erstellen:</w:t>
+      </w:r>
+      <w:r>
+        <w:t xml:space="preserve"> </w:t>
+      </w:r>
+      <w:r>
+        <w:t xml:space="preserve">„Host a data room” legt einen Raum auf Ihrem Pod an. Teilen</w:t>
+      </w:r>
+      <w:r>
+        <w:t xml:space="preserve"> </w:t>
+      </w:r>
+      <w:r>
+        <w:t xml:space="preserve">Sie dessen Link oder QR-Code, damit andere beitreten können.</w:t>
+      </w:r>
+    </w:p>
+    <w:p>
+      <w:pPr>
+        <w:pStyle w:val="Compact"/>
+        <w:numPr>
+          <w:ilvl w:val="0"/>
+          <w:numId w:val="1018"/>
+        </w:numPr>
+      </w:pPr>
+      <w:r>
+        <w:rPr>
+          <w:b/>
+          <w:bCs/>
+        </w:rPr>
+        <w:t xml:space="preserve">Beitreten:</w:t>
+      </w:r>
+      <w:r>
+        <w:t xml:space="preserve"> </w:t>
+      </w:r>
+      <w:r>
+        <w:t xml:space="preserve">Fügen Sie eine Raum-URI in das Feld ein und klicken Sie auf</w:t>
+      </w:r>
+      <w:r>
+        <w:t xml:space="preserve"> </w:t>
+      </w:r>
+      <w:r>
+        <w:t xml:space="preserve">„Add”, oder nutzen Sie „Scan QR code”. Verweigert der Browser den</w:t>
+      </w:r>
+      <w:r>
+        <w:t xml:space="preserve"> </w:t>
+      </w:r>
+      <w:r>
+        <w:t xml:space="preserve">Kamerazugriff, erscheint ein verständlicher Hinweis; „Cancel” unter dem</w:t>
+      </w:r>
+      <w:r>
+        <w:t xml:space="preserve"> </w:t>
+      </w:r>
+      <w:r>
+        <w:t xml:space="preserve">Kamerabild beendet das Scannen.</w:t>
+      </w:r>
+    </w:p>
+    <w:p>
+      <w:pPr>
+        <w:pStyle w:val="Compact"/>
+        <w:numPr>
+          <w:ilvl w:val="0"/>
+          <w:numId w:val="1018"/>
         </w:numPr>
       </w:pPr>
       <w:r>
@@ -7874,7 +8062,7 @@
         <w:pStyle w:val="Compact"/>
         <w:numPr>
           <w:ilvl w:val="0"/>
-          <w:numId w:val="1018"/>
+          <w:numId w:val="1019"/>
         </w:numPr>
       </w:pPr>
       <w:r>
@@ -7892,7 +8080,7 @@
         <w:pStyle w:val="Compact"/>
         <w:numPr>
           <w:ilvl w:val="0"/>
-          <w:numId w:val="1018"/>
+          <w:numId w:val="1019"/>
         </w:numPr>
       </w:pPr>
       <w:r>
@@ -7948,7 +8136,7 @@
         <w:pStyle w:val="Compact"/>
         <w:numPr>
           <w:ilvl w:val="0"/>
-          <w:numId w:val="1018"/>
+          <w:numId w:val="1019"/>
         </w:numPr>
       </w:pPr>
       <w:r>
@@ -8156,7 +8344,7 @@
         <w:pStyle w:val="Compact"/>
         <w:numPr>
           <w:ilvl w:val="0"/>
-          <w:numId w:val="1019"/>
+          <w:numId w:val="1020"/>
         </w:numPr>
       </w:pPr>
       <w:r>
@@ -8190,7 +8378,7 @@
         <w:pStyle w:val="Compact"/>
         <w:numPr>
           <w:ilvl w:val="0"/>
-          <w:numId w:val="1019"/>
+          <w:numId w:val="1020"/>
         </w:numPr>
       </w:pPr>
       <w:r>
@@ -8215,7 +8403,7 @@
         <w:pStyle w:val="Compact"/>
         <w:numPr>
           <w:ilvl w:val="1"/>
-          <w:numId w:val="1020"/>
+          <w:numId w:val="1021"/>
         </w:numPr>
       </w:pPr>
       <w:r>
@@ -8243,7 +8431,7 @@
         <w:pStyle w:val="Compact"/>
         <w:numPr>
           <w:ilvl w:val="1"/>
-          <w:numId w:val="1020"/>
+          <w:numId w:val="1021"/>
         </w:numPr>
       </w:pPr>
       <w:r>
@@ -8277,7 +8465,7 @@
         <w:pStyle w:val="Compact"/>
         <w:numPr>
           <w:ilvl w:val="1"/>
-          <w:numId w:val="1020"/>
+          <w:numId w:val="1021"/>
         </w:numPr>
       </w:pPr>
       <w:r>
@@ -8329,7 +8517,7 @@
         <w:pStyle w:val="Compact"/>
         <w:numPr>
           <w:ilvl w:val="0"/>
-          <w:numId w:val="1019"/>
+          <w:numId w:val="1020"/>
         </w:numPr>
       </w:pPr>
       <w:r>
@@ -8365,7 +8553,7 @@
         <w:pStyle w:val="Compact"/>
         <w:numPr>
           <w:ilvl w:val="0"/>
-          <w:numId w:val="1019"/>
+          <w:numId w:val="1020"/>
         </w:numPr>
       </w:pPr>
       <w:r>
@@ -8414,7 +8602,7 @@
         <w:pStyle w:val="Compact"/>
         <w:numPr>
           <w:ilvl w:val="0"/>
-          <w:numId w:val="1019"/>
+          <w:numId w:val="1020"/>
         </w:numPr>
       </w:pPr>
       <w:r>
@@ -8649,7 +8837,7 @@
           <wp:inline>
             <wp:extent cx="5334000" cy="4000499"/>
             <wp:effectExtent b="0" l="0" r="0" t="0"/>
-            <wp:docPr descr="Tab „Share”: mit Ihnen geteilte Gebäude unter „Buildings shared with you”" title="" id="112" name="Picture"/>
+            <wp:docPr descr="Tab „Share”: ein mit Ihnen geteiltes Gebäude unter „Buildings shared with you” und ein von einem Benchmark-Dienstleister zurückgeteilter Benchmark unter „Views shared with you” – aufgeklappt („Show values”) die empfangenen Durchschnittswerte über alle beigetragenen Gebäude" title="" id="112" name="Picture"/>
             <a:graphic>
               <a:graphicData uri="http://schemas.openxmlformats.org/drawingml/2006/picture">
                 <pic:pic>
@@ -8692,7 +8880,7 @@
         <w:pStyle w:val="ImageCaption"/>
       </w:pPr>
       <w:r>
-        <w:t xml:space="preserve">Tab „Share”: mit Ihnen geteilte Gebäude unter „Buildings shared with you”</w:t>
+        <w:t xml:space="preserve">Tab „Share”: ein mit Ihnen geteiltes Gebäude unter „Buildings shared with you” und ein von einem Benchmark-Dienstleister zurückgeteilter Benchmark unter „Views shared with you” – aufgeklappt („Show values”) die empfangenen Durchschnittswerte über alle beigetragenen Gebäude</w:t>
       </w:r>
     </w:p>
     <w:p>
@@ -8809,8 +8997,1231 @@
     </w:p>
     <w:bookmarkEnd w:id="115"/>
     <w:bookmarkEnd w:id="116"/>
-    <w:bookmarkEnd w:id="117"/>
-    <w:bookmarkStart w:id="118" w:name="was-steckt-hinter-granergize"/>
+    <w:bookmarkStart w:id="128" w:name="zwei-szenarien-im-zusammenspiel"/>
+    <w:p>
+      <w:pPr>
+        <w:pStyle w:val="Heading2"/>
+      </w:pPr>
+      <w:r>
+        <w:t xml:space="preserve">Zwei Szenarien im Zusammenspiel</w:t>
+      </w:r>
+    </w:p>
+    <w:p>
+      <w:pPr>
+        <w:pStyle w:val="FirstParagraph"/>
+      </w:pPr>
+      <w:r>
+        <w:t xml:space="preserve">Die vorangegangenen Abschnitte beschreiben jeden Arbeitsschritt für sich. Die</w:t>
+      </w:r>
+      <w:r>
+        <w:t xml:space="preserve"> </w:t>
+      </w:r>
+      <w:r>
+        <w:t xml:space="preserve">folgenden zwei Szenarien zeigen, wie die Schritte über mehrere Beteiligte hinweg</w:t>
+      </w:r>
+      <w:r>
+        <w:t xml:space="preserve"> </w:t>
+      </w:r>
+      <w:r>
+        <w:t xml:space="preserve">ineinandergreifen: einmal das Teilen eines Gebäudes aus der Sicht</w:t>
+      </w:r>
+      <w:r>
+        <w:t xml:space="preserve"> </w:t>
+      </w:r>
+      <w:r>
+        <w:rPr>
+          <w:b/>
+          <w:bCs/>
+        </w:rPr>
+        <w:t xml:space="preserve">beider</w:t>
+      </w:r>
+      <w:r>
+        <w:t xml:space="preserve"> </w:t>
+      </w:r>
+      <w:r>
+        <w:t xml:space="preserve">Seiten (A und B), und einmal das Peer-Benchmarking mit</w:t>
+      </w:r>
+      <w:r>
+        <w:t xml:space="preserve"> </w:t>
+      </w:r>
+      <w:r>
+        <w:rPr>
+          <w:b/>
+          <w:bCs/>
+        </w:rPr>
+        <w:t xml:space="preserve">drei</w:t>
+      </w:r>
+      <w:r>
+        <w:t xml:space="preserve"> </w:t>
+      </w:r>
+      <w:r>
+        <w:t xml:space="preserve">Beteiligten</w:t>
+      </w:r>
+      <w:r>
+        <w:t xml:space="preserve"> </w:t>
+      </w:r>
+      <w:r>
+        <w:t xml:space="preserve">(A, B und C). In den Bildschirmfotos dieses Handbuchs treten die drei als</w:t>
+      </w:r>
+      <w:r>
+        <w:t xml:space="preserve"> </w:t>
+      </w:r>
+      <w:r>
+        <w:t xml:space="preserve">Alice, Bob und Charlie auf – etwa als „Shared by: Alice Ahlmann” beim</w:t>
+      </w:r>
+      <w:r>
+        <w:t xml:space="preserve"> </w:t>
+      </w:r>
+      <w:r>
+        <w:t xml:space="preserve">Empfänger oder als Absender des zurückgeteilten Benchmarks.</w:t>
+      </w:r>
+    </w:p>
+    <w:bookmarkStart w:id="120" w:name="X772ae4d830da6eb559342e0008f372a05ca1644"/>
+    <w:p>
+      <w:pPr>
+        <w:pStyle w:val="Heading3"/>
+      </w:pPr>
+      <w:r>
+        <w:t xml:space="preserve">Szenario 1: Ein Gebäude teilen – aus beiden Perspektiven</w:t>
+      </w:r>
+    </w:p>
+    <w:p>
+      <w:pPr>
+        <w:pStyle w:val="FirstParagraph"/>
+      </w:pPr>
+      <w:r>
+        <w:t xml:space="preserve">Beteiligt sind zwei Personen mit jeweils eigenem Solid Pod:</w:t>
+      </w:r>
+      <w:r>
+        <w:t xml:space="preserve"> </w:t>
+      </w:r>
+      <w:r>
+        <w:rPr>
+          <w:b/>
+          <w:bCs/>
+        </w:rPr>
+        <w:t xml:space="preserve">A</w:t>
+      </w:r>
+      <w:r>
+        <w:t xml:space="preserve">, eine</w:t>
+      </w:r>
+      <w:r>
+        <w:t xml:space="preserve"> </w:t>
+      </w:r>
+      <w:r>
+        <w:t xml:space="preserve">Bestandshalterin, die ein Gebäude mit erfassten Energiejahren verwaltet, und</w:t>
+      </w:r>
+      <w:r>
+        <w:t xml:space="preserve"> </w:t>
+      </w:r>
+      <w:r>
+        <w:rPr>
+          <w:b/>
+          <w:bCs/>
+        </w:rPr>
+        <w:t xml:space="preserve">B</w:t>
+      </w:r>
+      <w:r>
+        <w:t xml:space="preserve">, ein Geschäftspartner (etwa ein Investor), der diese Daten einsehen soll.</w:t>
+      </w:r>
+      <w:r>
+        <w:t xml:space="preserve"> </w:t>
+      </w:r>
+      <w:r>
+        <w:t xml:space="preserve">Wichtig vorab: Die Daten werden zu keinem Zeitpunkt kopiert oder an einen</w:t>
+      </w:r>
+      <w:r>
+        <w:t xml:space="preserve"> </w:t>
+      </w:r>
+      <w:r>
+        <w:t xml:space="preserve">zentralen Dienst übertragen – sie bleiben auf A’s Pod, und B liest sie dort</w:t>
+      </w:r>
+      <w:r>
+        <w:t xml:space="preserve"> </w:t>
+      </w:r>
+      <w:r>
+        <w:t xml:space="preserve">direkt mit seiner eigenen WebID.</w:t>
+      </w:r>
+    </w:p>
+    <w:p>
+      <w:pPr>
+        <w:pStyle w:val="BodyText"/>
+      </w:pPr>
+      <w:r>
+        <w:rPr>
+          <w:b/>
+          <w:bCs/>
+        </w:rPr>
+        <w:t xml:space="preserve">Was A tut (die teilende Seite):</w:t>
+      </w:r>
+    </w:p>
+    <w:p>
+      <w:pPr>
+        <w:pStyle w:val="Compact"/>
+        <w:numPr>
+          <w:ilvl w:val="0"/>
+          <w:numId w:val="1022"/>
+        </w:numPr>
+      </w:pPr>
+      <w:r>
+        <w:t xml:space="preserve">A öffnet im Tab</w:t>
+      </w:r>
+      <w:r>
+        <w:t xml:space="preserve"> </w:t>
+      </w:r>
+      <w:r>
+        <w:rPr>
+          <w:b/>
+          <w:bCs/>
+        </w:rPr>
+        <w:t xml:space="preserve">Manage</w:t>
+      </w:r>
+      <w:r>
+        <w:t xml:space="preserve"> </w:t>
+      </w:r>
+      <w:r>
+        <w:t xml:space="preserve">unter „Your buildings” das Teilen-Symbol des</w:t>
+      </w:r>
+      <w:r>
+        <w:t xml:space="preserve"> </w:t>
+      </w:r>
+      <w:r>
+        <w:t xml:space="preserve">Gebäudes. Der Dialog „Share Building Data” erscheint.</w:t>
+      </w:r>
+    </w:p>
+    <w:p>
+      <w:pPr>
+        <w:pStyle w:val="Compact"/>
+        <w:numPr>
+          <w:ilvl w:val="0"/>
+          <w:numId w:val="1022"/>
+        </w:numPr>
+      </w:pPr>
+      <w:r>
+        <w:t xml:space="preserve">A wählt</w:t>
+      </w:r>
+      <w:r>
+        <w:t xml:space="preserve"> </w:t>
+      </w:r>
+      <w:r>
+        <w:rPr>
+          <w:b/>
+          <w:bCs/>
+        </w:rPr>
+        <w:t xml:space="preserve">By WebID</w:t>
+      </w:r>
+      <w:r>
+        <w:t xml:space="preserve"> </w:t>
+      </w:r>
+      <w:r>
+        <w:t xml:space="preserve">und gibt B’s WebID ein – hat A schon einmal mit B</w:t>
+      </w:r>
+      <w:r>
+        <w:t xml:space="preserve"> </w:t>
+      </w:r>
+      <w:r>
+        <w:t xml:space="preserve">geteilt, schlägt das Adressbuch (siehe „Kontakte verwalten”) die WebID vor.</w:t>
+      </w:r>
+      <w:r>
+        <w:t xml:space="preserve"> </w:t>
+      </w:r>
+      <w:r>
+        <w:t xml:space="preserve">Alternativ wählt A</w:t>
+      </w:r>
+      <w:r>
+        <w:t xml:space="preserve"> </w:t>
+      </w:r>
+      <w:r>
+        <w:rPr>
+          <w:b/>
+          <w:bCs/>
+        </w:rPr>
+        <w:t xml:space="preserve">By role</w:t>
+      </w:r>
+      <w:r>
+        <w:t xml:space="preserve">, wenn beide Mitglied desselben Datenraums</w:t>
+      </w:r>
+      <w:r>
+        <w:t xml:space="preserve"> </w:t>
+      </w:r>
+      <w:r>
+        <w:t xml:space="preserve">sind und B sich dort eine passende Rolle zugewiesen hat.</w:t>
+      </w:r>
+    </w:p>
+    <w:p>
+      <w:pPr>
+        <w:pStyle w:val="Compact"/>
+        <w:numPr>
+          <w:ilvl w:val="0"/>
+          <w:numId w:val="1022"/>
+        </w:numPr>
+      </w:pPr>
+      <w:r>
+        <w:t xml:space="preserve">A legt unter „What to share” den Umfang fest – etwa nur Stammdaten oder</w:t>
+      </w:r>
+      <w:r>
+        <w:t xml:space="preserve"> </w:t>
+      </w:r>
+      <w:r>
+        <w:t xml:space="preserve">Stammdaten mit ausgewählten Energiejahren – und bestätigt mit</w:t>
+      </w:r>
+      <w:r>
+        <w:t xml:space="preserve"> </w:t>
+      </w:r>
+      <w:r>
+        <w:rPr>
+          <w:b/>
+          <w:bCs/>
+        </w:rPr>
+        <w:t xml:space="preserve">Share</w:t>
+      </w:r>
+      <w:r>
+        <w:t xml:space="preserve">.</w:t>
+      </w:r>
+    </w:p>
+    <w:p>
+      <w:pPr>
+        <w:pStyle w:val="FirstParagraph"/>
+      </w:pPr>
+      <w:r>
+        <w:t xml:space="preserve">Anschließend sieht A die Freigabe direkt beim Gebäude unter „Shared with:” und</w:t>
+      </w:r>
+      <w:r>
+        <w:t xml:space="preserve"> </w:t>
+      </w:r>
+      <w:r>
+        <w:t xml:space="preserve">kann sie dort jederzeit wieder entfernen. B wird automatisch in A’s Kontakte</w:t>
+      </w:r>
+      <w:r>
+        <w:t xml:space="preserve"> </w:t>
+      </w:r>
+      <w:r>
+        <w:t xml:space="preserve">aufgenommen.</w:t>
+      </w:r>
+    </w:p>
+    <w:p>
+      <w:pPr>
+        <w:pStyle w:val="BodyText"/>
+      </w:pPr>
+      <w:r>
+        <w:rPr>
+          <w:b/>
+          <w:bCs/>
+        </w:rPr>
+        <w:t xml:space="preserve">Was B sieht (die empfangende Seite):</w:t>
+      </w:r>
+    </w:p>
+    <w:p>
+      <w:pPr>
+        <w:pStyle w:val="Compact"/>
+        <w:numPr>
+          <w:ilvl w:val="0"/>
+          <w:numId w:val="1023"/>
+        </w:numPr>
+      </w:pPr>
+      <w:r>
+        <w:t xml:space="preserve">Die Freigabe-Benachrichtigung landet im Posteingang von B’s Pod. Beim</w:t>
+      </w:r>
+      <w:r>
+        <w:t xml:space="preserve"> </w:t>
+      </w:r>
+      <w:r>
+        <w:t xml:space="preserve">nächsten Öffnen oder Neuladen der App verarbeitet B’s Anwendung sie</w:t>
+      </w:r>
+      <w:r>
+        <w:t xml:space="preserve"> </w:t>
+      </w:r>
+      <w:r>
+        <w:t xml:space="preserve">automatisch – B muss dafür nichts tun.</w:t>
+      </w:r>
+    </w:p>
+    <w:p>
+      <w:pPr>
+        <w:pStyle w:val="Compact"/>
+        <w:numPr>
+          <w:ilvl w:val="0"/>
+          <w:numId w:val="1023"/>
+        </w:numPr>
+      </w:pPr>
+      <w:r>
+        <w:t xml:space="preserve">Das Gebäude erscheint bei B im Tab</w:t>
+      </w:r>
+      <w:r>
+        <w:t xml:space="preserve"> </w:t>
+      </w:r>
+      <w:r>
+        <w:rPr>
+          <w:b/>
+          <w:bCs/>
+        </w:rPr>
+        <w:t xml:space="preserve">Share</w:t>
+      </w:r>
+      <w:r>
+        <w:t xml:space="preserve"> </w:t>
+      </w:r>
+      <w:r>
+        <w:t xml:space="preserve">unter „Buildings shared with</w:t>
+      </w:r>
+      <w:r>
+        <w:t xml:space="preserve"> </w:t>
+      </w:r>
+      <w:r>
+        <w:t xml:space="preserve">you” und zusätzlich auf der Karte im Tab</w:t>
+      </w:r>
+      <w:r>
+        <w:t xml:space="preserve"> </w:t>
+      </w:r>
+      <w:r>
+        <w:rPr>
+          <w:b/>
+          <w:bCs/>
+        </w:rPr>
+        <w:t xml:space="preserve">Explore</w:t>
+      </w:r>
+      <w:r>
+        <w:t xml:space="preserve">, dort als geteiltes</w:t>
+      </w:r>
+      <w:r>
+        <w:t xml:space="preserve"> </w:t>
+      </w:r>
+      <w:r>
+        <w:t xml:space="preserve">Gebäude gekennzeichnet und neben B’s eigenen Gebäuden auswertbar.</w:t>
+      </w:r>
+    </w:p>
+    <w:p>
+      <w:pPr>
+        <w:pStyle w:val="Compact"/>
+        <w:numPr>
+          <w:ilvl w:val="0"/>
+          <w:numId w:val="1023"/>
+        </w:numPr>
+      </w:pPr>
+      <w:r>
+        <w:t xml:space="preserve">B öffnet das Gebäude und sieht genau das, was A freigegeben hat: die</w:t>
+      </w:r>
+      <w:r>
+        <w:t xml:space="preserve"> </w:t>
+      </w:r>
+      <w:r>
+        <w:t xml:space="preserve">Stammdaten und – je nach gewähltem Umfang – die Energiejahre. Hat A „alle</w:t>
+      </w:r>
+      <w:r>
+        <w:t xml:space="preserve"> </w:t>
+      </w:r>
+      <w:r>
+        <w:t xml:space="preserve">Energiejahre” freigegeben, sieht B auch Jahre, die A erst später erfasst.</w:t>
+      </w:r>
+    </w:p>
+    <w:p>
+      <w:pPr>
+        <w:pStyle w:val="Compact"/>
+        <w:numPr>
+          <w:ilvl w:val="0"/>
+          <w:numId w:val="1023"/>
+        </w:numPr>
+      </w:pPr>
+      <w:r>
+        <w:t xml:space="preserve">Möchte B das Gebäude vorübergehend nicht in seinen Listen sehen, blendet er</w:t>
+      </w:r>
+      <w:r>
+        <w:t xml:space="preserve"> </w:t>
+      </w:r>
+      <w:r>
+        <w:t xml:space="preserve">es über das Augen-Symbol aus – die Freigabe selbst bleibt bestehen.</w:t>
+      </w:r>
+    </w:p>
+    <w:p>
+      <w:pPr>
+        <w:pStyle w:val="FirstParagraph"/>
+      </w:pPr>
+      <w:r>
+        <w:t xml:space="preserve">Widerruft A die Freigabe später (siehe „Zugriff widerrufen”), wird B</w:t>
+      </w:r>
+      <w:r>
+        <w:t xml:space="preserve"> </w:t>
+      </w:r>
+      <w:r>
+        <w:t xml:space="preserve">benachrichtigt, und das Gebäude verschwindet beim nächsten Abruf aus B’s</w:t>
+      </w:r>
+      <w:r>
+        <w:t xml:space="preserve"> </w:t>
+      </w:r>
+      <w:r>
+        <w:t xml:space="preserve">Ansicht. Beide Seiten behalten so jederzeit den Überblick: A sieht in ihrem Pod,</w:t>
+      </w:r>
+      <w:r>
+        <w:t xml:space="preserve"> </w:t>
+      </w:r>
+      <w:r>
+        <w:t xml:space="preserve">was sie an wen freigegeben hat; B sieht, was mit ihm geteilt wurde – und beides</w:t>
+      </w:r>
+      <w:r>
+        <w:t xml:space="preserve"> </w:t>
+      </w:r>
+      <w:r>
+        <w:t xml:space="preserve">bleibt auch nach dem Widerruf nachvollziehbar.</w:t>
+      </w:r>
+    </w:p>
+    <w:p>
+      <w:pPr>
+        <w:pStyle w:val="CaptionedFigure"/>
+      </w:pPr>
+      <w:r>
+        <w:drawing>
+          <wp:inline>
+            <wp:extent cx="5334000" cy="3535706"/>
+            <wp:effectExtent b="0" l="0" r="0" t="0"/>
+            <wp:docPr descr="Gebäude teilen aus beiden Perspektiven: A vergibt die Freigabe auf dem eigenen Pod, B wird benachrichtigt und liest die Daten direkt von A’s Pod" title="" id="118" name="Picture"/>
+            <a:graphic>
+              <a:graphicData uri="http://schemas.openxmlformats.org/drawingml/2006/picture">
+                <pic:pic>
+                  <pic:nvPicPr>
+                    <pic:cNvPr descr="figures/szenario-teilen.png" id="119" name="Picture"/>
+                    <pic:cNvPicPr>
+                      <a:picLocks noChangeArrowheads="1" noChangeAspect="1"/>
+                    </pic:cNvPicPr>
+                  </pic:nvPicPr>
+                  <pic:blipFill>
+                    <a:blip r:embed="rId117"/>
+                    <a:stretch>
+                      <a:fillRect/>
+                    </a:stretch>
+                  </pic:blipFill>
+                  <pic:spPr bwMode="auto">
+                    <a:xfrm>
+                      <a:off x="0" y="0"/>
+                      <a:ext cx="5334000" cy="3535706"/>
+                    </a:xfrm>
+                    <a:prstGeom prst="rect">
+                      <a:avLst/>
+                    </a:prstGeom>
+                    <a:noFill/>
+                    <a:ln w="9525">
+                      <a:noFill/>
+                      <a:headEnd/>
+                      <a:tailEnd/>
+                    </a:ln>
+                  </pic:spPr>
+                </pic:pic>
+              </a:graphicData>
+            </a:graphic>
+          </wp:inline>
+        </w:drawing>
+      </w:r>
+    </w:p>
+    <w:p>
+      <w:pPr>
+        <w:pStyle w:val="ImageCaption"/>
+      </w:pPr>
+      <w:r>
+        <w:t xml:space="preserve">Gebäude teilen aus beiden Perspektiven: A vergibt die Freigabe auf dem eigenen Pod, B wird benachrichtigt und liest die Daten direkt von A’s Pod</w:t>
+      </w:r>
+    </w:p>
+    <w:bookmarkEnd w:id="120"/>
+    <w:bookmarkStart w:id="127" w:name="X22cbd56082c75d3c3bf5f4b99816c26f9d44d34"/>
+    <w:p>
+      <w:pPr>
+        <w:pStyle w:val="Heading3"/>
+      </w:pPr>
+      <w:r>
+        <w:t xml:space="preserve">Szenario 2: Peer-Benchmarking mit einem Benchmark-Dienstleister</w:t>
+      </w:r>
+    </w:p>
+    <w:p>
+      <w:pPr>
+        <w:pStyle w:val="FirstParagraph"/>
+      </w:pPr>
+      <w:r>
+        <w:t xml:space="preserve">Ein einzelner Bestandshalter kann seine Gebäude nur mit dem eigenen Portfolio</w:t>
+      </w:r>
+      <w:r>
+        <w:t xml:space="preserve"> </w:t>
+      </w:r>
+      <w:r>
+        <w:t xml:space="preserve">vergleichen. Ein echter</w:t>
+      </w:r>
+      <w:r>
+        <w:t xml:space="preserve"> </w:t>
+      </w:r>
+      <w:r>
+        <w:rPr>
+          <w:b/>
+          <w:bCs/>
+        </w:rPr>
+        <w:t xml:space="preserve">Peer-Vergleich</w:t>
+      </w:r>
+      <w:r>
+        <w:t xml:space="preserve"> </w:t>
+      </w:r>
+      <w:r>
+        <w:t xml:space="preserve">– „Wie steht mein Gebäude im</w:t>
+      </w:r>
+      <w:r>
+        <w:t xml:space="preserve"> </w:t>
+      </w:r>
+      <w:r>
+        <w:t xml:space="preserve">Branchendurchschnitt da?</w:t>
+      </w:r>
+      <w:r>
+        <w:t xml:space="preserve">“</w:t>
+      </w:r>
+      <w:r>
+        <w:t xml:space="preserve">, der eingangs beschriebene Anwendungsfall</w:t>
+      </w:r>
+      <w:r>
+        <w:t xml:space="preserve"> </w:t>
+      </w:r>
+      <w:r>
+        <w:t xml:space="preserve">„Energieverbrauchsbenchmark</w:t>
+      </w:r>
+      <w:r>
+        <w:t xml:space="preserve">”</w:t>
+      </w:r>
+      <w:r>
+        <w:t xml:space="preserve"> </w:t>
+      </w:r>
+      <w:r>
+        <w:t xml:space="preserve">– braucht Daten mehrerer Eigentümer, ohne dass</w:t>
+      </w:r>
+      <w:r>
+        <w:t xml:space="preserve"> </w:t>
+      </w:r>
+      <w:r>
+        <w:t xml:space="preserve">diese ihre Gebäude einander offenlegen müssen. Genau das leistet das</w:t>
+      </w:r>
+      <w:r>
+        <w:t xml:space="preserve"> </w:t>
+      </w:r>
+      <w:r>
+        <w:t xml:space="preserve">Zusammenspiel von Gebäude-Freigabe und aggregierten Ansichten, mit drei</w:t>
+      </w:r>
+      <w:r>
+        <w:t xml:space="preserve"> </w:t>
+      </w:r>
+      <w:r>
+        <w:t xml:space="preserve">Beteiligten:</w:t>
+      </w:r>
+    </w:p>
+    <w:p>
+      <w:pPr>
+        <w:pStyle w:val="Compact"/>
+        <w:numPr>
+          <w:ilvl w:val="0"/>
+          <w:numId w:val="1024"/>
+        </w:numPr>
+      </w:pPr>
+      <w:r>
+        <w:rPr>
+          <w:b/>
+          <w:bCs/>
+        </w:rPr>
+        <w:t xml:space="preserve">A</w:t>
+      </w:r>
+      <w:r>
+        <w:t xml:space="preserve"> </w:t>
+      </w:r>
+      <w:r>
+        <w:t xml:space="preserve">und</w:t>
+      </w:r>
+      <w:r>
+        <w:t xml:space="preserve"> </w:t>
+      </w:r>
+      <w:r>
+        <w:rPr>
+          <w:b/>
+          <w:bCs/>
+        </w:rPr>
+        <w:t xml:space="preserve">B</w:t>
+      </w:r>
+      <w:r>
+        <w:t xml:space="preserve"> </w:t>
+      </w:r>
+      <w:r>
+        <w:t xml:space="preserve">sind Bestandshalter mit eigenen Gebäuden und Energiedaten.</w:t>
+      </w:r>
+      <w:r>
+        <w:t xml:space="preserve"> </w:t>
+      </w:r>
+      <w:r>
+        <w:t xml:space="preserve">Sie kennen einander nicht notwendigerweise und sehen gegenseitig keine Daten.</w:t>
+      </w:r>
+    </w:p>
+    <w:p>
+      <w:pPr>
+        <w:pStyle w:val="Compact"/>
+        <w:numPr>
+          <w:ilvl w:val="0"/>
+          <w:numId w:val="1024"/>
+        </w:numPr>
+      </w:pPr>
+      <w:r>
+        <w:rPr>
+          <w:b/>
+          <w:bCs/>
+        </w:rPr>
+        <w:t xml:space="preserve">C</w:t>
+      </w:r>
+      <w:r>
+        <w:t xml:space="preserve"> </w:t>
+      </w:r>
+      <w:r>
+        <w:t xml:space="preserve">ist ein</w:t>
+      </w:r>
+      <w:r>
+        <w:t xml:space="preserve"> </w:t>
+      </w:r>
+      <w:r>
+        <w:rPr>
+          <w:b/>
+          <w:bCs/>
+        </w:rPr>
+        <w:t xml:space="preserve">Benchmark-Dienstleister</w:t>
+      </w:r>
+      <w:r>
+        <w:t xml:space="preserve"> </w:t>
+      </w:r>
+      <w:r>
+        <w:t xml:space="preserve">(Benchmark Service Provider) – kein</w:t>
+      </w:r>
+      <w:r>
+        <w:t xml:space="preserve"> </w:t>
+      </w:r>
+      <w:r>
+        <w:t xml:space="preserve">Server und kein Sonderkonto, sondern ein gewöhnlicher Nutzer derselben App</w:t>
+      </w:r>
+      <w:r>
+        <w:t xml:space="preserve"> </w:t>
+      </w:r>
+      <w:r>
+        <w:t xml:space="preserve">mit eigenem Pod.</w:t>
+      </w:r>
+    </w:p>
+    <w:p>
+      <w:pPr>
+        <w:pStyle w:val="FirstParagraph"/>
+      </w:pPr>
+      <w:r>
+        <w:t xml:space="preserve">Der Ablauf hat vier Schritte:</w:t>
+      </w:r>
+    </w:p>
+    <w:p>
+      <w:pPr>
+        <w:pStyle w:val="Compact"/>
+        <w:numPr>
+          <w:ilvl w:val="0"/>
+          <w:numId w:val="1025"/>
+        </w:numPr>
+      </w:pPr>
+      <w:r>
+        <w:rPr>
+          <w:b/>
+          <w:bCs/>
+        </w:rPr>
+        <w:t xml:space="preserve">A und B teilen ihre Gebäude an C.</w:t>
+      </w:r>
+      <w:r>
+        <w:t xml:space="preserve"> </w:t>
+      </w:r>
+      <w:r>
+        <w:t xml:space="preserve">Jeder nutzt den normalen</w:t>
+      </w:r>
+      <w:r>
+        <w:t xml:space="preserve"> </w:t>
+      </w:r>
+      <w:r>
+        <w:t xml:space="preserve">Teilen-Dialog (siehe „Ein Gebäude teilen”) und gibt die Gebäude</w:t>
+      </w:r>
+      <w:r>
+        <w:t xml:space="preserve"> </w:t>
+      </w:r>
+      <w:r>
+        <w:rPr>
+          <w:b/>
+          <w:bCs/>
+        </w:rPr>
+        <w:t xml:space="preserve">einschließlich Energiedaten</w:t>
+      </w:r>
+      <w:r>
+        <w:t xml:space="preserve"> </w:t>
+      </w:r>
+      <w:r>
+        <w:t xml:space="preserve">an C’s WebID frei – wahlweise alle Jahre</w:t>
+      </w:r>
+      <w:r>
+        <w:t xml:space="preserve"> </w:t>
+      </w:r>
+      <w:r>
+        <w:t xml:space="preserve">oder gezielt ausgewählte. Sind alle drei Mitglied eines Datenraums, geht es</w:t>
+      </w:r>
+      <w:r>
+        <w:t xml:space="preserve"> </w:t>
+      </w:r>
+      <w:r>
+        <w:t xml:space="preserve">auch in einem Zug rollenbasiert: „By role” an die Rolle</w:t>
+      </w:r>
+      <w:r>
+        <w:t xml:space="preserve"> </w:t>
+      </w:r>
+      <w:r>
+        <w:rPr>
+          <w:b/>
+          <w:bCs/>
+        </w:rPr>
+        <w:t xml:space="preserve">Benchmark Service</w:t>
+      </w:r>
+      <w:r>
+        <w:rPr>
+          <w:b/>
+          <w:bCs/>
+        </w:rPr>
+        <w:t xml:space="preserve"> </w:t>
+      </w:r>
+      <w:r>
+        <w:rPr>
+          <w:b/>
+          <w:bCs/>
+        </w:rPr>
+        <w:t xml:space="preserve">Provider</w:t>
+      </w:r>
+      <w:r>
+        <w:t xml:space="preserve">.</w:t>
+      </w:r>
+    </w:p>
+    <w:p>
+      <w:pPr>
+        <w:pStyle w:val="Compact"/>
+        <w:numPr>
+          <w:ilvl w:val="0"/>
+          <w:numId w:val="1025"/>
+        </w:numPr>
+      </w:pPr>
+      <w:r>
+        <w:rPr>
+          <w:b/>
+          <w:bCs/>
+        </w:rPr>
+        <w:t xml:space="preserve">C berechnet den Benchmark.</w:t>
+      </w:r>
+      <w:r>
+        <w:t xml:space="preserve"> </w:t>
+      </w:r>
+      <w:r>
+        <w:t xml:space="preserve">C erstellt eine aggregierte Ansicht vom Typ</w:t>
+      </w:r>
+      <w:r>
+        <w:t xml:space="preserve"> </w:t>
+      </w:r>
+      <w:r>
+        <w:rPr>
+          <w:b/>
+          <w:bCs/>
+        </w:rPr>
+        <w:t xml:space="preserve">Compare shared buildings</w:t>
+      </w:r>
+      <w:r>
+        <w:t xml:space="preserve"> </w:t>
+      </w:r>
+      <w:r>
+        <w:t xml:space="preserve">(siehe „Aggregierte Ansicht erstellen und</w:t>
+      </w:r>
+      <w:r>
+        <w:t xml:space="preserve"> </w:t>
+      </w:r>
+      <w:r>
+        <w:t xml:space="preserve">teilen”). Zur Auswahl stehen dabei genau die Gebäude, die</w:t>
+      </w:r>
+      <w:r>
+        <w:t xml:space="preserve"> </w:t>
+      </w:r>
+      <w:r>
+        <w:rPr>
+          <w:b/>
+          <w:bCs/>
+        </w:rPr>
+        <w:t xml:space="preserve">mit C geteilt</w:t>
+      </w:r>
+      <w:r>
+        <w:t xml:space="preserve"> </w:t>
+      </w:r>
+      <w:r>
+        <w:t xml:space="preserve">wurden – also die Beiträge von A und B. C wählt die Kennzahlen (jährlicher</w:t>
+      </w:r>
+      <w:r>
+        <w:t xml:space="preserve"> </w:t>
+      </w:r>
+      <w:r>
+        <w:t xml:space="preserve">Strom-, Wärme-, Wasser- und Abwasserverbrauch) und die Funktion</w:t>
+      </w:r>
+      <w:r>
+        <w:t xml:space="preserve"> </w:t>
+      </w:r>
+      <w:r>
+        <w:t xml:space="preserve">„Durchschnitt”; die App berechnet das Ergebnis als Snapshot.</w:t>
+      </w:r>
+    </w:p>
+    <w:p>
+      <w:pPr>
+        <w:pStyle w:val="Compact"/>
+        <w:numPr>
+          <w:ilvl w:val="0"/>
+          <w:numId w:val="1025"/>
+        </w:numPr>
+      </w:pPr>
+      <w:r>
+        <w:rPr>
+          <w:b/>
+          <w:bCs/>
+        </w:rPr>
+        <w:t xml:space="preserve">C teilt das Ergebnis an alle Beitragenden zurück.</w:t>
+      </w:r>
+      <w:r>
+        <w:t xml:space="preserve"> </w:t>
+      </w:r>
+      <w:r>
+        <w:t xml:space="preserve">Im Teilen-Dialog der</w:t>
+      </w:r>
+      <w:r>
+        <w:t xml:space="preserve"> </w:t>
+      </w:r>
+      <w:r>
+        <w:t xml:space="preserve">Ansicht bietet die App dafür eine Ein-Klick-Hilfe an: „Add all</w:t>
+      </w:r>
+      <w:r>
+        <w:t xml:space="preserve"> </w:t>
+      </w:r>
+      <w:r>
+        <w:t xml:space="preserve">contributors” trägt automatisch alle ein, deren Gebäude in den Benchmark</w:t>
+      </w:r>
+      <w:r>
+        <w:t xml:space="preserve"> </w:t>
+      </w:r>
+      <w:r>
+        <w:t xml:space="preserve">eingeflossen sind – hier A und B.</w:t>
+      </w:r>
+    </w:p>
+    <w:p>
+      <w:pPr>
+        <w:pStyle w:val="Compact"/>
+        <w:numPr>
+          <w:ilvl w:val="0"/>
+          <w:numId w:val="1025"/>
+        </w:numPr>
+      </w:pPr>
+      <w:r>
+        <w:rPr>
+          <w:b/>
+          <w:bCs/>
+        </w:rPr>
+        <w:t xml:space="preserve">A und B sehen den Benchmark neben den eigenen Zahlen.</w:t>
+      </w:r>
+      <w:r>
+        <w:t xml:space="preserve"> </w:t>
+      </w:r>
+      <w:r>
+        <w:t xml:space="preserve">Die</w:t>
+      </w:r>
+      <w:r>
+        <w:t xml:space="preserve"> </w:t>
+      </w:r>
+      <w:r>
+        <w:t xml:space="preserve">zurückerhaltene Ansicht erscheint im Tab</w:t>
+      </w:r>
+      <w:r>
+        <w:t xml:space="preserve"> </w:t>
+      </w:r>
+      <w:r>
+        <w:rPr>
+          <w:b/>
+          <w:bCs/>
+        </w:rPr>
+        <w:t xml:space="preserve">Share</w:t>
+      </w:r>
+      <w:r>
+        <w:t xml:space="preserve"> </w:t>
+      </w:r>
+      <w:r>
+        <w:t xml:space="preserve">unter „Views shared with</w:t>
+      </w:r>
+      <w:r>
+        <w:t xml:space="preserve"> </w:t>
+      </w:r>
+      <w:r>
+        <w:t xml:space="preserve">you”. Vor allem aber füllt sich auf der Energie-Detailseite der eigenen</w:t>
+      </w:r>
+      <w:r>
+        <w:t xml:space="preserve"> </w:t>
+      </w:r>
+      <w:r>
+        <w:t xml:space="preserve">Gebäude die Spalte</w:t>
+      </w:r>
+      <w:r>
+        <w:t xml:space="preserve"> </w:t>
+      </w:r>
+      <w:r>
+        <w:rPr>
+          <w:b/>
+          <w:bCs/>
+        </w:rPr>
+        <w:t xml:space="preserve">Benchmark</w:t>
+      </w:r>
+      <w:r>
+        <w:t xml:space="preserve">: Der eigene Verbrauch wird nun gegen den</w:t>
+      </w:r>
+      <w:r>
+        <w:t xml:space="preserve"> </w:t>
+      </w:r>
+      <w:r>
+        <w:t xml:space="preserve">externen Branchenwert eingefärbt statt nur gegen den eigenen</w:t>
+      </w:r>
+      <w:r>
+        <w:t xml:space="preserve"> </w:t>
+      </w:r>
+      <w:r>
+        <w:t xml:space="preserve">Portfolio-Durchschnitt, und ein Hinweis nennt den Dienstleister, der den</w:t>
+      </w:r>
+      <w:r>
+        <w:t xml:space="preserve"> </w:t>
+      </w:r>
+      <w:r>
+        <w:t xml:space="preserve">Benchmark berechnet hat. Genau diesen Zustand zeigt die Abbildung der</w:t>
+      </w:r>
+      <w:r>
+        <w:t xml:space="preserve"> </w:t>
+      </w:r>
+      <w:r>
+        <w:t xml:space="preserve">Energie-Detailseite im Abschnitt „Daten ansehen”: Die Benchmark-Spalte dort</w:t>
+      </w:r>
+      <w:r>
+        <w:t xml:space="preserve"> </w:t>
+      </w:r>
+      <w:r>
+        <w:t xml:space="preserve">trägt die von einem Dienstleister zurückgeteilten Branchenwerte.</w:t>
+      </w:r>
+    </w:p>
+    <w:p>
+      <w:pPr>
+        <w:pStyle w:val="CaptionedFigure"/>
+      </w:pPr>
+      <w:r>
+        <w:drawing>
+          <wp:inline>
+            <wp:extent cx="5334000" cy="3075192"/>
+            <wp:effectExtent b="0" l="0" r="0" t="0"/>
+            <wp:docPr descr="Der Benchmark-Roundtrip: A und B teilen Gebäude an den Dienstleister C, C berechnet den Durchschnitt und teilt nur den Snapshot zurück" title="" id="122" name="Picture"/>
+            <a:graphic>
+              <a:graphicData uri="http://schemas.openxmlformats.org/drawingml/2006/picture">
+                <pic:pic>
+                  <pic:nvPicPr>
+                    <pic:cNvPr descr="figures/szenario-benchmark.png" id="123" name="Picture"/>
+                    <pic:cNvPicPr>
+                      <a:picLocks noChangeArrowheads="1" noChangeAspect="1"/>
+                    </pic:cNvPicPr>
+                  </pic:nvPicPr>
+                  <pic:blipFill>
+                    <a:blip r:embed="rId121"/>
+                    <a:stretch>
+                      <a:fillRect/>
+                    </a:stretch>
+                  </pic:blipFill>
+                  <pic:spPr bwMode="auto">
+                    <a:xfrm>
+                      <a:off x="0" y="0"/>
+                      <a:ext cx="5334000" cy="3075192"/>
+                    </a:xfrm>
+                    <a:prstGeom prst="rect">
+                      <a:avLst/>
+                    </a:prstGeom>
+                    <a:noFill/>
+                    <a:ln w="9525">
+                      <a:noFill/>
+                      <a:headEnd/>
+                      <a:tailEnd/>
+                    </a:ln>
+                  </pic:spPr>
+                </pic:pic>
+              </a:graphicData>
+            </a:graphic>
+          </wp:inline>
+        </w:drawing>
+      </w:r>
+    </w:p>
+    <w:p>
+      <w:pPr>
+        <w:pStyle w:val="ImageCaption"/>
+      </w:pPr>
+      <w:r>
+        <w:t xml:space="preserve">Der Benchmark-Roundtrip: A und B teilen Gebäude an den Dienstleister C, C berechnet den Durchschnitt und teilt nur den Snapshot zurück</w:t>
+      </w:r>
+    </w:p>
+    <w:p>
+      <w:pPr>
+        <w:pStyle w:val="CaptionedFigure"/>
+      </w:pPr>
+      <w:r>
+        <w:drawing>
+          <wp:inline>
+            <wp:extent cx="5334000" cy="4000499"/>
+            <wp:effectExtent b="0" l="0" r="0" t="0"/>
+            <wp:docPr descr="Die Sicht des Benchmark-Dienstleisters beim Zurückteilen: „Add all contributors” trägt alle Beitragenden mit einem Klick als Empfänger ein" title="" id="125" name="Picture"/>
+            <a:graphic>
+              <a:graphicData uri="http://schemas.openxmlformats.org/drawingml/2006/picture">
+                <pic:pic>
+                  <pic:nvPicPr>
+                    <pic:cNvPr descr="figures/benchmark-share-back.png" id="126" name="Picture"/>
+                    <pic:cNvPicPr>
+                      <a:picLocks noChangeArrowheads="1" noChangeAspect="1"/>
+                    </pic:cNvPicPr>
+                  </pic:nvPicPr>
+                  <pic:blipFill>
+                    <a:blip r:embed="rId124"/>
+                    <a:stretch>
+                      <a:fillRect/>
+                    </a:stretch>
+                  </pic:blipFill>
+                  <pic:spPr bwMode="auto">
+                    <a:xfrm>
+                      <a:off x="0" y="0"/>
+                      <a:ext cx="5334000" cy="4000499"/>
+                    </a:xfrm>
+                    <a:prstGeom prst="rect">
+                      <a:avLst/>
+                    </a:prstGeom>
+                    <a:noFill/>
+                    <a:ln w="9525">
+                      <a:noFill/>
+                      <a:headEnd/>
+                      <a:tailEnd/>
+                    </a:ln>
+                  </pic:spPr>
+                </pic:pic>
+              </a:graphicData>
+            </a:graphic>
+          </wp:inline>
+        </w:drawing>
+      </w:r>
+    </w:p>
+    <w:p>
+      <w:pPr>
+        <w:pStyle w:val="ImageCaption"/>
+      </w:pPr>
+      <w:r>
+        <w:t xml:space="preserve">Die Sicht des Benchmark-Dienstleisters beim Zurückteilen: „Add all contributors” trägt alle Beitragenden mit einem Klick als Empfänger ein</w:t>
+      </w:r>
+    </w:p>
+    <w:p>
+      <w:pPr>
+        <w:pStyle w:val="BodyText"/>
+      </w:pPr>
+      <w:r>
+        <w:t xml:space="preserve">Entscheidend ist, was dabei</w:t>
+      </w:r>
+      <w:r>
+        <w:t xml:space="preserve"> </w:t>
+      </w:r>
+      <w:r>
+        <w:rPr>
+          <w:b/>
+          <w:bCs/>
+        </w:rPr>
+        <w:t xml:space="preserve">nicht</w:t>
+      </w:r>
+      <w:r>
+        <w:t xml:space="preserve"> </w:t>
+      </w:r>
+      <w:r>
+        <w:t xml:space="preserve">sichtbar wird: A und B sehen zu keinem</w:t>
+      </w:r>
+      <w:r>
+        <w:t xml:space="preserve"> </w:t>
+      </w:r>
+      <w:r>
+        <w:t xml:space="preserve">Zeitpunkt die Gebäude des jeweils anderen. Der zurückgeteilte Snapshot enthält</w:t>
+      </w:r>
+      <w:r>
+        <w:t xml:space="preserve"> </w:t>
+      </w:r>
+      <w:r>
+        <w:t xml:space="preserve">nur die berechneten Durchschnittswerte und die Anzahl der eingeflossenen</w:t>
+      </w:r>
+      <w:r>
+        <w:t xml:space="preserve"> </w:t>
+      </w:r>
+      <w:r>
+        <w:t xml:space="preserve">Gebäude – nicht, welche Gebäude das waren. Jeder Beitragende kann seine</w:t>
+      </w:r>
+      <w:r>
+        <w:t xml:space="preserve"> </w:t>
+      </w:r>
+      <w:r>
+        <w:t xml:space="preserve">Freigabe an C zudem jederzeit widerrufen und steigt damit aus künftigen</w:t>
+      </w:r>
+      <w:r>
+        <w:t xml:space="preserve"> </w:t>
+      </w:r>
+      <w:r>
+        <w:t xml:space="preserve">Benchmark-Berechnungen aus.</w:t>
+      </w:r>
+    </w:p>
+    <w:p>
+      <w:pPr>
+        <w:pStyle w:val="BlockText"/>
+      </w:pPr>
+      <w:r>
+        <w:rPr>
+          <w:b/>
+          <w:bCs/>
+        </w:rPr>
+        <w:t xml:space="preserve">Technische Details (für Administratoren)</w:t>
+      </w:r>
+    </w:p>
+    <w:p>
+      <w:pPr>
+        <w:pStyle w:val="BlockText"/>
+      </w:pPr>
+      <w:r>
+        <w:t xml:space="preserve">Die View-Definition – sie enthält die IRIs der beitragenden Gebäude – bleibt</w:t>
+      </w:r>
+      <w:r>
+        <w:t xml:space="preserve"> </w:t>
+      </w:r>
+      <w:r>
+        <w:t xml:space="preserve">auf C’s Pod und wird nie geteilt; nur der berechnete Snapshot wandert zu den</w:t>
+      </w:r>
+      <w:r>
+        <w:t xml:space="preserve"> </w:t>
+      </w:r>
+      <w:r>
+        <w:t xml:space="preserve">Empfängern. Der Snapshot ist dabei als Benchmark-Ergebnis typisiert und</w:t>
+      </w:r>
+      <w:r>
+        <w:t xml:space="preserve"> </w:t>
+      </w:r>
+      <w:r>
+        <w:t xml:space="preserve">vermerkt den berechnenden Agenten und den abgedeckten Zeitraum, sodass die</w:t>
+      </w:r>
+      <w:r>
+        <w:t xml:space="preserve"> </w:t>
+      </w:r>
+      <w:r>
+        <w:t xml:space="preserve">Energie-Ansicht der Empfänger ihn von gewöhnlichen geteilten Ansichten</w:t>
+      </w:r>
+      <w:r>
+        <w:t xml:space="preserve"> </w:t>
+      </w:r>
+      <w:r>
+        <w:t xml:space="preserve">unterscheiden und als Vergleichswert bevorzugen kann (Reihenfolge: externer</w:t>
+      </w:r>
+      <w:r>
+        <w:t xml:space="preserve"> </w:t>
+      </w:r>
+      <w:r>
+        <w:t xml:space="preserve">Benchmark vor Betreiber-Durchschnitt vor Portfolio-Durchschnitt).</w:t>
+      </w:r>
+    </w:p>
+    <w:bookmarkEnd w:id="127"/>
+    <w:bookmarkEnd w:id="128"/>
+    <w:bookmarkEnd w:id="129"/>
+    <w:bookmarkStart w:id="130" w:name="was-steckt-hinter-granergize"/>
     <w:p>
       <w:pPr>
         <w:pStyle w:val="Heading1"/>
@@ -9035,8 +10446,8 @@
         <w:t xml:space="preserve">in der Hand eines einzelnen Anbieters.</w:t>
       </w:r>
     </w:p>
-    <w:bookmarkEnd w:id="118"/>
-    <w:bookmarkStart w:id="120" w:name="literaturverzeichnis"/>
+    <w:bookmarkEnd w:id="130"/>
+    <w:bookmarkStart w:id="132" w:name="literaturverzeichnis"/>
     <w:p>
       <w:pPr>
         <w:pStyle w:val="Heading1"/>
@@ -9167,7 +10578,7 @@
       <w:r>
         <w:t xml:space="preserve"> </w:t>
       </w:r>
-      <w:hyperlink r:id="rId119">
+      <w:hyperlink r:id="rId131">
         <w:r>
           <w:rPr>
             <w:rStyle w:val="Hyperlink"/>
@@ -9176,7 +10587,7 @@
         </w:r>
       </w:hyperlink>
     </w:p>
-    <w:bookmarkEnd w:id="120"/>
+    <w:bookmarkEnd w:id="132"/>
     <w:sectPr/>
   </w:body>
 </w:document>
@@ -9437,6 +10848,91 @@
     <w:lvl w:ilvl="8">
       <w:start w:val="1"/>
       <w:numFmt w:val="decimal"/>
+      <w:lvlText w:val="%9."/>
+      <w:lvlJc w:val="left"/>
+      <w:pPr>
+        <w:ind w:left="6480" w:hanging="480"/>
+      </w:pPr>
+    </w:lvl>
+  </w:abstractNum>
+  <w:abstractNum w:abstractNumId="997126">
+    <w:nsid w:val="0A997126"/>
+    <w:multiLevelType w:val="multilevel"/>
+    <w:lvl w:ilvl="0">
+      <w:start w:val="26"/>
+      <w:numFmt w:val="lowerLetter"/>
+      <w:lvlText w:val="%1."/>
+      <w:lvlJc w:val="left"/>
+      <w:pPr>
+        <w:ind w:left="720" w:hanging="480"/>
+      </w:pPr>
+    </w:lvl>
+    <w:lvl w:ilvl="1">
+      <w:start w:val="26"/>
+      <w:numFmt w:val="lowerLetter"/>
+      <w:lvlText w:val="%2."/>
+      <w:lvlJc w:val="left"/>
+      <w:pPr>
+        <w:ind w:left="1440" w:hanging="480"/>
+      </w:pPr>
+    </w:lvl>
+    <w:lvl w:ilvl="2">
+      <w:start w:val="26"/>
+      <w:numFmt w:val="lowerLetter"/>
+      <w:lvlText w:val="%3."/>
+      <w:lvlJc w:val="left"/>
+      <w:pPr>
+        <w:ind w:left="2160" w:hanging="480"/>
+      </w:pPr>
+    </w:lvl>
+    <w:lvl w:ilvl="3">
+      <w:start w:val="26"/>
+      <w:numFmt w:val="lowerLetter"/>
+      <w:lvlText w:val="%4."/>
+      <w:lvlJc w:val="left"/>
+      <w:pPr>
+        <w:ind w:left="2880" w:hanging="480"/>
+      </w:pPr>
+    </w:lvl>
+    <w:lvl w:ilvl="4">
+      <w:start w:val="26"/>
+      <w:numFmt w:val="lowerLetter"/>
+      <w:lvlText w:val="%5."/>
+      <w:lvlJc w:val="left"/>
+      <w:pPr>
+        <w:ind w:left="3600" w:hanging="480"/>
+      </w:pPr>
+    </w:lvl>
+    <w:lvl w:ilvl="5">
+      <w:start w:val="26"/>
+      <w:numFmt w:val="lowerLetter"/>
+      <w:lvlText w:val="%6."/>
+      <w:lvlJc w:val="left"/>
+      <w:pPr>
+        <w:ind w:left="4320" w:hanging="480"/>
+      </w:pPr>
+    </w:lvl>
+    <w:lvl w:ilvl="6">
+      <w:start w:val="26"/>
+      <w:numFmt w:val="lowerLetter"/>
+      <w:lvlText w:val="%7."/>
+      <w:lvlJc w:val="left"/>
+      <w:pPr>
+        <w:ind w:left="5040" w:hanging="480"/>
+      </w:pPr>
+    </w:lvl>
+    <w:lvl w:ilvl="7">
+      <w:start w:val="26"/>
+      <w:numFmt w:val="lowerLetter"/>
+      <w:lvlText w:val="%8."/>
+      <w:lvlJc w:val="left"/>
+      <w:pPr>
+        <w:ind w:left="5760" w:hanging="480"/>
+      </w:pPr>
+    </w:lvl>
+    <w:lvl w:ilvl="8">
+      <w:start w:val="26"/>
+      <w:numFmt w:val="lowerLetter"/>
       <w:lvlText w:val="%9."/>
       <w:lvlJc w:val="left"/>
       <w:pPr>
@@ -9562,7 +11058,34 @@
     <w:abstractNumId w:val="991"/>
   </w:num>
   <w:num w:numId="1012">
-    <w:abstractNumId w:val="991"/>
+    <w:abstractNumId w:val="997126"/>
+    <w:lvlOverride w:ilvl="0">
+      <w:startOverride w:val="26"/>
+    </w:lvlOverride>
+    <w:lvlOverride w:ilvl="1">
+      <w:startOverride w:val="26"/>
+    </w:lvlOverride>
+    <w:lvlOverride w:ilvl="2">
+      <w:startOverride w:val="26"/>
+    </w:lvlOverride>
+    <w:lvlOverride w:ilvl="3">
+      <w:startOverride w:val="26"/>
+    </w:lvlOverride>
+    <w:lvlOverride w:ilvl="4">
+      <w:startOverride w:val="26"/>
+    </w:lvlOverride>
+    <w:lvlOverride w:ilvl="5">
+      <w:startOverride w:val="26"/>
+    </w:lvlOverride>
+    <w:lvlOverride w:ilvl="6">
+      <w:startOverride w:val="26"/>
+    </w:lvlOverride>
+    <w:lvlOverride w:ilvl="7">
+      <w:startOverride w:val="26"/>
+    </w:lvlOverride>
+    <w:lvlOverride w:ilvl="8">
+      <w:startOverride w:val="26"/>
+    </w:lvlOverride>
   </w:num>
   <w:num w:numId="1013">
     <w:abstractNumId w:val="991"/>
@@ -9580,34 +11103,7 @@
     <w:abstractNumId w:val="991"/>
   </w:num>
   <w:num w:numId="1018">
-    <w:abstractNumId w:val="99411"/>
-    <w:lvlOverride w:ilvl="0">
-      <w:startOverride w:val="1"/>
-    </w:lvlOverride>
-    <w:lvlOverride w:ilvl="1">
-      <w:startOverride w:val="1"/>
-    </w:lvlOverride>
-    <w:lvlOverride w:ilvl="2">
-      <w:startOverride w:val="1"/>
-    </w:lvlOverride>
-    <w:lvlOverride w:ilvl="3">
-      <w:startOverride w:val="1"/>
-    </w:lvlOverride>
-    <w:lvlOverride w:ilvl="4">
-      <w:startOverride w:val="1"/>
-    </w:lvlOverride>
-    <w:lvlOverride w:ilvl="5">
-      <w:startOverride w:val="1"/>
-    </w:lvlOverride>
-    <w:lvlOverride w:ilvl="6">
-      <w:startOverride w:val="1"/>
-    </w:lvlOverride>
-    <w:lvlOverride w:ilvl="7">
-      <w:startOverride w:val="1"/>
-    </w:lvlOverride>
-    <w:lvlOverride w:ilvl="8">
-      <w:startOverride w:val="1"/>
-    </w:lvlOverride>
+    <w:abstractNumId w:val="991"/>
   </w:num>
   <w:num w:numId="1019">
     <w:abstractNumId w:val="99411"/>
@@ -9640,7 +11136,130 @@
     </w:lvlOverride>
   </w:num>
   <w:num w:numId="1020">
+    <w:abstractNumId w:val="99411"/>
+    <w:lvlOverride w:ilvl="0">
+      <w:startOverride w:val="1"/>
+    </w:lvlOverride>
+    <w:lvlOverride w:ilvl="1">
+      <w:startOverride w:val="1"/>
+    </w:lvlOverride>
+    <w:lvlOverride w:ilvl="2">
+      <w:startOverride w:val="1"/>
+    </w:lvlOverride>
+    <w:lvlOverride w:ilvl="3">
+      <w:startOverride w:val="1"/>
+    </w:lvlOverride>
+    <w:lvlOverride w:ilvl="4">
+      <w:startOverride w:val="1"/>
+    </w:lvlOverride>
+    <w:lvlOverride w:ilvl="5">
+      <w:startOverride w:val="1"/>
+    </w:lvlOverride>
+    <w:lvlOverride w:ilvl="6">
+      <w:startOverride w:val="1"/>
+    </w:lvlOverride>
+    <w:lvlOverride w:ilvl="7">
+      <w:startOverride w:val="1"/>
+    </w:lvlOverride>
+    <w:lvlOverride w:ilvl="8">
+      <w:startOverride w:val="1"/>
+    </w:lvlOverride>
+  </w:num>
+  <w:num w:numId="1021">
     <w:abstractNumId w:val="991"/>
+  </w:num>
+  <w:num w:numId="1022">
+    <w:abstractNumId w:val="99411"/>
+    <w:lvlOverride w:ilvl="0">
+      <w:startOverride w:val="1"/>
+    </w:lvlOverride>
+    <w:lvlOverride w:ilvl="1">
+      <w:startOverride w:val="1"/>
+    </w:lvlOverride>
+    <w:lvlOverride w:ilvl="2">
+      <w:startOverride w:val="1"/>
+    </w:lvlOverride>
+    <w:lvlOverride w:ilvl="3">
+      <w:startOverride w:val="1"/>
+    </w:lvlOverride>
+    <w:lvlOverride w:ilvl="4">
+      <w:startOverride w:val="1"/>
+    </w:lvlOverride>
+    <w:lvlOverride w:ilvl="5">
+      <w:startOverride w:val="1"/>
+    </w:lvlOverride>
+    <w:lvlOverride w:ilvl="6">
+      <w:startOverride w:val="1"/>
+    </w:lvlOverride>
+    <w:lvlOverride w:ilvl="7">
+      <w:startOverride w:val="1"/>
+    </w:lvlOverride>
+    <w:lvlOverride w:ilvl="8">
+      <w:startOverride w:val="1"/>
+    </w:lvlOverride>
+  </w:num>
+  <w:num w:numId="1023">
+    <w:abstractNumId w:val="99411"/>
+    <w:lvlOverride w:ilvl="0">
+      <w:startOverride w:val="1"/>
+    </w:lvlOverride>
+    <w:lvlOverride w:ilvl="1">
+      <w:startOverride w:val="1"/>
+    </w:lvlOverride>
+    <w:lvlOverride w:ilvl="2">
+      <w:startOverride w:val="1"/>
+    </w:lvlOverride>
+    <w:lvlOverride w:ilvl="3">
+      <w:startOverride w:val="1"/>
+    </w:lvlOverride>
+    <w:lvlOverride w:ilvl="4">
+      <w:startOverride w:val="1"/>
+    </w:lvlOverride>
+    <w:lvlOverride w:ilvl="5">
+      <w:startOverride w:val="1"/>
+    </w:lvlOverride>
+    <w:lvlOverride w:ilvl="6">
+      <w:startOverride w:val="1"/>
+    </w:lvlOverride>
+    <w:lvlOverride w:ilvl="7">
+      <w:startOverride w:val="1"/>
+    </w:lvlOverride>
+    <w:lvlOverride w:ilvl="8">
+      <w:startOverride w:val="1"/>
+    </w:lvlOverride>
+  </w:num>
+  <w:num w:numId="1024">
+    <w:abstractNumId w:val="991"/>
+  </w:num>
+  <w:num w:numId="1025">
+    <w:abstractNumId w:val="99411"/>
+    <w:lvlOverride w:ilvl="0">
+      <w:startOverride w:val="1"/>
+    </w:lvlOverride>
+    <w:lvlOverride w:ilvl="1">
+      <w:startOverride w:val="1"/>
+    </w:lvlOverride>
+    <w:lvlOverride w:ilvl="2">
+      <w:startOverride w:val="1"/>
+    </w:lvlOverride>
+    <w:lvlOverride w:ilvl="3">
+      <w:startOverride w:val="1"/>
+    </w:lvlOverride>
+    <w:lvlOverride w:ilvl="4">
+      <w:startOverride w:val="1"/>
+    </w:lvlOverride>
+    <w:lvlOverride w:ilvl="5">
+      <w:startOverride w:val="1"/>
+    </w:lvlOverride>
+    <w:lvlOverride w:ilvl="6">
+      <w:startOverride w:val="1"/>
+    </w:lvlOverride>
+    <w:lvlOverride w:ilvl="7">
+      <w:startOverride w:val="1"/>
+    </w:lvlOverride>
+    <w:lvlOverride w:ilvl="8">
+      <w:startOverride w:val="1"/>
+    </w:lvlOverride>
   </w:num>
 </w:numbering>
 </file>

</xml_diff>